<commit_message>
many updates - scripts updated and beginning results section
</commit_message>
<xml_diff>
--- a/docs/manuscript/main.docx
+++ b/docs/manuscript/main.docx
@@ -388,6 +388,9 @@
       <w:r>
         <w:t xml:space="preserve">Together, these findings suggest that cognate effects emerge from dynamic interactions among multiple sources of influence, rather than reflecting a stable or uniform processing advantage.</w:t>
       </w:r>
+      <w:r>
+        <w:t xml:space="preserve"> </w:t>
+      </w:r>
     </w:p>
     <w:bookmarkEnd w:id="22"/>
     <w:bookmarkStart w:id="23" w:name="X1b13b08d22823258dbc3e067a58ea940446a5d8"/>
@@ -404,7 +407,10 @@
         <w:pStyle w:val="FirstParagraph"/>
       </w:pPr>
       <w:r>
-        <w:t xml:space="preserve">While cognate processing is well documented in bilingual populations, cognate effects in L3 contexts remain less clear.</w:t>
+        <w:t xml:space="preserve">While cognate processing is well documented in bilingual populations, cognate effects in third language (L3) contexts remain less clear.</w:t>
+      </w:r>
+      <w:r>
+        <w:t xml:space="preserve"> </w:t>
       </w:r>
       <w:r>
         <w:t xml:space="preserve"> </w:t>
@@ -440,6 +446,9 @@
         <w:t xml:space="preserve"> </w:t>
       </w:r>
       <w:r>
+        <w:t xml:space="preserve"> </w:t>
+      </w:r>
+      <w:r>
         <w:t xml:space="preserve">While empirical evidence supports both hypotheses,</w:t>
       </w:r>
       <w:r>
@@ -456,6 +465,12 @@
       </w:r>
       <w:r>
         <w:t xml:space="preserve">Though, most of the evidence addresses L3 morphosyntax, and research on L3 lexical acquisition remains scarce.</w:t>
+      </w:r>
+      <w:r>
+        <w:t xml:space="preserve"> </w:t>
+      </w:r>
+      <w:r>
+        <w:t xml:space="preserve"> </w:t>
       </w:r>
     </w:p>
     <w:p>
@@ -487,7 +502,7 @@
         <w:t xml:space="preserve">In the Scaffolding model, L3 lexical acquisition is driven by the ability to create a direct association between a newly encountered word and an existing word in the L1 or L2 lexicon.</w:t>
       </w:r>
       <w:r>
-        <w:t xml:space="preserve"> </w:t>
+        <w:br/>
       </w:r>
       <w:r>
         <w:t xml:space="preserve">Novel words with greater form overlap with an existing word are more likely to have strong lexical associations.</w:t>
@@ -559,7 +574,7 @@
         <w:t xml:space="preserve"> </w:t>
       </w:r>
       <w:r>
-        <w:t xml:space="preserve">Overall, both models highlight the role of cross-linguistic similarity, but they differ on which source exorts the influence on L3.</w:t>
+        <w:t xml:space="preserve">Overall, both models highlight the role of cross-linguistic similarity, but they differ on which source exerts the influence on L3.</w:t>
       </w:r>
     </w:p>
     <w:p>
@@ -933,6 +948,9 @@
         <w:t xml:space="preserve"> </w:t>
       </w:r>
       <w:r>
+        <w:t xml:space="preserve"> </w:t>
+      </w:r>
+      <w:r>
         <w:t xml:space="preserve">Notably, it remains to be explored how language proficiency modulates the strength and direction of cross-linguistic influence and the presence of cognate effects in L3 lexical processing.</w:t>
       </w:r>
       <w:r>
@@ -961,6 +979,9 @@
       </w:r>
       <w:r>
         <w:t xml:space="preserve">, though it is very complex to establish such a threshold in multilingual individuals.</w:t>
+      </w:r>
+      <w:r>
+        <w:t xml:space="preserve"> </w:t>
       </w:r>
       <w:r>
         <w:t xml:space="preserve"> </w:t>
@@ -1220,7 +1241,10 @@
         <w:t xml:space="preserve"> </w:t>
       </w:r>
       <w:r>
-        <w:t xml:space="preserve">The trilinguals were recruited from a Spanish course in a public university in Frankfurt, Germany.</w:t>
+        <w:t xml:space="preserve">The trilinguals were recruited from Hispanic Linguistics courses in a public university in Frankfurt, Germany.</w:t>
+      </w:r>
+      <w:r>
+        <w:t xml:space="preserve"> </w:t>
       </w:r>
       <w:r>
         <w:t xml:space="preserve"> </w:t>
@@ -3809,10 +3833,48 @@
     </w:p>
     <w:p>
       <w:pPr>
+        <w:pStyle w:val="SourceCode"/>
+      </w:pPr>
+      <w:r>
+        <w:rPr>
+          <w:rStyle w:val="NormalTok"/>
+        </w:rPr>
+        <w:t xml:space="preserve">knitr</w:t>
+      </w:r>
+      <w:r>
+        <w:rPr>
+          <w:rStyle w:val="SpecialCharTok"/>
+        </w:rPr>
+        <w:t xml:space="preserve">::</w:t>
+      </w:r>
+      <w:r>
+        <w:rPr>
+          <w:rStyle w:val="FunctionTok"/>
+        </w:rPr>
+        <w:t xml:space="preserve">include_graphics</w:t>
+      </w:r>
+      <w:r>
+        <w:rPr>
+          <w:rStyle w:val="NormalTok"/>
+        </w:rPr>
+        <w:t xml:space="preserve">()</w:t>
+      </w:r>
+    </w:p>
+    <w:p>
+      <w:pPr>
         <w:pStyle w:val="FirstParagraph"/>
       </w:pPr>
       <w:r>
-        <w:t xml:space="preserve">Report results (RT and accuracy? Was the RT analysis done only on correct responses? Accuracy might give us further info)</w:t>
+        <w:t xml:space="preserve">Figure</w:t>
+      </w:r>
+      <w:r>
+        <w:t xml:space="preserve"> </w:t>
+      </w:r>
+      <w:r>
+        <w:t xml:space="preserve">??</w:t>
+      </w:r>
+      <w:r>
+        <w:t xml:space="preserve">.</w:t>
       </w:r>
     </w:p>
     <w:bookmarkEnd w:id="33"/>

</xml_diff>

<commit_message>
finished with results! :)
Introduction, conclusion, abstract and proof reading are left
</commit_message>
<xml_diff>
--- a/docs/manuscript/main.docx
+++ b/docs/manuscript/main.docx
@@ -2252,7 +2252,7 @@
         </w:rPr>
         <w:lastRenderedPageBreak/>
         <w:drawing>
-          <wp:inline distT="0" distB="0" distL="0" distR="0" wp14:anchorId="13848592" wp14:editId="13848593">
+          <wp:inline distT="0" distB="0" distL="0" distR="0" wp14:anchorId="515AF71A" wp14:editId="515AF71B">
             <wp:extent cx="4579632" cy="3663706"/>
             <wp:effectExtent l="0" t="0" r="0" b="0"/>
             <wp:docPr id="30" name="Picture" descr="Figure 1: Histogram of the adapted LexTALE scores"/>
@@ -2423,7 +2423,7 @@
           <w:noProof/>
         </w:rPr>
         <w:drawing>
-          <wp:inline distT="0" distB="0" distL="0" distR="0" wp14:anchorId="13848594" wp14:editId="13848595">
+          <wp:inline distT="0" distB="0" distL="0" distR="0" wp14:anchorId="515AF71C" wp14:editId="515AF71D">
             <wp:extent cx="4579632" cy="3663706"/>
             <wp:effectExtent l="0" t="0" r="0" b="0"/>
             <wp:docPr id="41" name="Picture" descr="Figure 2: Percentage of correct responses by word type"/>
@@ -2480,7 +2480,7 @@
         <w:pStyle w:val="BodyText"/>
       </w:pPr>
       <w:r>
-        <w:t>Figure 2 shows the overall accuracy within the entire data set (6510 trials) excluding pseudowords (in which 0.80% of trials were correct). Overall, three-way cognates were the most accurate (0.89%), followed by two-way cognates (0.82%), while non-cognates were the least accurate (0.64%).</w:t>
+        <w:t>Figure 2 shows the overall accuracy within the entire data set (6510 trials) excluding pseudowords (in which 79.85% of trials were correct). Overall, three-way cognates were the most accurate (88.81%), followed by two-way cognates (81.69%), while non-cognates were the least accurate (63.57%).</w:t>
       </w:r>
     </w:p>
     <w:p>
@@ -2488,7 +2488,7 @@
         <w:pStyle w:val="BodyText"/>
       </w:pPr>
       <w:r>
-        <w:t xml:space="preserve">Figure 3 shows histograms of individuals’ percentage of correct trials in each word-type. Individual accuracy in non-cognates ranged from 27.27 % of trials correct to 97.73 (median 63.64%) Like the data set as a whole, the median of individual percentages correct for the three-way cognates was the highest 91.67% (range 58.33% - 100.00), followed by two-way cognates (median percentage correct = 81.82%; range = 50.00% - 100.00). Taken together, these descriptive results suggest that, while most participants benefit from cognates in accuracy, a minority also experience steep drops in accuracy. Indeed, two participants showed the opposite </w:t>
+        <w:t xml:space="preserve">Figure 3 shows histograms of individuals’ percentage of correct trials in each word-type. Individual accuracy in non-cognates ranged from 27.27 % of trials correct to 97.73% (median 63.64%). Like the data set as a whole, the median of individual percentages correct for the three-way cognates was the highest: 91.67% (range 58.33% - 100.00%), followed by two-way cognates (median percentage correct = 81.82%; range = 50.00% - 100.00). Taken together, these descriptive results suggest that, while most participants benefit from cognates in accuracy, a minority also experience steep drops in accuracy. Indeed, two participants showed the opposite </w:t>
       </w:r>
       <w:r>
         <w:lastRenderedPageBreak/>
@@ -2504,7 +2504,7 @@
           <w:noProof/>
         </w:rPr>
         <w:drawing>
-          <wp:inline distT="0" distB="0" distL="0" distR="0" wp14:anchorId="13848596" wp14:editId="13848597">
+          <wp:inline distT="0" distB="0" distL="0" distR="0" wp14:anchorId="515AF71E" wp14:editId="515AF71F">
             <wp:extent cx="4579632" cy="3663706"/>
             <wp:effectExtent l="0" t="0" r="0" b="0"/>
             <wp:docPr id="45" name="Picture" descr="Figure 3: Histograms of individual percentages corrects by word type"/>
@@ -4871,11 +4871,11 @@
         <w:pStyle w:val="BodyText"/>
       </w:pPr>
       <w:r>
-        <w:t xml:space="preserve">Overall, there was strong evidence for a cognate effect in accuracy, and somewhat weaker evidence for a cumulative effect in accuracy. Figure 4 visualizes the posterior distribution for the accuracy model and Table 2 includes specific estimates of each model term. In this model, the intercept was 2.34 and represents the log-odds of an accurate response in the reference condition </w:t>
+        <w:t xml:space="preserve">Overall, there was strong evidence for a general cognate effect in accuracy, and somewhat weaker evidence for a cumulative effect. Figure 4 visualizes the posterior distribution for the accuracy model and Table 2 includes specific estimates of each model term. In this model, the intercept was 2.34 and represents the log-odds of an accurate response in the reference condition </w:t>
       </w:r>
       <w:r>
         <w:lastRenderedPageBreak/>
-        <w:t>(two-way cognates) when the adapted LexTALE scores (proficiency_z) and lexical frequency (frequency_z) are average. In practice, this corresponds to a participant with average proficiency would be accurate about 91.2% of the time for words of average lexical frequency. The effect for non-cognates was -1.46[-2.12, -0.84]. 1, which corresponds to a lower predicted probability of a correct response (70.7%). The probability of direction was 1.00, signaling that virtually the entire posterior distribution is below zero, providing extremely strong evidence for a negative effect. Additionally, 0% of the posterior distribution fell within the ROPE, suggesting that none of the credible parameter values were practically equivalent to zero. For three-way cognates, the median effect was 0.71 [0, 1.39], indicating that the most credible values of the effect were positive. The effect was associated with a pd of 0.98, indicating that approximately 98% of the posterior distribution supported a positive effect. Additionally, only 4% of the posterior distribution fell within the ROPE, suggesting that most credible parameter values were not practically equivalent to zero. Taken together, these results provide evidence that three-way cognates were identified more accurately than two-way cognates, although the evidence was somewhat weaker than that observed for the non-cognate effect.</w:t>
+        <w:t>(two-way cognates) when the adapted LexTALE scores (proficiency_z) and lexical frequency (frequency_z) are average. In practice, this corresponds to a participant with average proficiency would be accurate 91.2% of the time for words of average lexical frequency. The effect for non-cognates was -1.46, 95% HDI = [-2.12, -0.84], pd = 1, which corresponds to a lower predicted probability of a correct response (70.7%). The probability of direction was 1.00, signaling that virtually the entire posterior distribution is below zero, providing extremely strong evidence for a negative effect. Additionally, 0% of the posterior distribution fell within the ROPE, suggesting that none of the credible parameter values were practically equivalent to zero. For three-way cognates, the median effect was 0.71 95% HDI = [0, 1.39], indicating that the most credible values of the effect were positive. The effect was associated with a pd of 0.98, indicating that approximately 98% of the posterior distribution supported a positive effect. Additionally, only 4% of the posterior distribution fell within the ROPE, suggesting that most credible parameter values were not practically equivalent to zero. Taken together, these results provide evidence that three-way cognates were identified more accurately than two-way cognates, although the evidence was somewhat weaker than that observed for the non-cognate effect.</w:t>
       </w:r>
     </w:p>
     <w:p>
@@ -4883,11 +4883,11 @@
         <w:pStyle w:val="BodyText"/>
       </w:pPr>
       <w:r>
-        <w:t xml:space="preserve">Higher numbers for both the continuous predictors lexical frequency and proficiency were associated with higher accuracy. For lexical frequency, the median estimate was 1.01 [0.79, 1.24], indicating that a one standard deviation increase in lexical frequency was associated with an increase of 1.01 increase in the log-odds of a correct response. Holding all other predictors constant, predicted accuracy increases to around 96.6% words that were 1 standard deviation more frequent than average, while it dropped to 79.1% for words that were one standard deviation less frequent than average. Again, the pd (1) and ROPE percentage 0% provide strong evidence for the existence of a positive association between lexical frequency and accuracy. </w:t>
+        <w:t xml:space="preserve">Higher numbers for both the continuous predictors lexical frequency and proficiency were associated with higher accuracy. For lexical frequency, the median estimate was 1.01 [0.79, 1.24], indicating that a one standard deviation increase in lexical frequency was associated with an increase of 1.01 in the log-odds of a correct response. Holding all other predictors constant, predicted accuracy increases to around 96.6% in words that were 1 standard deviation more frequent than average, while it dropped to 79.1% for words that were one standard deviation less frequent than average. Again, the pd (1) and ROPE percentage (0%) provide strong evidence for the existence of a positive association between lexical frequency and accuracy. Proficiency was </w:t>
       </w:r>
       <w:r>
         <w:lastRenderedPageBreak/>
-        <w:t>Proficiency was also shown the be positively associated with accuracy; the estimate 1.01 [0.79, 1.24]] suggests that For proficiency, the median estimate was 0.78 [0.43, 1.15], once again indicating that a one standard deviation increase in lexical frequency was associated with an increase of 0.78 increase in the log-odds of a correct response. Predicted accuracy increases to around 96.6% by participants that were 1 standard deviation more proficient than average, while it dropped to 82.6% for participants that were one standard deviation less proficient than average. Like frequency, the pd (1) and ROPE percentage (0) provide compelling evidence of that the effect is positive and not negligible.</w:t>
+        <w:t>also shown the be positively associated with accuracy; the estimate 0.78 [0.43, 1.15] suggests that a one standard deviation increase in the adapted LexTALE score was associated with an increase of 0.78 increase in the log-odds of a correct response. Predicted accuracy increases to around 96.6% by participants that were 1 standard deviation more proficient than average, while it dropped to 82.6% for participants that were one standard deviation less proficient than average. Like frequency, the pd (1) and ROPE percentage (0) provide compelling evidence of that the effect is positive and not negligible.</w:t>
       </w:r>
     </w:p>
     <w:p>
@@ -4899,7 +4899,7 @@
           <w:noProof/>
         </w:rPr>
         <w:drawing>
-          <wp:inline distT="0" distB="0" distL="0" distR="0" wp14:anchorId="13848598" wp14:editId="13848599">
+          <wp:inline distT="0" distB="0" distL="0" distR="0" wp14:anchorId="515AF720" wp14:editId="515AF721">
             <wp:extent cx="4579632" cy="3663706"/>
             <wp:effectExtent l="0" t="0" r="0" b="0"/>
             <wp:docPr id="50" name="Picture" descr="Figure 4: Posterior Distributions of the accuracy model"/>
@@ -4966,7 +4966,27 @@
         <w:pStyle w:val="FirstParagraph"/>
       </w:pPr>
       <w:r>
-        <w:t>Overall, there was evidence of a general cognate effect in reaction times, but not a cumulative one.</w:t>
+        <w:t xml:space="preserve">Like accuracy, the analysis of the reaction time data showed evidence of a general cognate facilitation effect. Figure 5 shows the overall mean reaction times in milliseconds in for each word type. Non-cognate words were recognized as real words slowest (mean reaction time 881.67ms, sd = 304.77), while both two-way (827.33ms, sd = 296.70) and three-way cognates </w:t>
+      </w:r>
+      <w:r>
+        <w:lastRenderedPageBreak/>
+        <w:t>were recognized faster 817.38ms, sd = 263.04. The difference in reaction time between two-way and three-way cognates was quite small (d = .03).</w:t>
+      </w:r>
+    </w:p>
+    <w:p>
+      <w:pPr>
+        <w:pStyle w:val="BodyText"/>
+      </w:pPr>
+      <w:r>
+        <w:t>In the case of reaction time, there were even more pronounced differences regarding individual differences. Figure 6 shows individual effect sizes in three situations: going from double to triple cognates, non-cognates to double cognates, and non-cognates to triple cognates. It was predicted that, if there was a cumulative effect of cognate facilitation, that double to triple cognates would yield negative effects. However, many participants were faster (14 of 35) in double cognates than triple cognates, while the remaining 21 participants showed the opposite pattern and processed triple cognates fastest.</w:t>
+      </w:r>
+      <w:r>
+        <w:br/>
+        <w:t>The second facet shows the individual effects for non-cognates relative to double cognates.</w:t>
+      </w:r>
+      <w:r>
+        <w:br/>
+        <w:t>In this instance, as expected, most participants (26) were faster for double cognates than non-cognates, although 26 individuals were not. Similar proportions of participants were also faster at deciding that triple cognates were real words (27). Taken together, these results suggest that while most individuals showed descriptive evidence general cognate effects in reaction time, there was not strong evidence for a cumulative effect in which triple cognates were processed faster than double cognates.</w:t>
       </w:r>
     </w:p>
     <w:p>
@@ -4979,7 +4999,7 @@
         </w:rPr>
         <w:lastRenderedPageBreak/>
         <w:drawing>
-          <wp:inline distT="0" distB="0" distL="0" distR="0" wp14:anchorId="1384859A" wp14:editId="1384859B">
+          <wp:inline distT="0" distB="0" distL="0" distR="0" wp14:anchorId="515AF722" wp14:editId="515AF723">
             <wp:extent cx="4579632" cy="3663706"/>
             <wp:effectExtent l="0" t="0" r="0" b="0"/>
             <wp:docPr id="55" name="Picture" descr="Figure 5: Mean reaction time of each word type"/>
@@ -4988,7 +5008,7 @@
               <a:graphicData uri="http://schemas.openxmlformats.org/drawingml/2006/picture">
                 <pic:pic xmlns:pic="http://schemas.openxmlformats.org/drawingml/2006/picture">
                   <pic:nvPicPr>
-                    <pic:cNvPr id="56" name="Picture" descr="main_files/9caddfd83ddb35d5b95cbdf8e52ce5aaff7c1257.png"/>
+                    <pic:cNvPr id="56" name="Picture" descr="main_files/deac36b76b271c551f35dfec77094b0b3bf8ef64.png"/>
                     <pic:cNvPicPr>
                       <a:picLocks noChangeAspect="1" noChangeArrowheads="1"/>
                     </pic:cNvPicPr>
@@ -5040,7 +5060,7 @@
           <w:noProof/>
         </w:rPr>
         <w:drawing>
-          <wp:inline distT="0" distB="0" distL="0" distR="0" wp14:anchorId="1384859C" wp14:editId="1384859D">
+          <wp:inline distT="0" distB="0" distL="0" distR="0" wp14:anchorId="515AF724" wp14:editId="515AF725">
             <wp:extent cx="4579632" cy="3663706"/>
             <wp:effectExtent l="0" t="0" r="0" b="0"/>
             <wp:docPr id="59" name="Picture" descr="Figure 6: Individual effects in reaction times"/>
@@ -5102,7 +5122,7 @@
         </w:rPr>
         <w:lastRenderedPageBreak/>
         <w:drawing>
-          <wp:inline distT="0" distB="0" distL="0" distR="0" wp14:anchorId="1384859E" wp14:editId="1384859F">
+          <wp:inline distT="0" distB="0" distL="0" distR="0" wp14:anchorId="515AF726" wp14:editId="515AF727">
             <wp:extent cx="4579632" cy="3663706"/>
             <wp:effectExtent l="0" t="0" r="0" b="0"/>
             <wp:docPr id="63" name="Picture" descr="Figure 7: Posterior Distributions of the reaction time model"/>
@@ -5156,9 +5176,2340 @@
     </w:p>
     <w:p>
       <w:pPr>
+        <w:pStyle w:val="TableCaption"/>
+      </w:pPr>
+      <w:bookmarkStart w:id="27" w:name="tab:unnamed-chunk-18"/>
+      <w:bookmarkEnd w:id="27"/>
+      <w:r>
+        <w:t>Table 3: Posterior Distribution of the Reaction Time Model</w:t>
+      </w:r>
+    </w:p>
+    <w:tbl>
+      <w:tblPr>
+        <w:tblW w:w="0" w:type="auto"/>
+        <w:jc w:val="center"/>
+        <w:tblLayout w:type="fixed"/>
+        <w:tblLook w:val="0420" w:firstRow="1" w:lastRow="0" w:firstColumn="0" w:lastColumn="0" w:noHBand="0" w:noVBand="1"/>
+      </w:tblPr>
+      <w:tblGrid>
+        <w:gridCol w:w="2720"/>
+        <w:gridCol w:w="1083"/>
+        <w:gridCol w:w="1584"/>
+        <w:gridCol w:w="796"/>
+        <w:gridCol w:w="1510"/>
+        <w:gridCol w:w="1437"/>
+        <w:gridCol w:w="826"/>
+        <w:gridCol w:w="1181"/>
+      </w:tblGrid>
+      <w:tr>
+        <w:trPr>
+          <w:tblHeader/>
+          <w:jc w:val="center"/>
+        </w:trPr>
+        <w:tc>
+          <w:tcPr>
+            <w:tcW w:w="2720" w:type="dxa"/>
+            <w:tcBorders>
+              <w:top w:val="single" w:sz="12" w:space="0" w:color="666666"/>
+              <w:left w:val="none" w:sz="0" w:space="0" w:color="000000"/>
+              <w:bottom w:val="single" w:sz="12" w:space="0" w:color="666666"/>
+              <w:right w:val="none" w:sz="0" w:space="0" w:color="000000"/>
+            </w:tcBorders>
+            <w:shd w:val="clear" w:color="auto" w:fill="FFFFFF"/>
+            <w:tcMar>
+              <w:top w:w="0" w:type="dxa"/>
+              <w:left w:w="0" w:type="dxa"/>
+              <w:bottom w:w="0" w:type="dxa"/>
+              <w:right w:w="0" w:type="dxa"/>
+            </w:tcMar>
+            <w:vAlign w:val="center"/>
+          </w:tcPr>
+          <w:p>
+            <w:pPr>
+              <w:pBdr>
+                <w:top w:val="none" w:sz="0" w:space="0" w:color="000000"/>
+                <w:left w:val="none" w:sz="0" w:space="0" w:color="000000"/>
+                <w:bottom w:val="none" w:sz="0" w:space="0" w:color="000000"/>
+                <w:right w:val="none" w:sz="0" w:space="0" w:color="000000"/>
+              </w:pBdr>
+              <w:spacing w:before="100" w:after="100"/>
+              <w:ind w:left="100" w:right="100"/>
+              <w:jc w:val="center"/>
+              <w:rPr>
+                <w:rFonts w:ascii="Times New Roman" w:eastAsia="Times New Roman" w:hAnsi="Times New Roman" w:cs="Times New Roman"/>
+                <w:color w:val="000000"/>
+                <w:sz w:val="22"/>
+                <w:szCs w:val="22"/>
+              </w:rPr>
+            </w:pPr>
+            <w:r>
+              <w:rPr>
+                <w:rFonts w:ascii="Times New Roman" w:eastAsia="Times New Roman" w:hAnsi="Times New Roman" w:cs="Times New Roman"/>
+                <w:color w:val="000000"/>
+                <w:sz w:val="22"/>
+                <w:szCs w:val="22"/>
+              </w:rPr>
+              <w:t>Parameter</w:t>
+            </w:r>
+          </w:p>
+        </w:tc>
+        <w:tc>
+          <w:tcPr>
+            <w:tcW w:w="1083" w:type="dxa"/>
+            <w:tcBorders>
+              <w:top w:val="single" w:sz="12" w:space="0" w:color="666666"/>
+              <w:left w:val="none" w:sz="0" w:space="0" w:color="000000"/>
+              <w:bottom w:val="single" w:sz="12" w:space="0" w:color="666666"/>
+              <w:right w:val="none" w:sz="0" w:space="0" w:color="000000"/>
+            </w:tcBorders>
+            <w:shd w:val="clear" w:color="auto" w:fill="FFFFFF"/>
+            <w:tcMar>
+              <w:top w:w="0" w:type="dxa"/>
+              <w:left w:w="0" w:type="dxa"/>
+              <w:bottom w:w="0" w:type="dxa"/>
+              <w:right w:w="0" w:type="dxa"/>
+            </w:tcMar>
+            <w:vAlign w:val="center"/>
+          </w:tcPr>
+          <w:p>
+            <w:pPr>
+              <w:pBdr>
+                <w:top w:val="none" w:sz="0" w:space="0" w:color="000000"/>
+                <w:left w:val="none" w:sz="0" w:space="0" w:color="000000"/>
+                <w:bottom w:val="none" w:sz="0" w:space="0" w:color="000000"/>
+                <w:right w:val="none" w:sz="0" w:space="0" w:color="000000"/>
+              </w:pBdr>
+              <w:spacing w:before="100" w:after="100"/>
+              <w:ind w:left="100" w:right="100"/>
+              <w:jc w:val="center"/>
+              <w:rPr>
+                <w:rFonts w:ascii="Times New Roman" w:eastAsia="Times New Roman" w:hAnsi="Times New Roman" w:cs="Times New Roman"/>
+                <w:color w:val="000000"/>
+                <w:sz w:val="22"/>
+                <w:szCs w:val="22"/>
+              </w:rPr>
+            </w:pPr>
+            <w:r>
+              <w:rPr>
+                <w:rFonts w:ascii="Times New Roman" w:eastAsia="Times New Roman" w:hAnsi="Times New Roman" w:cs="Times New Roman"/>
+                <w:color w:val="000000"/>
+                <w:sz w:val="22"/>
+                <w:szCs w:val="22"/>
+              </w:rPr>
+              <w:t>Median</w:t>
+            </w:r>
+          </w:p>
+        </w:tc>
+        <w:tc>
+          <w:tcPr>
+            <w:tcW w:w="1584" w:type="dxa"/>
+            <w:tcBorders>
+              <w:top w:val="single" w:sz="12" w:space="0" w:color="666666"/>
+              <w:left w:val="none" w:sz="0" w:space="0" w:color="000000"/>
+              <w:bottom w:val="single" w:sz="12" w:space="0" w:color="666666"/>
+              <w:right w:val="none" w:sz="0" w:space="0" w:color="000000"/>
+            </w:tcBorders>
+            <w:shd w:val="clear" w:color="auto" w:fill="FFFFFF"/>
+            <w:tcMar>
+              <w:top w:w="0" w:type="dxa"/>
+              <w:left w:w="0" w:type="dxa"/>
+              <w:bottom w:w="0" w:type="dxa"/>
+              <w:right w:w="0" w:type="dxa"/>
+            </w:tcMar>
+            <w:vAlign w:val="center"/>
+          </w:tcPr>
+          <w:p>
+            <w:pPr>
+              <w:pBdr>
+                <w:top w:val="none" w:sz="0" w:space="0" w:color="000000"/>
+                <w:left w:val="none" w:sz="0" w:space="0" w:color="000000"/>
+                <w:bottom w:val="none" w:sz="0" w:space="0" w:color="000000"/>
+                <w:right w:val="none" w:sz="0" w:space="0" w:color="000000"/>
+              </w:pBdr>
+              <w:spacing w:before="100" w:after="100"/>
+              <w:ind w:left="100" w:right="100"/>
+              <w:jc w:val="center"/>
+              <w:rPr>
+                <w:rFonts w:ascii="Times New Roman" w:eastAsia="Times New Roman" w:hAnsi="Times New Roman" w:cs="Times New Roman"/>
+                <w:color w:val="000000"/>
+                <w:sz w:val="22"/>
+                <w:szCs w:val="22"/>
+              </w:rPr>
+            </w:pPr>
+            <w:r>
+              <w:rPr>
+                <w:rFonts w:ascii="Times New Roman" w:eastAsia="Times New Roman" w:hAnsi="Times New Roman" w:cs="Times New Roman"/>
+                <w:color w:val="000000"/>
+                <w:sz w:val="22"/>
+                <w:szCs w:val="22"/>
+              </w:rPr>
+              <w:t>95% CI</w:t>
+            </w:r>
+          </w:p>
+        </w:tc>
+        <w:tc>
+          <w:tcPr>
+            <w:tcW w:w="796" w:type="dxa"/>
+            <w:tcBorders>
+              <w:top w:val="single" w:sz="12" w:space="0" w:color="666666"/>
+              <w:left w:val="none" w:sz="0" w:space="0" w:color="000000"/>
+              <w:bottom w:val="single" w:sz="12" w:space="0" w:color="666666"/>
+              <w:right w:val="none" w:sz="0" w:space="0" w:color="000000"/>
+            </w:tcBorders>
+            <w:shd w:val="clear" w:color="auto" w:fill="FFFFFF"/>
+            <w:tcMar>
+              <w:top w:w="0" w:type="dxa"/>
+              <w:left w:w="0" w:type="dxa"/>
+              <w:bottom w:w="0" w:type="dxa"/>
+              <w:right w:w="0" w:type="dxa"/>
+            </w:tcMar>
+            <w:vAlign w:val="center"/>
+          </w:tcPr>
+          <w:p>
+            <w:pPr>
+              <w:pBdr>
+                <w:top w:val="none" w:sz="0" w:space="0" w:color="000000"/>
+                <w:left w:val="none" w:sz="0" w:space="0" w:color="000000"/>
+                <w:bottom w:val="none" w:sz="0" w:space="0" w:color="000000"/>
+                <w:right w:val="none" w:sz="0" w:space="0" w:color="000000"/>
+              </w:pBdr>
+              <w:spacing w:before="100" w:after="100"/>
+              <w:ind w:left="100" w:right="100"/>
+              <w:jc w:val="center"/>
+              <w:rPr>
+                <w:rFonts w:ascii="Times New Roman" w:eastAsia="Times New Roman" w:hAnsi="Times New Roman" w:cs="Times New Roman"/>
+                <w:color w:val="000000"/>
+                <w:sz w:val="22"/>
+                <w:szCs w:val="22"/>
+              </w:rPr>
+            </w:pPr>
+            <w:r>
+              <w:rPr>
+                <w:rFonts w:ascii="Times New Roman" w:eastAsia="Times New Roman" w:hAnsi="Times New Roman" w:cs="Times New Roman"/>
+                <w:color w:val="000000"/>
+                <w:sz w:val="22"/>
+                <w:szCs w:val="22"/>
+              </w:rPr>
+              <w:t>pd</w:t>
+            </w:r>
+          </w:p>
+        </w:tc>
+        <w:tc>
+          <w:tcPr>
+            <w:tcW w:w="1510" w:type="dxa"/>
+            <w:tcBorders>
+              <w:top w:val="single" w:sz="12" w:space="0" w:color="666666"/>
+              <w:left w:val="none" w:sz="0" w:space="0" w:color="000000"/>
+              <w:bottom w:val="single" w:sz="12" w:space="0" w:color="666666"/>
+              <w:right w:val="none" w:sz="0" w:space="0" w:color="000000"/>
+            </w:tcBorders>
+            <w:shd w:val="clear" w:color="auto" w:fill="FFFFFF"/>
+            <w:tcMar>
+              <w:top w:w="0" w:type="dxa"/>
+              <w:left w:w="0" w:type="dxa"/>
+              <w:bottom w:w="0" w:type="dxa"/>
+              <w:right w:w="0" w:type="dxa"/>
+            </w:tcMar>
+            <w:vAlign w:val="center"/>
+          </w:tcPr>
+          <w:p>
+            <w:pPr>
+              <w:pBdr>
+                <w:top w:val="none" w:sz="0" w:space="0" w:color="000000"/>
+                <w:left w:val="none" w:sz="0" w:space="0" w:color="000000"/>
+                <w:bottom w:val="none" w:sz="0" w:space="0" w:color="000000"/>
+                <w:right w:val="none" w:sz="0" w:space="0" w:color="000000"/>
+              </w:pBdr>
+              <w:spacing w:before="100" w:after="100"/>
+              <w:ind w:left="100" w:right="100"/>
+              <w:jc w:val="center"/>
+              <w:rPr>
+                <w:rFonts w:ascii="Times New Roman" w:eastAsia="Times New Roman" w:hAnsi="Times New Roman" w:cs="Times New Roman"/>
+                <w:color w:val="000000"/>
+                <w:sz w:val="22"/>
+                <w:szCs w:val="22"/>
+              </w:rPr>
+            </w:pPr>
+            <w:r>
+              <w:rPr>
+                <w:rFonts w:ascii="Times New Roman" w:eastAsia="Times New Roman" w:hAnsi="Times New Roman" w:cs="Times New Roman"/>
+                <w:color w:val="000000"/>
+                <w:sz w:val="22"/>
+                <w:szCs w:val="22"/>
+              </w:rPr>
+              <w:t>ROPE</w:t>
+            </w:r>
+          </w:p>
+        </w:tc>
+        <w:tc>
+          <w:tcPr>
+            <w:tcW w:w="1437" w:type="dxa"/>
+            <w:tcBorders>
+              <w:top w:val="single" w:sz="12" w:space="0" w:color="666666"/>
+              <w:left w:val="none" w:sz="0" w:space="0" w:color="000000"/>
+              <w:bottom w:val="single" w:sz="12" w:space="0" w:color="666666"/>
+              <w:right w:val="none" w:sz="0" w:space="0" w:color="000000"/>
+            </w:tcBorders>
+            <w:shd w:val="clear" w:color="auto" w:fill="FFFFFF"/>
+            <w:tcMar>
+              <w:top w:w="0" w:type="dxa"/>
+              <w:left w:w="0" w:type="dxa"/>
+              <w:bottom w:w="0" w:type="dxa"/>
+              <w:right w:w="0" w:type="dxa"/>
+            </w:tcMar>
+            <w:vAlign w:val="center"/>
+          </w:tcPr>
+          <w:p>
+            <w:pPr>
+              <w:pBdr>
+                <w:top w:val="none" w:sz="0" w:space="0" w:color="000000"/>
+                <w:left w:val="none" w:sz="0" w:space="0" w:color="000000"/>
+                <w:bottom w:val="none" w:sz="0" w:space="0" w:color="000000"/>
+                <w:right w:val="none" w:sz="0" w:space="0" w:color="000000"/>
+              </w:pBdr>
+              <w:spacing w:before="100" w:after="100"/>
+              <w:ind w:left="100" w:right="100"/>
+              <w:jc w:val="center"/>
+              <w:rPr>
+                <w:rFonts w:ascii="Times New Roman" w:eastAsia="Times New Roman" w:hAnsi="Times New Roman" w:cs="Times New Roman"/>
+                <w:color w:val="000000"/>
+                <w:sz w:val="22"/>
+                <w:szCs w:val="22"/>
+              </w:rPr>
+            </w:pPr>
+            <w:r>
+              <w:rPr>
+                <w:rFonts w:ascii="Times New Roman" w:eastAsia="Times New Roman" w:hAnsi="Times New Roman" w:cs="Times New Roman"/>
+                <w:color w:val="000000"/>
+                <w:sz w:val="22"/>
+                <w:szCs w:val="22"/>
+              </w:rPr>
+              <w:t>% in ROPE</w:t>
+            </w:r>
+          </w:p>
+        </w:tc>
+        <w:tc>
+          <w:tcPr>
+            <w:tcW w:w="826" w:type="dxa"/>
+            <w:tcBorders>
+              <w:top w:val="single" w:sz="12" w:space="0" w:color="666666"/>
+              <w:left w:val="none" w:sz="0" w:space="0" w:color="000000"/>
+              <w:bottom w:val="single" w:sz="12" w:space="0" w:color="666666"/>
+              <w:right w:val="none" w:sz="0" w:space="0" w:color="000000"/>
+            </w:tcBorders>
+            <w:shd w:val="clear" w:color="auto" w:fill="FFFFFF"/>
+            <w:tcMar>
+              <w:top w:w="0" w:type="dxa"/>
+              <w:left w:w="0" w:type="dxa"/>
+              <w:bottom w:w="0" w:type="dxa"/>
+              <w:right w:w="0" w:type="dxa"/>
+            </w:tcMar>
+            <w:vAlign w:val="center"/>
+          </w:tcPr>
+          <w:p>
+            <w:pPr>
+              <w:pBdr>
+                <w:top w:val="none" w:sz="0" w:space="0" w:color="000000"/>
+                <w:left w:val="none" w:sz="0" w:space="0" w:color="000000"/>
+                <w:bottom w:val="none" w:sz="0" w:space="0" w:color="000000"/>
+                <w:right w:val="none" w:sz="0" w:space="0" w:color="000000"/>
+              </w:pBdr>
+              <w:spacing w:before="100" w:after="100"/>
+              <w:ind w:left="100" w:right="100"/>
+              <w:jc w:val="center"/>
+              <w:rPr>
+                <w:rFonts w:ascii="Times New Roman" w:eastAsia="Times New Roman" w:hAnsi="Times New Roman" w:cs="Times New Roman"/>
+                <w:color w:val="000000"/>
+                <w:sz w:val="22"/>
+                <w:szCs w:val="22"/>
+              </w:rPr>
+            </w:pPr>
+            <w:r>
+              <w:rPr>
+                <w:rFonts w:ascii="Times New Roman" w:eastAsia="Times New Roman" w:hAnsi="Times New Roman" w:cs="Times New Roman"/>
+                <w:color w:val="000000"/>
+                <w:sz w:val="22"/>
+                <w:szCs w:val="22"/>
+              </w:rPr>
+              <w:t>Rhat</w:t>
+            </w:r>
+          </w:p>
+        </w:tc>
+        <w:tc>
+          <w:tcPr>
+            <w:tcW w:w="1181" w:type="dxa"/>
+            <w:tcBorders>
+              <w:top w:val="single" w:sz="12" w:space="0" w:color="666666"/>
+              <w:left w:val="none" w:sz="0" w:space="0" w:color="000000"/>
+              <w:bottom w:val="single" w:sz="12" w:space="0" w:color="666666"/>
+              <w:right w:val="none" w:sz="0" w:space="0" w:color="000000"/>
+            </w:tcBorders>
+            <w:shd w:val="clear" w:color="auto" w:fill="FFFFFF"/>
+            <w:tcMar>
+              <w:top w:w="0" w:type="dxa"/>
+              <w:left w:w="0" w:type="dxa"/>
+              <w:bottom w:w="0" w:type="dxa"/>
+              <w:right w:w="0" w:type="dxa"/>
+            </w:tcMar>
+            <w:vAlign w:val="center"/>
+          </w:tcPr>
+          <w:p>
+            <w:pPr>
+              <w:pBdr>
+                <w:top w:val="none" w:sz="0" w:space="0" w:color="000000"/>
+                <w:left w:val="none" w:sz="0" w:space="0" w:color="000000"/>
+                <w:bottom w:val="none" w:sz="0" w:space="0" w:color="000000"/>
+                <w:right w:val="none" w:sz="0" w:space="0" w:color="000000"/>
+              </w:pBdr>
+              <w:spacing w:before="100" w:after="100"/>
+              <w:ind w:left="100" w:right="100"/>
+              <w:jc w:val="center"/>
+              <w:rPr>
+                <w:rFonts w:ascii="Times New Roman" w:eastAsia="Times New Roman" w:hAnsi="Times New Roman" w:cs="Times New Roman"/>
+                <w:color w:val="000000"/>
+                <w:sz w:val="22"/>
+                <w:szCs w:val="22"/>
+              </w:rPr>
+            </w:pPr>
+            <w:r>
+              <w:rPr>
+                <w:rFonts w:ascii="Times New Roman" w:eastAsia="Times New Roman" w:hAnsi="Times New Roman" w:cs="Times New Roman"/>
+                <w:color w:val="000000"/>
+                <w:sz w:val="22"/>
+                <w:szCs w:val="22"/>
+              </w:rPr>
+              <w:t>ESS</w:t>
+            </w:r>
+          </w:p>
+        </w:tc>
+      </w:tr>
+      <w:tr>
+        <w:trPr>
+          <w:jc w:val="center"/>
+        </w:trPr>
+        <w:tc>
+          <w:tcPr>
+            <w:tcW w:w="2720" w:type="dxa"/>
+            <w:tcBorders>
+              <w:top w:val="single" w:sz="12" w:space="0" w:color="666666"/>
+              <w:left w:val="none" w:sz="0" w:space="0" w:color="000000"/>
+              <w:bottom w:val="none" w:sz="0" w:space="0" w:color="000000"/>
+              <w:right w:val="none" w:sz="0" w:space="0" w:color="000000"/>
+            </w:tcBorders>
+            <w:shd w:val="clear" w:color="auto" w:fill="FFFFFF"/>
+            <w:tcMar>
+              <w:top w:w="0" w:type="dxa"/>
+              <w:left w:w="0" w:type="dxa"/>
+              <w:bottom w:w="0" w:type="dxa"/>
+              <w:right w:w="0" w:type="dxa"/>
+            </w:tcMar>
+            <w:vAlign w:val="center"/>
+          </w:tcPr>
+          <w:p>
+            <w:pPr>
+              <w:pBdr>
+                <w:top w:val="none" w:sz="0" w:space="0" w:color="000000"/>
+                <w:left w:val="none" w:sz="0" w:space="0" w:color="000000"/>
+                <w:bottom w:val="none" w:sz="0" w:space="0" w:color="000000"/>
+                <w:right w:val="none" w:sz="0" w:space="0" w:color="000000"/>
+              </w:pBdr>
+              <w:spacing w:before="100" w:after="100"/>
+              <w:ind w:left="100" w:right="100"/>
+              <w:rPr>
+                <w:rFonts w:ascii="Times New Roman" w:eastAsia="Times New Roman" w:hAnsi="Times New Roman" w:cs="Times New Roman"/>
+                <w:color w:val="000000"/>
+                <w:sz w:val="22"/>
+                <w:szCs w:val="22"/>
+              </w:rPr>
+            </w:pPr>
+            <w:r>
+              <w:rPr>
+                <w:rFonts w:ascii="Times New Roman" w:eastAsia="Times New Roman" w:hAnsi="Times New Roman" w:cs="Times New Roman"/>
+                <w:color w:val="000000"/>
+                <w:sz w:val="22"/>
+                <w:szCs w:val="22"/>
+              </w:rPr>
+              <w:t>b_Intercept</w:t>
+            </w:r>
+          </w:p>
+        </w:tc>
+        <w:tc>
+          <w:tcPr>
+            <w:tcW w:w="1083" w:type="dxa"/>
+            <w:tcBorders>
+              <w:top w:val="single" w:sz="12" w:space="0" w:color="666666"/>
+              <w:left w:val="none" w:sz="0" w:space="0" w:color="000000"/>
+              <w:bottom w:val="none" w:sz="0" w:space="0" w:color="000000"/>
+              <w:right w:val="none" w:sz="0" w:space="0" w:color="000000"/>
+            </w:tcBorders>
+            <w:shd w:val="clear" w:color="auto" w:fill="FFFFFF"/>
+            <w:tcMar>
+              <w:top w:w="0" w:type="dxa"/>
+              <w:left w:w="0" w:type="dxa"/>
+              <w:bottom w:w="0" w:type="dxa"/>
+              <w:right w:w="0" w:type="dxa"/>
+            </w:tcMar>
+            <w:vAlign w:val="center"/>
+          </w:tcPr>
+          <w:p>
+            <w:pPr>
+              <w:pBdr>
+                <w:top w:val="none" w:sz="0" w:space="0" w:color="000000"/>
+                <w:left w:val="none" w:sz="0" w:space="0" w:color="000000"/>
+                <w:bottom w:val="none" w:sz="0" w:space="0" w:color="000000"/>
+                <w:right w:val="none" w:sz="0" w:space="0" w:color="000000"/>
+              </w:pBdr>
+              <w:spacing w:before="100" w:after="100"/>
+              <w:ind w:left="100" w:right="100"/>
+              <w:jc w:val="center"/>
+              <w:rPr>
+                <w:rFonts w:ascii="Times New Roman" w:eastAsia="Times New Roman" w:hAnsi="Times New Roman" w:cs="Times New Roman"/>
+                <w:color w:val="000000"/>
+                <w:sz w:val="22"/>
+                <w:szCs w:val="22"/>
+              </w:rPr>
+            </w:pPr>
+            <w:r>
+              <w:rPr>
+                <w:rFonts w:ascii="Times New Roman" w:eastAsia="Times New Roman" w:hAnsi="Times New Roman" w:cs="Times New Roman"/>
+                <w:color w:val="000000"/>
+                <w:sz w:val="22"/>
+                <w:szCs w:val="22"/>
+              </w:rPr>
+              <w:t>-0.23</w:t>
+            </w:r>
+          </w:p>
+        </w:tc>
+        <w:tc>
+          <w:tcPr>
+            <w:tcW w:w="1584" w:type="dxa"/>
+            <w:tcBorders>
+              <w:top w:val="single" w:sz="12" w:space="0" w:color="666666"/>
+              <w:left w:val="none" w:sz="0" w:space="0" w:color="000000"/>
+              <w:bottom w:val="none" w:sz="0" w:space="0" w:color="000000"/>
+              <w:right w:val="none" w:sz="0" w:space="0" w:color="000000"/>
+            </w:tcBorders>
+            <w:shd w:val="clear" w:color="auto" w:fill="FFFFFF"/>
+            <w:tcMar>
+              <w:top w:w="0" w:type="dxa"/>
+              <w:left w:w="0" w:type="dxa"/>
+              <w:bottom w:w="0" w:type="dxa"/>
+              <w:right w:w="0" w:type="dxa"/>
+            </w:tcMar>
+            <w:vAlign w:val="center"/>
+          </w:tcPr>
+          <w:p>
+            <w:pPr>
+              <w:pBdr>
+                <w:top w:val="none" w:sz="0" w:space="0" w:color="000000"/>
+                <w:left w:val="none" w:sz="0" w:space="0" w:color="000000"/>
+                <w:bottom w:val="none" w:sz="0" w:space="0" w:color="000000"/>
+                <w:right w:val="none" w:sz="0" w:space="0" w:color="000000"/>
+              </w:pBdr>
+              <w:spacing w:before="100" w:after="100"/>
+              <w:ind w:left="100" w:right="100"/>
+              <w:jc w:val="center"/>
+              <w:rPr>
+                <w:rFonts w:ascii="Times New Roman" w:eastAsia="Times New Roman" w:hAnsi="Times New Roman" w:cs="Times New Roman"/>
+                <w:color w:val="000000"/>
+                <w:sz w:val="22"/>
+                <w:szCs w:val="22"/>
+              </w:rPr>
+            </w:pPr>
+            <w:r>
+              <w:rPr>
+                <w:rFonts w:ascii="Times New Roman" w:eastAsia="Times New Roman" w:hAnsi="Times New Roman" w:cs="Times New Roman"/>
+                <w:color w:val="000000"/>
+                <w:sz w:val="22"/>
+                <w:szCs w:val="22"/>
+              </w:rPr>
+              <w:t>[-0.3, -0.17]</w:t>
+            </w:r>
+          </w:p>
+        </w:tc>
+        <w:tc>
+          <w:tcPr>
+            <w:tcW w:w="796" w:type="dxa"/>
+            <w:tcBorders>
+              <w:top w:val="single" w:sz="12" w:space="0" w:color="666666"/>
+              <w:left w:val="none" w:sz="0" w:space="0" w:color="000000"/>
+              <w:bottom w:val="none" w:sz="0" w:space="0" w:color="000000"/>
+              <w:right w:val="none" w:sz="0" w:space="0" w:color="000000"/>
+            </w:tcBorders>
+            <w:shd w:val="clear" w:color="auto" w:fill="FFFFFF"/>
+            <w:tcMar>
+              <w:top w:w="0" w:type="dxa"/>
+              <w:left w:w="0" w:type="dxa"/>
+              <w:bottom w:w="0" w:type="dxa"/>
+              <w:right w:w="0" w:type="dxa"/>
+            </w:tcMar>
+            <w:vAlign w:val="center"/>
+          </w:tcPr>
+          <w:p>
+            <w:pPr>
+              <w:pBdr>
+                <w:top w:val="none" w:sz="0" w:space="0" w:color="000000"/>
+                <w:left w:val="none" w:sz="0" w:space="0" w:color="000000"/>
+                <w:bottom w:val="none" w:sz="0" w:space="0" w:color="000000"/>
+                <w:right w:val="none" w:sz="0" w:space="0" w:color="000000"/>
+              </w:pBdr>
+              <w:spacing w:before="100" w:after="100"/>
+              <w:ind w:left="100" w:right="100"/>
+              <w:jc w:val="center"/>
+              <w:rPr>
+                <w:rFonts w:ascii="Times New Roman" w:eastAsia="Times New Roman" w:hAnsi="Times New Roman" w:cs="Times New Roman"/>
+                <w:color w:val="000000"/>
+                <w:sz w:val="22"/>
+                <w:szCs w:val="22"/>
+              </w:rPr>
+            </w:pPr>
+            <w:r>
+              <w:rPr>
+                <w:rFonts w:ascii="Times New Roman" w:eastAsia="Times New Roman" w:hAnsi="Times New Roman" w:cs="Times New Roman"/>
+                <w:color w:val="000000"/>
+                <w:sz w:val="22"/>
+                <w:szCs w:val="22"/>
+              </w:rPr>
+              <w:t>1.00</w:t>
+            </w:r>
+          </w:p>
+        </w:tc>
+        <w:tc>
+          <w:tcPr>
+            <w:tcW w:w="1510" w:type="dxa"/>
+            <w:tcBorders>
+              <w:top w:val="single" w:sz="12" w:space="0" w:color="666666"/>
+              <w:left w:val="none" w:sz="0" w:space="0" w:color="000000"/>
+              <w:bottom w:val="none" w:sz="0" w:space="0" w:color="000000"/>
+              <w:right w:val="none" w:sz="0" w:space="0" w:color="000000"/>
+            </w:tcBorders>
+            <w:shd w:val="clear" w:color="auto" w:fill="FFFFFF"/>
+            <w:tcMar>
+              <w:top w:w="0" w:type="dxa"/>
+              <w:left w:w="0" w:type="dxa"/>
+              <w:bottom w:w="0" w:type="dxa"/>
+              <w:right w:w="0" w:type="dxa"/>
+            </w:tcMar>
+            <w:vAlign w:val="center"/>
+          </w:tcPr>
+          <w:p>
+            <w:pPr>
+              <w:pBdr>
+                <w:top w:val="none" w:sz="0" w:space="0" w:color="000000"/>
+                <w:left w:val="none" w:sz="0" w:space="0" w:color="000000"/>
+                <w:bottom w:val="none" w:sz="0" w:space="0" w:color="000000"/>
+                <w:right w:val="none" w:sz="0" w:space="0" w:color="000000"/>
+              </w:pBdr>
+              <w:spacing w:before="100" w:after="100"/>
+              <w:ind w:left="100" w:right="100"/>
+              <w:jc w:val="center"/>
+              <w:rPr>
+                <w:rFonts w:ascii="Times New Roman" w:eastAsia="Times New Roman" w:hAnsi="Times New Roman" w:cs="Times New Roman"/>
+                <w:color w:val="000000"/>
+                <w:sz w:val="22"/>
+                <w:szCs w:val="22"/>
+              </w:rPr>
+            </w:pPr>
+            <w:r>
+              <w:rPr>
+                <w:rFonts w:ascii="Times New Roman" w:eastAsia="Times New Roman" w:hAnsi="Times New Roman" w:cs="Times New Roman"/>
+                <w:color w:val="000000"/>
+                <w:sz w:val="22"/>
+                <w:szCs w:val="22"/>
+              </w:rPr>
+              <w:t>[-0.01, 0.01]</w:t>
+            </w:r>
+          </w:p>
+        </w:tc>
+        <w:tc>
+          <w:tcPr>
+            <w:tcW w:w="1437" w:type="dxa"/>
+            <w:tcBorders>
+              <w:top w:val="single" w:sz="12" w:space="0" w:color="666666"/>
+              <w:left w:val="none" w:sz="0" w:space="0" w:color="000000"/>
+              <w:bottom w:val="none" w:sz="0" w:space="0" w:color="000000"/>
+              <w:right w:val="none" w:sz="0" w:space="0" w:color="000000"/>
+            </w:tcBorders>
+            <w:shd w:val="clear" w:color="auto" w:fill="FFFFFF"/>
+            <w:tcMar>
+              <w:top w:w="0" w:type="dxa"/>
+              <w:left w:w="0" w:type="dxa"/>
+              <w:bottom w:w="0" w:type="dxa"/>
+              <w:right w:w="0" w:type="dxa"/>
+            </w:tcMar>
+            <w:vAlign w:val="center"/>
+          </w:tcPr>
+          <w:p>
+            <w:pPr>
+              <w:pBdr>
+                <w:top w:val="none" w:sz="0" w:space="0" w:color="000000"/>
+                <w:left w:val="none" w:sz="0" w:space="0" w:color="000000"/>
+                <w:bottom w:val="none" w:sz="0" w:space="0" w:color="000000"/>
+                <w:right w:val="none" w:sz="0" w:space="0" w:color="000000"/>
+              </w:pBdr>
+              <w:spacing w:before="100" w:after="100"/>
+              <w:ind w:left="100" w:right="100"/>
+              <w:jc w:val="center"/>
+              <w:rPr>
+                <w:rFonts w:ascii="Times New Roman" w:eastAsia="Times New Roman" w:hAnsi="Times New Roman" w:cs="Times New Roman"/>
+                <w:color w:val="000000"/>
+                <w:sz w:val="22"/>
+                <w:szCs w:val="22"/>
+              </w:rPr>
+            </w:pPr>
+            <w:r>
+              <w:rPr>
+                <w:rFonts w:ascii="Times New Roman" w:eastAsia="Times New Roman" w:hAnsi="Times New Roman" w:cs="Times New Roman"/>
+                <w:color w:val="000000"/>
+                <w:sz w:val="22"/>
+                <w:szCs w:val="22"/>
+              </w:rPr>
+              <w:t>0.00</w:t>
+            </w:r>
+          </w:p>
+        </w:tc>
+        <w:tc>
+          <w:tcPr>
+            <w:tcW w:w="826" w:type="dxa"/>
+            <w:tcBorders>
+              <w:top w:val="single" w:sz="12" w:space="0" w:color="666666"/>
+              <w:left w:val="none" w:sz="0" w:space="0" w:color="000000"/>
+              <w:bottom w:val="none" w:sz="0" w:space="0" w:color="000000"/>
+              <w:right w:val="none" w:sz="0" w:space="0" w:color="000000"/>
+            </w:tcBorders>
+            <w:shd w:val="clear" w:color="auto" w:fill="FFFFFF"/>
+            <w:tcMar>
+              <w:top w:w="0" w:type="dxa"/>
+              <w:left w:w="0" w:type="dxa"/>
+              <w:bottom w:w="0" w:type="dxa"/>
+              <w:right w:w="0" w:type="dxa"/>
+            </w:tcMar>
+            <w:vAlign w:val="center"/>
+          </w:tcPr>
+          <w:p>
+            <w:pPr>
+              <w:pBdr>
+                <w:top w:val="none" w:sz="0" w:space="0" w:color="000000"/>
+                <w:left w:val="none" w:sz="0" w:space="0" w:color="000000"/>
+                <w:bottom w:val="none" w:sz="0" w:space="0" w:color="000000"/>
+                <w:right w:val="none" w:sz="0" w:space="0" w:color="000000"/>
+              </w:pBdr>
+              <w:spacing w:before="100" w:after="100"/>
+              <w:ind w:left="100" w:right="100"/>
+              <w:jc w:val="center"/>
+              <w:rPr>
+                <w:rFonts w:ascii="Times New Roman" w:eastAsia="Times New Roman" w:hAnsi="Times New Roman" w:cs="Times New Roman"/>
+                <w:color w:val="000000"/>
+                <w:sz w:val="22"/>
+                <w:szCs w:val="22"/>
+              </w:rPr>
+            </w:pPr>
+            <w:r>
+              <w:rPr>
+                <w:rFonts w:ascii="Times New Roman" w:eastAsia="Times New Roman" w:hAnsi="Times New Roman" w:cs="Times New Roman"/>
+                <w:color w:val="000000"/>
+                <w:sz w:val="22"/>
+                <w:szCs w:val="22"/>
+              </w:rPr>
+              <w:t>1</w:t>
+            </w:r>
+          </w:p>
+        </w:tc>
+        <w:tc>
+          <w:tcPr>
+            <w:tcW w:w="1181" w:type="dxa"/>
+            <w:tcBorders>
+              <w:top w:val="single" w:sz="12" w:space="0" w:color="666666"/>
+              <w:left w:val="none" w:sz="0" w:space="0" w:color="000000"/>
+              <w:bottom w:val="none" w:sz="0" w:space="0" w:color="000000"/>
+              <w:right w:val="none" w:sz="0" w:space="0" w:color="000000"/>
+            </w:tcBorders>
+            <w:shd w:val="clear" w:color="auto" w:fill="FFFFFF"/>
+            <w:tcMar>
+              <w:top w:w="0" w:type="dxa"/>
+              <w:left w:w="0" w:type="dxa"/>
+              <w:bottom w:w="0" w:type="dxa"/>
+              <w:right w:w="0" w:type="dxa"/>
+            </w:tcMar>
+            <w:vAlign w:val="center"/>
+          </w:tcPr>
+          <w:p>
+            <w:pPr>
+              <w:pBdr>
+                <w:top w:val="none" w:sz="0" w:space="0" w:color="000000"/>
+                <w:left w:val="none" w:sz="0" w:space="0" w:color="000000"/>
+                <w:bottom w:val="none" w:sz="0" w:space="0" w:color="000000"/>
+                <w:right w:val="none" w:sz="0" w:space="0" w:color="000000"/>
+              </w:pBdr>
+              <w:spacing w:before="100" w:after="100"/>
+              <w:ind w:left="100" w:right="100"/>
+              <w:jc w:val="center"/>
+              <w:rPr>
+                <w:rFonts w:ascii="Times New Roman" w:eastAsia="Times New Roman" w:hAnsi="Times New Roman" w:cs="Times New Roman"/>
+                <w:color w:val="000000"/>
+                <w:sz w:val="22"/>
+                <w:szCs w:val="22"/>
+              </w:rPr>
+            </w:pPr>
+            <w:r>
+              <w:rPr>
+                <w:rFonts w:ascii="Times New Roman" w:eastAsia="Times New Roman" w:hAnsi="Times New Roman" w:cs="Times New Roman"/>
+                <w:color w:val="000000"/>
+                <w:sz w:val="22"/>
+                <w:szCs w:val="22"/>
+              </w:rPr>
+              <w:t>998.69</w:t>
+            </w:r>
+          </w:p>
+        </w:tc>
+      </w:tr>
+      <w:tr>
+        <w:trPr>
+          <w:jc w:val="center"/>
+        </w:trPr>
+        <w:tc>
+          <w:tcPr>
+            <w:tcW w:w="2720" w:type="dxa"/>
+            <w:tcBorders>
+              <w:top w:val="none" w:sz="0" w:space="0" w:color="000000"/>
+              <w:left w:val="none" w:sz="0" w:space="0" w:color="000000"/>
+              <w:bottom w:val="none" w:sz="0" w:space="0" w:color="000000"/>
+              <w:right w:val="none" w:sz="0" w:space="0" w:color="000000"/>
+            </w:tcBorders>
+            <w:shd w:val="clear" w:color="auto" w:fill="FFFFFF"/>
+            <w:tcMar>
+              <w:top w:w="0" w:type="dxa"/>
+              <w:left w:w="0" w:type="dxa"/>
+              <w:bottom w:w="0" w:type="dxa"/>
+              <w:right w:w="0" w:type="dxa"/>
+            </w:tcMar>
+            <w:vAlign w:val="center"/>
+          </w:tcPr>
+          <w:p>
+            <w:pPr>
+              <w:pBdr>
+                <w:top w:val="none" w:sz="0" w:space="0" w:color="000000"/>
+                <w:left w:val="none" w:sz="0" w:space="0" w:color="000000"/>
+                <w:bottom w:val="none" w:sz="0" w:space="0" w:color="000000"/>
+                <w:right w:val="none" w:sz="0" w:space="0" w:color="000000"/>
+              </w:pBdr>
+              <w:spacing w:before="100" w:after="100"/>
+              <w:ind w:left="100" w:right="100"/>
+              <w:rPr>
+                <w:rFonts w:ascii="Times New Roman" w:eastAsia="Times New Roman" w:hAnsi="Times New Roman" w:cs="Times New Roman"/>
+                <w:color w:val="000000"/>
+                <w:sz w:val="22"/>
+                <w:szCs w:val="22"/>
+              </w:rPr>
+            </w:pPr>
+            <w:r>
+              <w:rPr>
+                <w:rFonts w:ascii="Times New Roman" w:eastAsia="Times New Roman" w:hAnsi="Times New Roman" w:cs="Times New Roman"/>
+                <w:color w:val="000000"/>
+                <w:sz w:val="22"/>
+                <w:szCs w:val="22"/>
+              </w:rPr>
+              <w:t>b_typenon_cognate</w:t>
+            </w:r>
+          </w:p>
+        </w:tc>
+        <w:tc>
+          <w:tcPr>
+            <w:tcW w:w="1083" w:type="dxa"/>
+            <w:tcBorders>
+              <w:top w:val="none" w:sz="0" w:space="0" w:color="000000"/>
+              <w:left w:val="none" w:sz="0" w:space="0" w:color="000000"/>
+              <w:bottom w:val="none" w:sz="0" w:space="0" w:color="000000"/>
+              <w:right w:val="none" w:sz="0" w:space="0" w:color="000000"/>
+            </w:tcBorders>
+            <w:shd w:val="clear" w:color="auto" w:fill="FFFFFF"/>
+            <w:tcMar>
+              <w:top w:w="0" w:type="dxa"/>
+              <w:left w:w="0" w:type="dxa"/>
+              <w:bottom w:w="0" w:type="dxa"/>
+              <w:right w:w="0" w:type="dxa"/>
+            </w:tcMar>
+            <w:vAlign w:val="center"/>
+          </w:tcPr>
+          <w:p>
+            <w:pPr>
+              <w:pBdr>
+                <w:top w:val="none" w:sz="0" w:space="0" w:color="000000"/>
+                <w:left w:val="none" w:sz="0" w:space="0" w:color="000000"/>
+                <w:bottom w:val="none" w:sz="0" w:space="0" w:color="000000"/>
+                <w:right w:val="none" w:sz="0" w:space="0" w:color="000000"/>
+              </w:pBdr>
+              <w:spacing w:before="100" w:after="100"/>
+              <w:ind w:left="100" w:right="100"/>
+              <w:jc w:val="center"/>
+              <w:rPr>
+                <w:rFonts w:ascii="Times New Roman" w:eastAsia="Times New Roman" w:hAnsi="Times New Roman" w:cs="Times New Roman"/>
+                <w:color w:val="000000"/>
+                <w:sz w:val="22"/>
+                <w:szCs w:val="22"/>
+              </w:rPr>
+            </w:pPr>
+            <w:r>
+              <w:rPr>
+                <w:rFonts w:ascii="Times New Roman" w:eastAsia="Times New Roman" w:hAnsi="Times New Roman" w:cs="Times New Roman"/>
+                <w:color w:val="000000"/>
+                <w:sz w:val="22"/>
+                <w:szCs w:val="22"/>
+              </w:rPr>
+              <w:t>0.08</w:t>
+            </w:r>
+          </w:p>
+        </w:tc>
+        <w:tc>
+          <w:tcPr>
+            <w:tcW w:w="1584" w:type="dxa"/>
+            <w:tcBorders>
+              <w:top w:val="none" w:sz="0" w:space="0" w:color="000000"/>
+              <w:left w:val="none" w:sz="0" w:space="0" w:color="000000"/>
+              <w:bottom w:val="none" w:sz="0" w:space="0" w:color="000000"/>
+              <w:right w:val="none" w:sz="0" w:space="0" w:color="000000"/>
+            </w:tcBorders>
+            <w:shd w:val="clear" w:color="auto" w:fill="FFFFFF"/>
+            <w:tcMar>
+              <w:top w:w="0" w:type="dxa"/>
+              <w:left w:w="0" w:type="dxa"/>
+              <w:bottom w:w="0" w:type="dxa"/>
+              <w:right w:w="0" w:type="dxa"/>
+            </w:tcMar>
+            <w:vAlign w:val="center"/>
+          </w:tcPr>
+          <w:p>
+            <w:pPr>
+              <w:pBdr>
+                <w:top w:val="none" w:sz="0" w:space="0" w:color="000000"/>
+                <w:left w:val="none" w:sz="0" w:space="0" w:color="000000"/>
+                <w:bottom w:val="none" w:sz="0" w:space="0" w:color="000000"/>
+                <w:right w:val="none" w:sz="0" w:space="0" w:color="000000"/>
+              </w:pBdr>
+              <w:spacing w:before="100" w:after="100"/>
+              <w:ind w:left="100" w:right="100"/>
+              <w:jc w:val="center"/>
+              <w:rPr>
+                <w:rFonts w:ascii="Times New Roman" w:eastAsia="Times New Roman" w:hAnsi="Times New Roman" w:cs="Times New Roman"/>
+                <w:color w:val="000000"/>
+                <w:sz w:val="22"/>
+                <w:szCs w:val="22"/>
+              </w:rPr>
+            </w:pPr>
+            <w:r>
+              <w:rPr>
+                <w:rFonts w:ascii="Times New Roman" w:eastAsia="Times New Roman" w:hAnsi="Times New Roman" w:cs="Times New Roman"/>
+                <w:color w:val="000000"/>
+                <w:sz w:val="22"/>
+                <w:szCs w:val="22"/>
+              </w:rPr>
+              <w:t>[0.04, 0.12]</w:t>
+            </w:r>
+          </w:p>
+        </w:tc>
+        <w:tc>
+          <w:tcPr>
+            <w:tcW w:w="796" w:type="dxa"/>
+            <w:tcBorders>
+              <w:top w:val="none" w:sz="0" w:space="0" w:color="000000"/>
+              <w:left w:val="none" w:sz="0" w:space="0" w:color="000000"/>
+              <w:bottom w:val="none" w:sz="0" w:space="0" w:color="000000"/>
+              <w:right w:val="none" w:sz="0" w:space="0" w:color="000000"/>
+            </w:tcBorders>
+            <w:shd w:val="clear" w:color="auto" w:fill="FFFFFF"/>
+            <w:tcMar>
+              <w:top w:w="0" w:type="dxa"/>
+              <w:left w:w="0" w:type="dxa"/>
+              <w:bottom w:w="0" w:type="dxa"/>
+              <w:right w:w="0" w:type="dxa"/>
+            </w:tcMar>
+            <w:vAlign w:val="center"/>
+          </w:tcPr>
+          <w:p>
+            <w:pPr>
+              <w:pBdr>
+                <w:top w:val="none" w:sz="0" w:space="0" w:color="000000"/>
+                <w:left w:val="none" w:sz="0" w:space="0" w:color="000000"/>
+                <w:bottom w:val="none" w:sz="0" w:space="0" w:color="000000"/>
+                <w:right w:val="none" w:sz="0" w:space="0" w:color="000000"/>
+              </w:pBdr>
+              <w:spacing w:before="100" w:after="100"/>
+              <w:ind w:left="100" w:right="100"/>
+              <w:jc w:val="center"/>
+              <w:rPr>
+                <w:rFonts w:ascii="Times New Roman" w:eastAsia="Times New Roman" w:hAnsi="Times New Roman" w:cs="Times New Roman"/>
+                <w:color w:val="000000"/>
+                <w:sz w:val="22"/>
+                <w:szCs w:val="22"/>
+              </w:rPr>
+            </w:pPr>
+            <w:r>
+              <w:rPr>
+                <w:rFonts w:ascii="Times New Roman" w:eastAsia="Times New Roman" w:hAnsi="Times New Roman" w:cs="Times New Roman"/>
+                <w:color w:val="000000"/>
+                <w:sz w:val="22"/>
+                <w:szCs w:val="22"/>
+              </w:rPr>
+              <w:t>1.00</w:t>
+            </w:r>
+          </w:p>
+        </w:tc>
+        <w:tc>
+          <w:tcPr>
+            <w:tcW w:w="1510" w:type="dxa"/>
+            <w:tcBorders>
+              <w:top w:val="none" w:sz="0" w:space="0" w:color="000000"/>
+              <w:left w:val="none" w:sz="0" w:space="0" w:color="000000"/>
+              <w:bottom w:val="none" w:sz="0" w:space="0" w:color="000000"/>
+              <w:right w:val="none" w:sz="0" w:space="0" w:color="000000"/>
+            </w:tcBorders>
+            <w:shd w:val="clear" w:color="auto" w:fill="FFFFFF"/>
+            <w:tcMar>
+              <w:top w:w="0" w:type="dxa"/>
+              <w:left w:w="0" w:type="dxa"/>
+              <w:bottom w:w="0" w:type="dxa"/>
+              <w:right w:w="0" w:type="dxa"/>
+            </w:tcMar>
+            <w:vAlign w:val="center"/>
+          </w:tcPr>
+          <w:p>
+            <w:pPr>
+              <w:pBdr>
+                <w:top w:val="none" w:sz="0" w:space="0" w:color="000000"/>
+                <w:left w:val="none" w:sz="0" w:space="0" w:color="000000"/>
+                <w:bottom w:val="none" w:sz="0" w:space="0" w:color="000000"/>
+                <w:right w:val="none" w:sz="0" w:space="0" w:color="000000"/>
+              </w:pBdr>
+              <w:spacing w:before="100" w:after="100"/>
+              <w:ind w:left="100" w:right="100"/>
+              <w:jc w:val="center"/>
+              <w:rPr>
+                <w:rFonts w:ascii="Times New Roman" w:eastAsia="Times New Roman" w:hAnsi="Times New Roman" w:cs="Times New Roman"/>
+                <w:color w:val="000000"/>
+                <w:sz w:val="22"/>
+                <w:szCs w:val="22"/>
+              </w:rPr>
+            </w:pPr>
+            <w:r>
+              <w:rPr>
+                <w:rFonts w:ascii="Times New Roman" w:eastAsia="Times New Roman" w:hAnsi="Times New Roman" w:cs="Times New Roman"/>
+                <w:color w:val="000000"/>
+                <w:sz w:val="22"/>
+                <w:szCs w:val="22"/>
+              </w:rPr>
+              <w:t>[-0.01, 0.01]</w:t>
+            </w:r>
+          </w:p>
+        </w:tc>
+        <w:tc>
+          <w:tcPr>
+            <w:tcW w:w="1437" w:type="dxa"/>
+            <w:tcBorders>
+              <w:top w:val="none" w:sz="0" w:space="0" w:color="000000"/>
+              <w:left w:val="none" w:sz="0" w:space="0" w:color="000000"/>
+              <w:bottom w:val="none" w:sz="0" w:space="0" w:color="000000"/>
+              <w:right w:val="none" w:sz="0" w:space="0" w:color="000000"/>
+            </w:tcBorders>
+            <w:shd w:val="clear" w:color="auto" w:fill="FFFFFF"/>
+            <w:tcMar>
+              <w:top w:w="0" w:type="dxa"/>
+              <w:left w:w="0" w:type="dxa"/>
+              <w:bottom w:w="0" w:type="dxa"/>
+              <w:right w:w="0" w:type="dxa"/>
+            </w:tcMar>
+            <w:vAlign w:val="center"/>
+          </w:tcPr>
+          <w:p>
+            <w:pPr>
+              <w:pBdr>
+                <w:top w:val="none" w:sz="0" w:space="0" w:color="000000"/>
+                <w:left w:val="none" w:sz="0" w:space="0" w:color="000000"/>
+                <w:bottom w:val="none" w:sz="0" w:space="0" w:color="000000"/>
+                <w:right w:val="none" w:sz="0" w:space="0" w:color="000000"/>
+              </w:pBdr>
+              <w:spacing w:before="100" w:after="100"/>
+              <w:ind w:left="100" w:right="100"/>
+              <w:jc w:val="center"/>
+              <w:rPr>
+                <w:rFonts w:ascii="Times New Roman" w:eastAsia="Times New Roman" w:hAnsi="Times New Roman" w:cs="Times New Roman"/>
+                <w:color w:val="000000"/>
+                <w:sz w:val="22"/>
+                <w:szCs w:val="22"/>
+              </w:rPr>
+            </w:pPr>
+            <w:r>
+              <w:rPr>
+                <w:rFonts w:ascii="Times New Roman" w:eastAsia="Times New Roman" w:hAnsi="Times New Roman" w:cs="Times New Roman"/>
+                <w:color w:val="000000"/>
+                <w:sz w:val="22"/>
+                <w:szCs w:val="22"/>
+              </w:rPr>
+              <w:t>0.00</w:t>
+            </w:r>
+          </w:p>
+        </w:tc>
+        <w:tc>
+          <w:tcPr>
+            <w:tcW w:w="826" w:type="dxa"/>
+            <w:tcBorders>
+              <w:top w:val="none" w:sz="0" w:space="0" w:color="000000"/>
+              <w:left w:val="none" w:sz="0" w:space="0" w:color="000000"/>
+              <w:bottom w:val="none" w:sz="0" w:space="0" w:color="000000"/>
+              <w:right w:val="none" w:sz="0" w:space="0" w:color="000000"/>
+            </w:tcBorders>
+            <w:shd w:val="clear" w:color="auto" w:fill="FFFFFF"/>
+            <w:tcMar>
+              <w:top w:w="0" w:type="dxa"/>
+              <w:left w:w="0" w:type="dxa"/>
+              <w:bottom w:w="0" w:type="dxa"/>
+              <w:right w:w="0" w:type="dxa"/>
+            </w:tcMar>
+            <w:vAlign w:val="center"/>
+          </w:tcPr>
+          <w:p>
+            <w:pPr>
+              <w:pBdr>
+                <w:top w:val="none" w:sz="0" w:space="0" w:color="000000"/>
+                <w:left w:val="none" w:sz="0" w:space="0" w:color="000000"/>
+                <w:bottom w:val="none" w:sz="0" w:space="0" w:color="000000"/>
+                <w:right w:val="none" w:sz="0" w:space="0" w:color="000000"/>
+              </w:pBdr>
+              <w:spacing w:before="100" w:after="100"/>
+              <w:ind w:left="100" w:right="100"/>
+              <w:jc w:val="center"/>
+              <w:rPr>
+                <w:rFonts w:ascii="Times New Roman" w:eastAsia="Times New Roman" w:hAnsi="Times New Roman" w:cs="Times New Roman"/>
+                <w:color w:val="000000"/>
+                <w:sz w:val="22"/>
+                <w:szCs w:val="22"/>
+              </w:rPr>
+            </w:pPr>
+            <w:r>
+              <w:rPr>
+                <w:rFonts w:ascii="Times New Roman" w:eastAsia="Times New Roman" w:hAnsi="Times New Roman" w:cs="Times New Roman"/>
+                <w:color w:val="000000"/>
+                <w:sz w:val="22"/>
+                <w:szCs w:val="22"/>
+              </w:rPr>
+              <w:t>1</w:t>
+            </w:r>
+          </w:p>
+        </w:tc>
+        <w:tc>
+          <w:tcPr>
+            <w:tcW w:w="1181" w:type="dxa"/>
+            <w:tcBorders>
+              <w:top w:val="none" w:sz="0" w:space="0" w:color="000000"/>
+              <w:left w:val="none" w:sz="0" w:space="0" w:color="000000"/>
+              <w:bottom w:val="none" w:sz="0" w:space="0" w:color="000000"/>
+              <w:right w:val="none" w:sz="0" w:space="0" w:color="000000"/>
+            </w:tcBorders>
+            <w:shd w:val="clear" w:color="auto" w:fill="FFFFFF"/>
+            <w:tcMar>
+              <w:top w:w="0" w:type="dxa"/>
+              <w:left w:w="0" w:type="dxa"/>
+              <w:bottom w:w="0" w:type="dxa"/>
+              <w:right w:w="0" w:type="dxa"/>
+            </w:tcMar>
+            <w:vAlign w:val="center"/>
+          </w:tcPr>
+          <w:p>
+            <w:pPr>
+              <w:pBdr>
+                <w:top w:val="none" w:sz="0" w:space="0" w:color="000000"/>
+                <w:left w:val="none" w:sz="0" w:space="0" w:color="000000"/>
+                <w:bottom w:val="none" w:sz="0" w:space="0" w:color="000000"/>
+                <w:right w:val="none" w:sz="0" w:space="0" w:color="000000"/>
+              </w:pBdr>
+              <w:spacing w:before="100" w:after="100"/>
+              <w:ind w:left="100" w:right="100"/>
+              <w:jc w:val="center"/>
+              <w:rPr>
+                <w:rFonts w:ascii="Times New Roman" w:eastAsia="Times New Roman" w:hAnsi="Times New Roman" w:cs="Times New Roman"/>
+                <w:color w:val="000000"/>
+                <w:sz w:val="22"/>
+                <w:szCs w:val="22"/>
+              </w:rPr>
+            </w:pPr>
+            <w:r>
+              <w:rPr>
+                <w:rFonts w:ascii="Times New Roman" w:eastAsia="Times New Roman" w:hAnsi="Times New Roman" w:cs="Times New Roman"/>
+                <w:color w:val="000000"/>
+                <w:sz w:val="22"/>
+                <w:szCs w:val="22"/>
+              </w:rPr>
+              <w:t>4,868.24</w:t>
+            </w:r>
+          </w:p>
+        </w:tc>
+      </w:tr>
+      <w:tr>
+        <w:trPr>
+          <w:jc w:val="center"/>
+        </w:trPr>
+        <w:tc>
+          <w:tcPr>
+            <w:tcW w:w="2720" w:type="dxa"/>
+            <w:tcBorders>
+              <w:top w:val="none" w:sz="0" w:space="0" w:color="000000"/>
+              <w:left w:val="none" w:sz="0" w:space="0" w:color="000000"/>
+              <w:bottom w:val="none" w:sz="0" w:space="0" w:color="000000"/>
+              <w:right w:val="none" w:sz="0" w:space="0" w:color="000000"/>
+            </w:tcBorders>
+            <w:shd w:val="clear" w:color="auto" w:fill="FFFFFF"/>
+            <w:tcMar>
+              <w:top w:w="0" w:type="dxa"/>
+              <w:left w:w="0" w:type="dxa"/>
+              <w:bottom w:w="0" w:type="dxa"/>
+              <w:right w:w="0" w:type="dxa"/>
+            </w:tcMar>
+            <w:vAlign w:val="center"/>
+          </w:tcPr>
+          <w:p>
+            <w:pPr>
+              <w:pBdr>
+                <w:top w:val="none" w:sz="0" w:space="0" w:color="000000"/>
+                <w:left w:val="none" w:sz="0" w:space="0" w:color="000000"/>
+                <w:bottom w:val="none" w:sz="0" w:space="0" w:color="000000"/>
+                <w:right w:val="none" w:sz="0" w:space="0" w:color="000000"/>
+              </w:pBdr>
+              <w:spacing w:before="100" w:after="100"/>
+              <w:ind w:left="100" w:right="100"/>
+              <w:rPr>
+                <w:rFonts w:ascii="Times New Roman" w:eastAsia="Times New Roman" w:hAnsi="Times New Roman" w:cs="Times New Roman"/>
+                <w:color w:val="000000"/>
+                <w:sz w:val="22"/>
+                <w:szCs w:val="22"/>
+              </w:rPr>
+            </w:pPr>
+            <w:r>
+              <w:rPr>
+                <w:rFonts w:ascii="Times New Roman" w:eastAsia="Times New Roman" w:hAnsi="Times New Roman" w:cs="Times New Roman"/>
+                <w:color w:val="000000"/>
+                <w:sz w:val="22"/>
+                <w:szCs w:val="22"/>
+              </w:rPr>
+              <w:t>b_typethree_way_cognate</w:t>
+            </w:r>
+          </w:p>
+        </w:tc>
+        <w:tc>
+          <w:tcPr>
+            <w:tcW w:w="1083" w:type="dxa"/>
+            <w:tcBorders>
+              <w:top w:val="none" w:sz="0" w:space="0" w:color="000000"/>
+              <w:left w:val="none" w:sz="0" w:space="0" w:color="000000"/>
+              <w:bottom w:val="none" w:sz="0" w:space="0" w:color="000000"/>
+              <w:right w:val="none" w:sz="0" w:space="0" w:color="000000"/>
+            </w:tcBorders>
+            <w:shd w:val="clear" w:color="auto" w:fill="FFFFFF"/>
+            <w:tcMar>
+              <w:top w:w="0" w:type="dxa"/>
+              <w:left w:w="0" w:type="dxa"/>
+              <w:bottom w:w="0" w:type="dxa"/>
+              <w:right w:w="0" w:type="dxa"/>
+            </w:tcMar>
+            <w:vAlign w:val="center"/>
+          </w:tcPr>
+          <w:p>
+            <w:pPr>
+              <w:pBdr>
+                <w:top w:val="none" w:sz="0" w:space="0" w:color="000000"/>
+                <w:left w:val="none" w:sz="0" w:space="0" w:color="000000"/>
+                <w:bottom w:val="none" w:sz="0" w:space="0" w:color="000000"/>
+                <w:right w:val="none" w:sz="0" w:space="0" w:color="000000"/>
+              </w:pBdr>
+              <w:spacing w:before="100" w:after="100"/>
+              <w:ind w:left="100" w:right="100"/>
+              <w:jc w:val="center"/>
+              <w:rPr>
+                <w:rFonts w:ascii="Times New Roman" w:eastAsia="Times New Roman" w:hAnsi="Times New Roman" w:cs="Times New Roman"/>
+                <w:color w:val="000000"/>
+                <w:sz w:val="22"/>
+                <w:szCs w:val="22"/>
+              </w:rPr>
+            </w:pPr>
+            <w:r>
+              <w:rPr>
+                <w:rFonts w:ascii="Times New Roman" w:eastAsia="Times New Roman" w:hAnsi="Times New Roman" w:cs="Times New Roman"/>
+                <w:color w:val="000000"/>
+                <w:sz w:val="22"/>
+                <w:szCs w:val="22"/>
+              </w:rPr>
+              <w:t>-0.02</w:t>
+            </w:r>
+          </w:p>
+        </w:tc>
+        <w:tc>
+          <w:tcPr>
+            <w:tcW w:w="1584" w:type="dxa"/>
+            <w:tcBorders>
+              <w:top w:val="none" w:sz="0" w:space="0" w:color="000000"/>
+              <w:left w:val="none" w:sz="0" w:space="0" w:color="000000"/>
+              <w:bottom w:val="none" w:sz="0" w:space="0" w:color="000000"/>
+              <w:right w:val="none" w:sz="0" w:space="0" w:color="000000"/>
+            </w:tcBorders>
+            <w:shd w:val="clear" w:color="auto" w:fill="FFFFFF"/>
+            <w:tcMar>
+              <w:top w:w="0" w:type="dxa"/>
+              <w:left w:w="0" w:type="dxa"/>
+              <w:bottom w:w="0" w:type="dxa"/>
+              <w:right w:w="0" w:type="dxa"/>
+            </w:tcMar>
+            <w:vAlign w:val="center"/>
+          </w:tcPr>
+          <w:p>
+            <w:pPr>
+              <w:pBdr>
+                <w:top w:val="none" w:sz="0" w:space="0" w:color="000000"/>
+                <w:left w:val="none" w:sz="0" w:space="0" w:color="000000"/>
+                <w:bottom w:val="none" w:sz="0" w:space="0" w:color="000000"/>
+                <w:right w:val="none" w:sz="0" w:space="0" w:color="000000"/>
+              </w:pBdr>
+              <w:spacing w:before="100" w:after="100"/>
+              <w:ind w:left="100" w:right="100"/>
+              <w:jc w:val="center"/>
+              <w:rPr>
+                <w:rFonts w:ascii="Times New Roman" w:eastAsia="Times New Roman" w:hAnsi="Times New Roman" w:cs="Times New Roman"/>
+                <w:color w:val="000000"/>
+                <w:sz w:val="22"/>
+                <w:szCs w:val="22"/>
+              </w:rPr>
+            </w:pPr>
+            <w:r>
+              <w:rPr>
+                <w:rFonts w:ascii="Times New Roman" w:eastAsia="Times New Roman" w:hAnsi="Times New Roman" w:cs="Times New Roman"/>
+                <w:color w:val="000000"/>
+                <w:sz w:val="22"/>
+                <w:szCs w:val="22"/>
+              </w:rPr>
+              <w:t>[-0.07, 0.02]</w:t>
+            </w:r>
+          </w:p>
+        </w:tc>
+        <w:tc>
+          <w:tcPr>
+            <w:tcW w:w="796" w:type="dxa"/>
+            <w:tcBorders>
+              <w:top w:val="none" w:sz="0" w:space="0" w:color="000000"/>
+              <w:left w:val="none" w:sz="0" w:space="0" w:color="000000"/>
+              <w:bottom w:val="none" w:sz="0" w:space="0" w:color="000000"/>
+              <w:right w:val="none" w:sz="0" w:space="0" w:color="000000"/>
+            </w:tcBorders>
+            <w:shd w:val="clear" w:color="auto" w:fill="FFFFFF"/>
+            <w:tcMar>
+              <w:top w:w="0" w:type="dxa"/>
+              <w:left w:w="0" w:type="dxa"/>
+              <w:bottom w:w="0" w:type="dxa"/>
+              <w:right w:w="0" w:type="dxa"/>
+            </w:tcMar>
+            <w:vAlign w:val="center"/>
+          </w:tcPr>
+          <w:p>
+            <w:pPr>
+              <w:pBdr>
+                <w:top w:val="none" w:sz="0" w:space="0" w:color="000000"/>
+                <w:left w:val="none" w:sz="0" w:space="0" w:color="000000"/>
+                <w:bottom w:val="none" w:sz="0" w:space="0" w:color="000000"/>
+                <w:right w:val="none" w:sz="0" w:space="0" w:color="000000"/>
+              </w:pBdr>
+              <w:spacing w:before="100" w:after="100"/>
+              <w:ind w:left="100" w:right="100"/>
+              <w:jc w:val="center"/>
+              <w:rPr>
+                <w:rFonts w:ascii="Times New Roman" w:eastAsia="Times New Roman" w:hAnsi="Times New Roman" w:cs="Times New Roman"/>
+                <w:color w:val="000000"/>
+                <w:sz w:val="22"/>
+                <w:szCs w:val="22"/>
+              </w:rPr>
+            </w:pPr>
+            <w:r>
+              <w:rPr>
+                <w:rFonts w:ascii="Times New Roman" w:eastAsia="Times New Roman" w:hAnsi="Times New Roman" w:cs="Times New Roman"/>
+                <w:color w:val="000000"/>
+                <w:sz w:val="22"/>
+                <w:szCs w:val="22"/>
+              </w:rPr>
+              <w:t>0.83</w:t>
+            </w:r>
+          </w:p>
+        </w:tc>
+        <w:tc>
+          <w:tcPr>
+            <w:tcW w:w="1510" w:type="dxa"/>
+            <w:tcBorders>
+              <w:top w:val="none" w:sz="0" w:space="0" w:color="000000"/>
+              <w:left w:val="none" w:sz="0" w:space="0" w:color="000000"/>
+              <w:bottom w:val="none" w:sz="0" w:space="0" w:color="000000"/>
+              <w:right w:val="none" w:sz="0" w:space="0" w:color="000000"/>
+            </w:tcBorders>
+            <w:shd w:val="clear" w:color="auto" w:fill="FFFFFF"/>
+            <w:tcMar>
+              <w:top w:w="0" w:type="dxa"/>
+              <w:left w:w="0" w:type="dxa"/>
+              <w:bottom w:w="0" w:type="dxa"/>
+              <w:right w:w="0" w:type="dxa"/>
+            </w:tcMar>
+            <w:vAlign w:val="center"/>
+          </w:tcPr>
+          <w:p>
+            <w:pPr>
+              <w:pBdr>
+                <w:top w:val="none" w:sz="0" w:space="0" w:color="000000"/>
+                <w:left w:val="none" w:sz="0" w:space="0" w:color="000000"/>
+                <w:bottom w:val="none" w:sz="0" w:space="0" w:color="000000"/>
+                <w:right w:val="none" w:sz="0" w:space="0" w:color="000000"/>
+              </w:pBdr>
+              <w:spacing w:before="100" w:after="100"/>
+              <w:ind w:left="100" w:right="100"/>
+              <w:jc w:val="center"/>
+              <w:rPr>
+                <w:rFonts w:ascii="Times New Roman" w:eastAsia="Times New Roman" w:hAnsi="Times New Roman" w:cs="Times New Roman"/>
+                <w:color w:val="000000"/>
+                <w:sz w:val="22"/>
+                <w:szCs w:val="22"/>
+              </w:rPr>
+            </w:pPr>
+            <w:r>
+              <w:rPr>
+                <w:rFonts w:ascii="Times New Roman" w:eastAsia="Times New Roman" w:hAnsi="Times New Roman" w:cs="Times New Roman"/>
+                <w:color w:val="000000"/>
+                <w:sz w:val="22"/>
+                <w:szCs w:val="22"/>
+              </w:rPr>
+              <w:t>[-0.01, 0.01]</w:t>
+            </w:r>
+          </w:p>
+        </w:tc>
+        <w:tc>
+          <w:tcPr>
+            <w:tcW w:w="1437" w:type="dxa"/>
+            <w:tcBorders>
+              <w:top w:val="none" w:sz="0" w:space="0" w:color="000000"/>
+              <w:left w:val="none" w:sz="0" w:space="0" w:color="000000"/>
+              <w:bottom w:val="none" w:sz="0" w:space="0" w:color="000000"/>
+              <w:right w:val="none" w:sz="0" w:space="0" w:color="000000"/>
+            </w:tcBorders>
+            <w:shd w:val="clear" w:color="auto" w:fill="FFFFFF"/>
+            <w:tcMar>
+              <w:top w:w="0" w:type="dxa"/>
+              <w:left w:w="0" w:type="dxa"/>
+              <w:bottom w:w="0" w:type="dxa"/>
+              <w:right w:w="0" w:type="dxa"/>
+            </w:tcMar>
+            <w:vAlign w:val="center"/>
+          </w:tcPr>
+          <w:p>
+            <w:pPr>
+              <w:pBdr>
+                <w:top w:val="none" w:sz="0" w:space="0" w:color="000000"/>
+                <w:left w:val="none" w:sz="0" w:space="0" w:color="000000"/>
+                <w:bottom w:val="none" w:sz="0" w:space="0" w:color="000000"/>
+                <w:right w:val="none" w:sz="0" w:space="0" w:color="000000"/>
+              </w:pBdr>
+              <w:spacing w:before="100" w:after="100"/>
+              <w:ind w:left="100" w:right="100"/>
+              <w:jc w:val="center"/>
+              <w:rPr>
+                <w:rFonts w:ascii="Times New Roman" w:eastAsia="Times New Roman" w:hAnsi="Times New Roman" w:cs="Times New Roman"/>
+                <w:color w:val="000000"/>
+                <w:sz w:val="22"/>
+                <w:szCs w:val="22"/>
+              </w:rPr>
+            </w:pPr>
+            <w:r>
+              <w:rPr>
+                <w:rFonts w:ascii="Times New Roman" w:eastAsia="Times New Roman" w:hAnsi="Times New Roman" w:cs="Times New Roman"/>
+                <w:color w:val="000000"/>
+                <w:sz w:val="22"/>
+                <w:szCs w:val="22"/>
+              </w:rPr>
+              <w:t>0.16</w:t>
+            </w:r>
+          </w:p>
+        </w:tc>
+        <w:tc>
+          <w:tcPr>
+            <w:tcW w:w="826" w:type="dxa"/>
+            <w:tcBorders>
+              <w:top w:val="none" w:sz="0" w:space="0" w:color="000000"/>
+              <w:left w:val="none" w:sz="0" w:space="0" w:color="000000"/>
+              <w:bottom w:val="none" w:sz="0" w:space="0" w:color="000000"/>
+              <w:right w:val="none" w:sz="0" w:space="0" w:color="000000"/>
+            </w:tcBorders>
+            <w:shd w:val="clear" w:color="auto" w:fill="FFFFFF"/>
+            <w:tcMar>
+              <w:top w:w="0" w:type="dxa"/>
+              <w:left w:w="0" w:type="dxa"/>
+              <w:bottom w:w="0" w:type="dxa"/>
+              <w:right w:w="0" w:type="dxa"/>
+            </w:tcMar>
+            <w:vAlign w:val="center"/>
+          </w:tcPr>
+          <w:p>
+            <w:pPr>
+              <w:pBdr>
+                <w:top w:val="none" w:sz="0" w:space="0" w:color="000000"/>
+                <w:left w:val="none" w:sz="0" w:space="0" w:color="000000"/>
+                <w:bottom w:val="none" w:sz="0" w:space="0" w:color="000000"/>
+                <w:right w:val="none" w:sz="0" w:space="0" w:color="000000"/>
+              </w:pBdr>
+              <w:spacing w:before="100" w:after="100"/>
+              <w:ind w:left="100" w:right="100"/>
+              <w:jc w:val="center"/>
+              <w:rPr>
+                <w:rFonts w:ascii="Times New Roman" w:eastAsia="Times New Roman" w:hAnsi="Times New Roman" w:cs="Times New Roman"/>
+                <w:color w:val="000000"/>
+                <w:sz w:val="22"/>
+                <w:szCs w:val="22"/>
+              </w:rPr>
+            </w:pPr>
+            <w:r>
+              <w:rPr>
+                <w:rFonts w:ascii="Times New Roman" w:eastAsia="Times New Roman" w:hAnsi="Times New Roman" w:cs="Times New Roman"/>
+                <w:color w:val="000000"/>
+                <w:sz w:val="22"/>
+                <w:szCs w:val="22"/>
+              </w:rPr>
+              <w:t>1</w:t>
+            </w:r>
+          </w:p>
+        </w:tc>
+        <w:tc>
+          <w:tcPr>
+            <w:tcW w:w="1181" w:type="dxa"/>
+            <w:tcBorders>
+              <w:top w:val="none" w:sz="0" w:space="0" w:color="000000"/>
+              <w:left w:val="none" w:sz="0" w:space="0" w:color="000000"/>
+              <w:bottom w:val="none" w:sz="0" w:space="0" w:color="000000"/>
+              <w:right w:val="none" w:sz="0" w:space="0" w:color="000000"/>
+            </w:tcBorders>
+            <w:shd w:val="clear" w:color="auto" w:fill="FFFFFF"/>
+            <w:tcMar>
+              <w:top w:w="0" w:type="dxa"/>
+              <w:left w:w="0" w:type="dxa"/>
+              <w:bottom w:w="0" w:type="dxa"/>
+              <w:right w:w="0" w:type="dxa"/>
+            </w:tcMar>
+            <w:vAlign w:val="center"/>
+          </w:tcPr>
+          <w:p>
+            <w:pPr>
+              <w:pBdr>
+                <w:top w:val="none" w:sz="0" w:space="0" w:color="000000"/>
+                <w:left w:val="none" w:sz="0" w:space="0" w:color="000000"/>
+                <w:bottom w:val="none" w:sz="0" w:space="0" w:color="000000"/>
+                <w:right w:val="none" w:sz="0" w:space="0" w:color="000000"/>
+              </w:pBdr>
+              <w:spacing w:before="100" w:after="100"/>
+              <w:ind w:left="100" w:right="100"/>
+              <w:jc w:val="center"/>
+              <w:rPr>
+                <w:rFonts w:ascii="Times New Roman" w:eastAsia="Times New Roman" w:hAnsi="Times New Roman" w:cs="Times New Roman"/>
+                <w:color w:val="000000"/>
+                <w:sz w:val="22"/>
+                <w:szCs w:val="22"/>
+              </w:rPr>
+            </w:pPr>
+            <w:r>
+              <w:rPr>
+                <w:rFonts w:ascii="Times New Roman" w:eastAsia="Times New Roman" w:hAnsi="Times New Roman" w:cs="Times New Roman"/>
+                <w:color w:val="000000"/>
+                <w:sz w:val="22"/>
+                <w:szCs w:val="22"/>
+              </w:rPr>
+              <w:t>4,197.74</w:t>
+            </w:r>
+          </w:p>
+        </w:tc>
+      </w:tr>
+      <w:tr>
+        <w:trPr>
+          <w:jc w:val="center"/>
+        </w:trPr>
+        <w:tc>
+          <w:tcPr>
+            <w:tcW w:w="2720" w:type="dxa"/>
+            <w:tcBorders>
+              <w:top w:val="none" w:sz="0" w:space="0" w:color="000000"/>
+              <w:left w:val="none" w:sz="0" w:space="0" w:color="000000"/>
+              <w:bottom w:val="none" w:sz="0" w:space="0" w:color="000000"/>
+              <w:right w:val="none" w:sz="0" w:space="0" w:color="000000"/>
+            </w:tcBorders>
+            <w:shd w:val="clear" w:color="auto" w:fill="FFFFFF"/>
+            <w:tcMar>
+              <w:top w:w="0" w:type="dxa"/>
+              <w:left w:w="0" w:type="dxa"/>
+              <w:bottom w:w="0" w:type="dxa"/>
+              <w:right w:w="0" w:type="dxa"/>
+            </w:tcMar>
+            <w:vAlign w:val="center"/>
+          </w:tcPr>
+          <w:p>
+            <w:pPr>
+              <w:pBdr>
+                <w:top w:val="none" w:sz="0" w:space="0" w:color="000000"/>
+                <w:left w:val="none" w:sz="0" w:space="0" w:color="000000"/>
+                <w:bottom w:val="none" w:sz="0" w:space="0" w:color="000000"/>
+                <w:right w:val="none" w:sz="0" w:space="0" w:color="000000"/>
+              </w:pBdr>
+              <w:spacing w:before="100" w:after="100"/>
+              <w:ind w:left="100" w:right="100"/>
+              <w:rPr>
+                <w:rFonts w:ascii="Times New Roman" w:eastAsia="Times New Roman" w:hAnsi="Times New Roman" w:cs="Times New Roman"/>
+                <w:color w:val="000000"/>
+                <w:sz w:val="22"/>
+                <w:szCs w:val="22"/>
+              </w:rPr>
+            </w:pPr>
+            <w:r>
+              <w:rPr>
+                <w:rFonts w:ascii="Times New Roman" w:eastAsia="Times New Roman" w:hAnsi="Times New Roman" w:cs="Times New Roman"/>
+                <w:color w:val="000000"/>
+                <w:sz w:val="22"/>
+                <w:szCs w:val="22"/>
+              </w:rPr>
+              <w:t>b_frequency_z</w:t>
+            </w:r>
+          </w:p>
+        </w:tc>
+        <w:tc>
+          <w:tcPr>
+            <w:tcW w:w="1083" w:type="dxa"/>
+            <w:tcBorders>
+              <w:top w:val="none" w:sz="0" w:space="0" w:color="000000"/>
+              <w:left w:val="none" w:sz="0" w:space="0" w:color="000000"/>
+              <w:bottom w:val="none" w:sz="0" w:space="0" w:color="000000"/>
+              <w:right w:val="none" w:sz="0" w:space="0" w:color="000000"/>
+            </w:tcBorders>
+            <w:shd w:val="clear" w:color="auto" w:fill="FFFFFF"/>
+            <w:tcMar>
+              <w:top w:w="0" w:type="dxa"/>
+              <w:left w:w="0" w:type="dxa"/>
+              <w:bottom w:w="0" w:type="dxa"/>
+              <w:right w:w="0" w:type="dxa"/>
+            </w:tcMar>
+            <w:vAlign w:val="center"/>
+          </w:tcPr>
+          <w:p>
+            <w:pPr>
+              <w:pBdr>
+                <w:top w:val="none" w:sz="0" w:space="0" w:color="000000"/>
+                <w:left w:val="none" w:sz="0" w:space="0" w:color="000000"/>
+                <w:bottom w:val="none" w:sz="0" w:space="0" w:color="000000"/>
+                <w:right w:val="none" w:sz="0" w:space="0" w:color="000000"/>
+              </w:pBdr>
+              <w:spacing w:before="100" w:after="100"/>
+              <w:ind w:left="100" w:right="100"/>
+              <w:jc w:val="center"/>
+              <w:rPr>
+                <w:rFonts w:ascii="Times New Roman" w:eastAsia="Times New Roman" w:hAnsi="Times New Roman" w:cs="Times New Roman"/>
+                <w:color w:val="000000"/>
+                <w:sz w:val="22"/>
+                <w:szCs w:val="22"/>
+              </w:rPr>
+            </w:pPr>
+            <w:r>
+              <w:rPr>
+                <w:rFonts w:ascii="Times New Roman" w:eastAsia="Times New Roman" w:hAnsi="Times New Roman" w:cs="Times New Roman"/>
+                <w:color w:val="000000"/>
+                <w:sz w:val="22"/>
+                <w:szCs w:val="22"/>
+              </w:rPr>
+              <w:t>-0.07</w:t>
+            </w:r>
+          </w:p>
+        </w:tc>
+        <w:tc>
+          <w:tcPr>
+            <w:tcW w:w="1584" w:type="dxa"/>
+            <w:tcBorders>
+              <w:top w:val="none" w:sz="0" w:space="0" w:color="000000"/>
+              <w:left w:val="none" w:sz="0" w:space="0" w:color="000000"/>
+              <w:bottom w:val="none" w:sz="0" w:space="0" w:color="000000"/>
+              <w:right w:val="none" w:sz="0" w:space="0" w:color="000000"/>
+            </w:tcBorders>
+            <w:shd w:val="clear" w:color="auto" w:fill="FFFFFF"/>
+            <w:tcMar>
+              <w:top w:w="0" w:type="dxa"/>
+              <w:left w:w="0" w:type="dxa"/>
+              <w:bottom w:w="0" w:type="dxa"/>
+              <w:right w:w="0" w:type="dxa"/>
+            </w:tcMar>
+            <w:vAlign w:val="center"/>
+          </w:tcPr>
+          <w:p>
+            <w:pPr>
+              <w:pBdr>
+                <w:top w:val="none" w:sz="0" w:space="0" w:color="000000"/>
+                <w:left w:val="none" w:sz="0" w:space="0" w:color="000000"/>
+                <w:bottom w:val="none" w:sz="0" w:space="0" w:color="000000"/>
+                <w:right w:val="none" w:sz="0" w:space="0" w:color="000000"/>
+              </w:pBdr>
+              <w:spacing w:before="100" w:after="100"/>
+              <w:ind w:left="100" w:right="100"/>
+              <w:jc w:val="center"/>
+              <w:rPr>
+                <w:rFonts w:ascii="Times New Roman" w:eastAsia="Times New Roman" w:hAnsi="Times New Roman" w:cs="Times New Roman"/>
+                <w:color w:val="000000"/>
+                <w:sz w:val="22"/>
+                <w:szCs w:val="22"/>
+              </w:rPr>
+            </w:pPr>
+            <w:r>
+              <w:rPr>
+                <w:rFonts w:ascii="Times New Roman" w:eastAsia="Times New Roman" w:hAnsi="Times New Roman" w:cs="Times New Roman"/>
+                <w:color w:val="000000"/>
+                <w:sz w:val="22"/>
+                <w:szCs w:val="22"/>
+              </w:rPr>
+              <w:t>[-0.08, -0.05]</w:t>
+            </w:r>
+          </w:p>
+        </w:tc>
+        <w:tc>
+          <w:tcPr>
+            <w:tcW w:w="796" w:type="dxa"/>
+            <w:tcBorders>
+              <w:top w:val="none" w:sz="0" w:space="0" w:color="000000"/>
+              <w:left w:val="none" w:sz="0" w:space="0" w:color="000000"/>
+              <w:bottom w:val="none" w:sz="0" w:space="0" w:color="000000"/>
+              <w:right w:val="none" w:sz="0" w:space="0" w:color="000000"/>
+            </w:tcBorders>
+            <w:shd w:val="clear" w:color="auto" w:fill="FFFFFF"/>
+            <w:tcMar>
+              <w:top w:w="0" w:type="dxa"/>
+              <w:left w:w="0" w:type="dxa"/>
+              <w:bottom w:w="0" w:type="dxa"/>
+              <w:right w:w="0" w:type="dxa"/>
+            </w:tcMar>
+            <w:vAlign w:val="center"/>
+          </w:tcPr>
+          <w:p>
+            <w:pPr>
+              <w:pBdr>
+                <w:top w:val="none" w:sz="0" w:space="0" w:color="000000"/>
+                <w:left w:val="none" w:sz="0" w:space="0" w:color="000000"/>
+                <w:bottom w:val="none" w:sz="0" w:space="0" w:color="000000"/>
+                <w:right w:val="none" w:sz="0" w:space="0" w:color="000000"/>
+              </w:pBdr>
+              <w:spacing w:before="100" w:after="100"/>
+              <w:ind w:left="100" w:right="100"/>
+              <w:jc w:val="center"/>
+              <w:rPr>
+                <w:rFonts w:ascii="Times New Roman" w:eastAsia="Times New Roman" w:hAnsi="Times New Roman" w:cs="Times New Roman"/>
+                <w:color w:val="000000"/>
+                <w:sz w:val="22"/>
+                <w:szCs w:val="22"/>
+              </w:rPr>
+            </w:pPr>
+            <w:r>
+              <w:rPr>
+                <w:rFonts w:ascii="Times New Roman" w:eastAsia="Times New Roman" w:hAnsi="Times New Roman" w:cs="Times New Roman"/>
+                <w:color w:val="000000"/>
+                <w:sz w:val="22"/>
+                <w:szCs w:val="22"/>
+              </w:rPr>
+              <w:t>1.00</w:t>
+            </w:r>
+          </w:p>
+        </w:tc>
+        <w:tc>
+          <w:tcPr>
+            <w:tcW w:w="1510" w:type="dxa"/>
+            <w:tcBorders>
+              <w:top w:val="none" w:sz="0" w:space="0" w:color="000000"/>
+              <w:left w:val="none" w:sz="0" w:space="0" w:color="000000"/>
+              <w:bottom w:val="none" w:sz="0" w:space="0" w:color="000000"/>
+              <w:right w:val="none" w:sz="0" w:space="0" w:color="000000"/>
+            </w:tcBorders>
+            <w:shd w:val="clear" w:color="auto" w:fill="FFFFFF"/>
+            <w:tcMar>
+              <w:top w:w="0" w:type="dxa"/>
+              <w:left w:w="0" w:type="dxa"/>
+              <w:bottom w:w="0" w:type="dxa"/>
+              <w:right w:w="0" w:type="dxa"/>
+            </w:tcMar>
+            <w:vAlign w:val="center"/>
+          </w:tcPr>
+          <w:p>
+            <w:pPr>
+              <w:pBdr>
+                <w:top w:val="none" w:sz="0" w:space="0" w:color="000000"/>
+                <w:left w:val="none" w:sz="0" w:space="0" w:color="000000"/>
+                <w:bottom w:val="none" w:sz="0" w:space="0" w:color="000000"/>
+                <w:right w:val="none" w:sz="0" w:space="0" w:color="000000"/>
+              </w:pBdr>
+              <w:spacing w:before="100" w:after="100"/>
+              <w:ind w:left="100" w:right="100"/>
+              <w:jc w:val="center"/>
+              <w:rPr>
+                <w:rFonts w:ascii="Times New Roman" w:eastAsia="Times New Roman" w:hAnsi="Times New Roman" w:cs="Times New Roman"/>
+                <w:color w:val="000000"/>
+                <w:sz w:val="22"/>
+                <w:szCs w:val="22"/>
+              </w:rPr>
+            </w:pPr>
+            <w:r>
+              <w:rPr>
+                <w:rFonts w:ascii="Times New Roman" w:eastAsia="Times New Roman" w:hAnsi="Times New Roman" w:cs="Times New Roman"/>
+                <w:color w:val="000000"/>
+                <w:sz w:val="22"/>
+                <w:szCs w:val="22"/>
+              </w:rPr>
+              <w:t>[-0.01, 0.01]</w:t>
+            </w:r>
+          </w:p>
+        </w:tc>
+        <w:tc>
+          <w:tcPr>
+            <w:tcW w:w="1437" w:type="dxa"/>
+            <w:tcBorders>
+              <w:top w:val="none" w:sz="0" w:space="0" w:color="000000"/>
+              <w:left w:val="none" w:sz="0" w:space="0" w:color="000000"/>
+              <w:bottom w:val="none" w:sz="0" w:space="0" w:color="000000"/>
+              <w:right w:val="none" w:sz="0" w:space="0" w:color="000000"/>
+            </w:tcBorders>
+            <w:shd w:val="clear" w:color="auto" w:fill="FFFFFF"/>
+            <w:tcMar>
+              <w:top w:w="0" w:type="dxa"/>
+              <w:left w:w="0" w:type="dxa"/>
+              <w:bottom w:w="0" w:type="dxa"/>
+              <w:right w:w="0" w:type="dxa"/>
+            </w:tcMar>
+            <w:vAlign w:val="center"/>
+          </w:tcPr>
+          <w:p>
+            <w:pPr>
+              <w:pBdr>
+                <w:top w:val="none" w:sz="0" w:space="0" w:color="000000"/>
+                <w:left w:val="none" w:sz="0" w:space="0" w:color="000000"/>
+                <w:bottom w:val="none" w:sz="0" w:space="0" w:color="000000"/>
+                <w:right w:val="none" w:sz="0" w:space="0" w:color="000000"/>
+              </w:pBdr>
+              <w:spacing w:before="100" w:after="100"/>
+              <w:ind w:left="100" w:right="100"/>
+              <w:jc w:val="center"/>
+              <w:rPr>
+                <w:rFonts w:ascii="Times New Roman" w:eastAsia="Times New Roman" w:hAnsi="Times New Roman" w:cs="Times New Roman"/>
+                <w:color w:val="000000"/>
+                <w:sz w:val="22"/>
+                <w:szCs w:val="22"/>
+              </w:rPr>
+            </w:pPr>
+            <w:r>
+              <w:rPr>
+                <w:rFonts w:ascii="Times New Roman" w:eastAsia="Times New Roman" w:hAnsi="Times New Roman" w:cs="Times New Roman"/>
+                <w:color w:val="000000"/>
+                <w:sz w:val="22"/>
+                <w:szCs w:val="22"/>
+              </w:rPr>
+              <w:t>0.00</w:t>
+            </w:r>
+          </w:p>
+        </w:tc>
+        <w:tc>
+          <w:tcPr>
+            <w:tcW w:w="826" w:type="dxa"/>
+            <w:tcBorders>
+              <w:top w:val="none" w:sz="0" w:space="0" w:color="000000"/>
+              <w:left w:val="none" w:sz="0" w:space="0" w:color="000000"/>
+              <w:bottom w:val="none" w:sz="0" w:space="0" w:color="000000"/>
+              <w:right w:val="none" w:sz="0" w:space="0" w:color="000000"/>
+            </w:tcBorders>
+            <w:shd w:val="clear" w:color="auto" w:fill="FFFFFF"/>
+            <w:tcMar>
+              <w:top w:w="0" w:type="dxa"/>
+              <w:left w:w="0" w:type="dxa"/>
+              <w:bottom w:w="0" w:type="dxa"/>
+              <w:right w:w="0" w:type="dxa"/>
+            </w:tcMar>
+            <w:vAlign w:val="center"/>
+          </w:tcPr>
+          <w:p>
+            <w:pPr>
+              <w:pBdr>
+                <w:top w:val="none" w:sz="0" w:space="0" w:color="000000"/>
+                <w:left w:val="none" w:sz="0" w:space="0" w:color="000000"/>
+                <w:bottom w:val="none" w:sz="0" w:space="0" w:color="000000"/>
+                <w:right w:val="none" w:sz="0" w:space="0" w:color="000000"/>
+              </w:pBdr>
+              <w:spacing w:before="100" w:after="100"/>
+              <w:ind w:left="100" w:right="100"/>
+              <w:jc w:val="center"/>
+              <w:rPr>
+                <w:rFonts w:ascii="Times New Roman" w:eastAsia="Times New Roman" w:hAnsi="Times New Roman" w:cs="Times New Roman"/>
+                <w:color w:val="000000"/>
+                <w:sz w:val="22"/>
+                <w:szCs w:val="22"/>
+              </w:rPr>
+            </w:pPr>
+            <w:r>
+              <w:rPr>
+                <w:rFonts w:ascii="Times New Roman" w:eastAsia="Times New Roman" w:hAnsi="Times New Roman" w:cs="Times New Roman"/>
+                <w:color w:val="000000"/>
+                <w:sz w:val="22"/>
+                <w:szCs w:val="22"/>
+              </w:rPr>
+              <w:t>1</w:t>
+            </w:r>
+          </w:p>
+        </w:tc>
+        <w:tc>
+          <w:tcPr>
+            <w:tcW w:w="1181" w:type="dxa"/>
+            <w:tcBorders>
+              <w:top w:val="none" w:sz="0" w:space="0" w:color="000000"/>
+              <w:left w:val="none" w:sz="0" w:space="0" w:color="000000"/>
+              <w:bottom w:val="none" w:sz="0" w:space="0" w:color="000000"/>
+              <w:right w:val="none" w:sz="0" w:space="0" w:color="000000"/>
+            </w:tcBorders>
+            <w:shd w:val="clear" w:color="auto" w:fill="FFFFFF"/>
+            <w:tcMar>
+              <w:top w:w="0" w:type="dxa"/>
+              <w:left w:w="0" w:type="dxa"/>
+              <w:bottom w:w="0" w:type="dxa"/>
+              <w:right w:w="0" w:type="dxa"/>
+            </w:tcMar>
+            <w:vAlign w:val="center"/>
+          </w:tcPr>
+          <w:p>
+            <w:pPr>
+              <w:pBdr>
+                <w:top w:val="none" w:sz="0" w:space="0" w:color="000000"/>
+                <w:left w:val="none" w:sz="0" w:space="0" w:color="000000"/>
+                <w:bottom w:val="none" w:sz="0" w:space="0" w:color="000000"/>
+                <w:right w:val="none" w:sz="0" w:space="0" w:color="000000"/>
+              </w:pBdr>
+              <w:spacing w:before="100" w:after="100"/>
+              <w:ind w:left="100" w:right="100"/>
+              <w:jc w:val="center"/>
+              <w:rPr>
+                <w:rFonts w:ascii="Times New Roman" w:eastAsia="Times New Roman" w:hAnsi="Times New Roman" w:cs="Times New Roman"/>
+                <w:color w:val="000000"/>
+                <w:sz w:val="22"/>
+                <w:szCs w:val="22"/>
+              </w:rPr>
+            </w:pPr>
+            <w:r>
+              <w:rPr>
+                <w:rFonts w:ascii="Times New Roman" w:eastAsia="Times New Roman" w:hAnsi="Times New Roman" w:cs="Times New Roman"/>
+                <w:color w:val="000000"/>
+                <w:sz w:val="22"/>
+                <w:szCs w:val="22"/>
+              </w:rPr>
+              <w:t>6,185.96</w:t>
+            </w:r>
+          </w:p>
+        </w:tc>
+      </w:tr>
+      <w:tr>
+        <w:trPr>
+          <w:jc w:val="center"/>
+        </w:trPr>
+        <w:tc>
+          <w:tcPr>
+            <w:tcW w:w="2720" w:type="dxa"/>
+            <w:tcBorders>
+              <w:top w:val="none" w:sz="0" w:space="0" w:color="000000"/>
+              <w:left w:val="none" w:sz="0" w:space="0" w:color="000000"/>
+              <w:bottom w:val="single" w:sz="12" w:space="0" w:color="666666"/>
+              <w:right w:val="none" w:sz="0" w:space="0" w:color="000000"/>
+            </w:tcBorders>
+            <w:shd w:val="clear" w:color="auto" w:fill="FFFFFF"/>
+            <w:tcMar>
+              <w:top w:w="0" w:type="dxa"/>
+              <w:left w:w="0" w:type="dxa"/>
+              <w:bottom w:w="0" w:type="dxa"/>
+              <w:right w:w="0" w:type="dxa"/>
+            </w:tcMar>
+            <w:vAlign w:val="center"/>
+          </w:tcPr>
+          <w:p>
+            <w:pPr>
+              <w:pBdr>
+                <w:top w:val="none" w:sz="0" w:space="0" w:color="000000"/>
+                <w:left w:val="none" w:sz="0" w:space="0" w:color="000000"/>
+                <w:bottom w:val="none" w:sz="0" w:space="0" w:color="000000"/>
+                <w:right w:val="none" w:sz="0" w:space="0" w:color="000000"/>
+              </w:pBdr>
+              <w:spacing w:before="100" w:after="100"/>
+              <w:ind w:left="100" w:right="100"/>
+              <w:rPr>
+                <w:rFonts w:ascii="Times New Roman" w:eastAsia="Times New Roman" w:hAnsi="Times New Roman" w:cs="Times New Roman"/>
+                <w:color w:val="000000"/>
+                <w:sz w:val="22"/>
+                <w:szCs w:val="22"/>
+              </w:rPr>
+            </w:pPr>
+            <w:r>
+              <w:rPr>
+                <w:rFonts w:ascii="Times New Roman" w:eastAsia="Times New Roman" w:hAnsi="Times New Roman" w:cs="Times New Roman"/>
+                <w:color w:val="000000"/>
+                <w:sz w:val="22"/>
+                <w:szCs w:val="22"/>
+              </w:rPr>
+              <w:t>b_proficiency_z</w:t>
+            </w:r>
+          </w:p>
+        </w:tc>
+        <w:tc>
+          <w:tcPr>
+            <w:tcW w:w="1083" w:type="dxa"/>
+            <w:tcBorders>
+              <w:top w:val="none" w:sz="0" w:space="0" w:color="000000"/>
+              <w:left w:val="none" w:sz="0" w:space="0" w:color="000000"/>
+              <w:bottom w:val="single" w:sz="12" w:space="0" w:color="666666"/>
+              <w:right w:val="none" w:sz="0" w:space="0" w:color="000000"/>
+            </w:tcBorders>
+            <w:shd w:val="clear" w:color="auto" w:fill="FFFFFF"/>
+            <w:tcMar>
+              <w:top w:w="0" w:type="dxa"/>
+              <w:left w:w="0" w:type="dxa"/>
+              <w:bottom w:w="0" w:type="dxa"/>
+              <w:right w:w="0" w:type="dxa"/>
+            </w:tcMar>
+            <w:vAlign w:val="center"/>
+          </w:tcPr>
+          <w:p>
+            <w:pPr>
+              <w:pBdr>
+                <w:top w:val="none" w:sz="0" w:space="0" w:color="000000"/>
+                <w:left w:val="none" w:sz="0" w:space="0" w:color="000000"/>
+                <w:bottom w:val="none" w:sz="0" w:space="0" w:color="000000"/>
+                <w:right w:val="none" w:sz="0" w:space="0" w:color="000000"/>
+              </w:pBdr>
+              <w:spacing w:before="100" w:after="100"/>
+              <w:ind w:left="100" w:right="100"/>
+              <w:jc w:val="center"/>
+              <w:rPr>
+                <w:rFonts w:ascii="Times New Roman" w:eastAsia="Times New Roman" w:hAnsi="Times New Roman" w:cs="Times New Roman"/>
+                <w:color w:val="000000"/>
+                <w:sz w:val="22"/>
+                <w:szCs w:val="22"/>
+              </w:rPr>
+            </w:pPr>
+            <w:r>
+              <w:rPr>
+                <w:rFonts w:ascii="Times New Roman" w:eastAsia="Times New Roman" w:hAnsi="Times New Roman" w:cs="Times New Roman"/>
+                <w:color w:val="000000"/>
+                <w:sz w:val="22"/>
+                <w:szCs w:val="22"/>
+              </w:rPr>
+              <w:t>-0.03</w:t>
+            </w:r>
+          </w:p>
+        </w:tc>
+        <w:tc>
+          <w:tcPr>
+            <w:tcW w:w="1584" w:type="dxa"/>
+            <w:tcBorders>
+              <w:top w:val="none" w:sz="0" w:space="0" w:color="000000"/>
+              <w:left w:val="none" w:sz="0" w:space="0" w:color="000000"/>
+              <w:bottom w:val="single" w:sz="12" w:space="0" w:color="666666"/>
+              <w:right w:val="none" w:sz="0" w:space="0" w:color="000000"/>
+            </w:tcBorders>
+            <w:shd w:val="clear" w:color="auto" w:fill="FFFFFF"/>
+            <w:tcMar>
+              <w:top w:w="0" w:type="dxa"/>
+              <w:left w:w="0" w:type="dxa"/>
+              <w:bottom w:w="0" w:type="dxa"/>
+              <w:right w:w="0" w:type="dxa"/>
+            </w:tcMar>
+            <w:vAlign w:val="center"/>
+          </w:tcPr>
+          <w:p>
+            <w:pPr>
+              <w:pBdr>
+                <w:top w:val="none" w:sz="0" w:space="0" w:color="000000"/>
+                <w:left w:val="none" w:sz="0" w:space="0" w:color="000000"/>
+                <w:bottom w:val="none" w:sz="0" w:space="0" w:color="000000"/>
+                <w:right w:val="none" w:sz="0" w:space="0" w:color="000000"/>
+              </w:pBdr>
+              <w:spacing w:before="100" w:after="100"/>
+              <w:ind w:left="100" w:right="100"/>
+              <w:jc w:val="center"/>
+              <w:rPr>
+                <w:rFonts w:ascii="Times New Roman" w:eastAsia="Times New Roman" w:hAnsi="Times New Roman" w:cs="Times New Roman"/>
+                <w:color w:val="000000"/>
+                <w:sz w:val="22"/>
+                <w:szCs w:val="22"/>
+              </w:rPr>
+            </w:pPr>
+            <w:r>
+              <w:rPr>
+                <w:rFonts w:ascii="Times New Roman" w:eastAsia="Times New Roman" w:hAnsi="Times New Roman" w:cs="Times New Roman"/>
+                <w:color w:val="000000"/>
+                <w:sz w:val="22"/>
+                <w:szCs w:val="22"/>
+              </w:rPr>
+              <w:t>[-0.09, 0.02]</w:t>
+            </w:r>
+          </w:p>
+        </w:tc>
+        <w:tc>
+          <w:tcPr>
+            <w:tcW w:w="796" w:type="dxa"/>
+            <w:tcBorders>
+              <w:top w:val="none" w:sz="0" w:space="0" w:color="000000"/>
+              <w:left w:val="none" w:sz="0" w:space="0" w:color="000000"/>
+              <w:bottom w:val="single" w:sz="12" w:space="0" w:color="666666"/>
+              <w:right w:val="none" w:sz="0" w:space="0" w:color="000000"/>
+            </w:tcBorders>
+            <w:shd w:val="clear" w:color="auto" w:fill="FFFFFF"/>
+            <w:tcMar>
+              <w:top w:w="0" w:type="dxa"/>
+              <w:left w:w="0" w:type="dxa"/>
+              <w:bottom w:w="0" w:type="dxa"/>
+              <w:right w:w="0" w:type="dxa"/>
+            </w:tcMar>
+            <w:vAlign w:val="center"/>
+          </w:tcPr>
+          <w:p>
+            <w:pPr>
+              <w:pBdr>
+                <w:top w:val="none" w:sz="0" w:space="0" w:color="000000"/>
+                <w:left w:val="none" w:sz="0" w:space="0" w:color="000000"/>
+                <w:bottom w:val="none" w:sz="0" w:space="0" w:color="000000"/>
+                <w:right w:val="none" w:sz="0" w:space="0" w:color="000000"/>
+              </w:pBdr>
+              <w:spacing w:before="100" w:after="100"/>
+              <w:ind w:left="100" w:right="100"/>
+              <w:jc w:val="center"/>
+              <w:rPr>
+                <w:rFonts w:ascii="Times New Roman" w:eastAsia="Times New Roman" w:hAnsi="Times New Roman" w:cs="Times New Roman"/>
+                <w:color w:val="000000"/>
+                <w:sz w:val="22"/>
+                <w:szCs w:val="22"/>
+              </w:rPr>
+            </w:pPr>
+            <w:r>
+              <w:rPr>
+                <w:rFonts w:ascii="Times New Roman" w:eastAsia="Times New Roman" w:hAnsi="Times New Roman" w:cs="Times New Roman"/>
+                <w:color w:val="000000"/>
+                <w:sz w:val="22"/>
+                <w:szCs w:val="22"/>
+              </w:rPr>
+              <w:t>0.89</w:t>
+            </w:r>
+          </w:p>
+        </w:tc>
+        <w:tc>
+          <w:tcPr>
+            <w:tcW w:w="1510" w:type="dxa"/>
+            <w:tcBorders>
+              <w:top w:val="none" w:sz="0" w:space="0" w:color="000000"/>
+              <w:left w:val="none" w:sz="0" w:space="0" w:color="000000"/>
+              <w:bottom w:val="single" w:sz="12" w:space="0" w:color="666666"/>
+              <w:right w:val="none" w:sz="0" w:space="0" w:color="000000"/>
+            </w:tcBorders>
+            <w:shd w:val="clear" w:color="auto" w:fill="FFFFFF"/>
+            <w:tcMar>
+              <w:top w:w="0" w:type="dxa"/>
+              <w:left w:w="0" w:type="dxa"/>
+              <w:bottom w:w="0" w:type="dxa"/>
+              <w:right w:w="0" w:type="dxa"/>
+            </w:tcMar>
+            <w:vAlign w:val="center"/>
+          </w:tcPr>
+          <w:p>
+            <w:pPr>
+              <w:pBdr>
+                <w:top w:val="none" w:sz="0" w:space="0" w:color="000000"/>
+                <w:left w:val="none" w:sz="0" w:space="0" w:color="000000"/>
+                <w:bottom w:val="none" w:sz="0" w:space="0" w:color="000000"/>
+                <w:right w:val="none" w:sz="0" w:space="0" w:color="000000"/>
+              </w:pBdr>
+              <w:spacing w:before="100" w:after="100"/>
+              <w:ind w:left="100" w:right="100"/>
+              <w:jc w:val="center"/>
+              <w:rPr>
+                <w:rFonts w:ascii="Times New Roman" w:eastAsia="Times New Roman" w:hAnsi="Times New Roman" w:cs="Times New Roman"/>
+                <w:color w:val="000000"/>
+                <w:sz w:val="22"/>
+                <w:szCs w:val="22"/>
+              </w:rPr>
+            </w:pPr>
+            <w:r>
+              <w:rPr>
+                <w:rFonts w:ascii="Times New Roman" w:eastAsia="Times New Roman" w:hAnsi="Times New Roman" w:cs="Times New Roman"/>
+                <w:color w:val="000000"/>
+                <w:sz w:val="22"/>
+                <w:szCs w:val="22"/>
+              </w:rPr>
+              <w:t>[-0.01, 0.01]</w:t>
+            </w:r>
+          </w:p>
+        </w:tc>
+        <w:tc>
+          <w:tcPr>
+            <w:tcW w:w="1437" w:type="dxa"/>
+            <w:tcBorders>
+              <w:top w:val="none" w:sz="0" w:space="0" w:color="000000"/>
+              <w:left w:val="none" w:sz="0" w:space="0" w:color="000000"/>
+              <w:bottom w:val="single" w:sz="12" w:space="0" w:color="666666"/>
+              <w:right w:val="none" w:sz="0" w:space="0" w:color="000000"/>
+            </w:tcBorders>
+            <w:shd w:val="clear" w:color="auto" w:fill="FFFFFF"/>
+            <w:tcMar>
+              <w:top w:w="0" w:type="dxa"/>
+              <w:left w:w="0" w:type="dxa"/>
+              <w:bottom w:w="0" w:type="dxa"/>
+              <w:right w:w="0" w:type="dxa"/>
+            </w:tcMar>
+            <w:vAlign w:val="center"/>
+          </w:tcPr>
+          <w:p>
+            <w:pPr>
+              <w:pBdr>
+                <w:top w:val="none" w:sz="0" w:space="0" w:color="000000"/>
+                <w:left w:val="none" w:sz="0" w:space="0" w:color="000000"/>
+                <w:bottom w:val="none" w:sz="0" w:space="0" w:color="000000"/>
+                <w:right w:val="none" w:sz="0" w:space="0" w:color="000000"/>
+              </w:pBdr>
+              <w:spacing w:before="100" w:after="100"/>
+              <w:ind w:left="100" w:right="100"/>
+              <w:jc w:val="center"/>
+              <w:rPr>
+                <w:rFonts w:ascii="Times New Roman" w:eastAsia="Times New Roman" w:hAnsi="Times New Roman" w:cs="Times New Roman"/>
+                <w:color w:val="000000"/>
+                <w:sz w:val="22"/>
+                <w:szCs w:val="22"/>
+              </w:rPr>
+            </w:pPr>
+            <w:r>
+              <w:rPr>
+                <w:rFonts w:ascii="Times New Roman" w:eastAsia="Times New Roman" w:hAnsi="Times New Roman" w:cs="Times New Roman"/>
+                <w:color w:val="000000"/>
+                <w:sz w:val="22"/>
+                <w:szCs w:val="22"/>
+              </w:rPr>
+              <w:t>0.10</w:t>
+            </w:r>
+          </w:p>
+        </w:tc>
+        <w:tc>
+          <w:tcPr>
+            <w:tcW w:w="826" w:type="dxa"/>
+            <w:tcBorders>
+              <w:top w:val="none" w:sz="0" w:space="0" w:color="000000"/>
+              <w:left w:val="none" w:sz="0" w:space="0" w:color="000000"/>
+              <w:bottom w:val="single" w:sz="12" w:space="0" w:color="666666"/>
+              <w:right w:val="none" w:sz="0" w:space="0" w:color="000000"/>
+            </w:tcBorders>
+            <w:shd w:val="clear" w:color="auto" w:fill="FFFFFF"/>
+            <w:tcMar>
+              <w:top w:w="0" w:type="dxa"/>
+              <w:left w:w="0" w:type="dxa"/>
+              <w:bottom w:w="0" w:type="dxa"/>
+              <w:right w:w="0" w:type="dxa"/>
+            </w:tcMar>
+            <w:vAlign w:val="center"/>
+          </w:tcPr>
+          <w:p>
+            <w:pPr>
+              <w:pBdr>
+                <w:top w:val="none" w:sz="0" w:space="0" w:color="000000"/>
+                <w:left w:val="none" w:sz="0" w:space="0" w:color="000000"/>
+                <w:bottom w:val="none" w:sz="0" w:space="0" w:color="000000"/>
+                <w:right w:val="none" w:sz="0" w:space="0" w:color="000000"/>
+              </w:pBdr>
+              <w:spacing w:before="100" w:after="100"/>
+              <w:ind w:left="100" w:right="100"/>
+              <w:jc w:val="center"/>
+              <w:rPr>
+                <w:rFonts w:ascii="Times New Roman" w:eastAsia="Times New Roman" w:hAnsi="Times New Roman" w:cs="Times New Roman"/>
+                <w:color w:val="000000"/>
+                <w:sz w:val="22"/>
+                <w:szCs w:val="22"/>
+              </w:rPr>
+            </w:pPr>
+            <w:r>
+              <w:rPr>
+                <w:rFonts w:ascii="Times New Roman" w:eastAsia="Times New Roman" w:hAnsi="Times New Roman" w:cs="Times New Roman"/>
+                <w:color w:val="000000"/>
+                <w:sz w:val="22"/>
+                <w:szCs w:val="22"/>
+              </w:rPr>
+              <w:t>1</w:t>
+            </w:r>
+          </w:p>
+        </w:tc>
+        <w:tc>
+          <w:tcPr>
+            <w:tcW w:w="1181" w:type="dxa"/>
+            <w:tcBorders>
+              <w:top w:val="none" w:sz="0" w:space="0" w:color="000000"/>
+              <w:left w:val="none" w:sz="0" w:space="0" w:color="000000"/>
+              <w:bottom w:val="single" w:sz="12" w:space="0" w:color="666666"/>
+              <w:right w:val="none" w:sz="0" w:space="0" w:color="000000"/>
+            </w:tcBorders>
+            <w:shd w:val="clear" w:color="auto" w:fill="FFFFFF"/>
+            <w:tcMar>
+              <w:top w:w="0" w:type="dxa"/>
+              <w:left w:w="0" w:type="dxa"/>
+              <w:bottom w:w="0" w:type="dxa"/>
+              <w:right w:w="0" w:type="dxa"/>
+            </w:tcMar>
+            <w:vAlign w:val="center"/>
+          </w:tcPr>
+          <w:p>
+            <w:pPr>
+              <w:pBdr>
+                <w:top w:val="none" w:sz="0" w:space="0" w:color="000000"/>
+                <w:left w:val="none" w:sz="0" w:space="0" w:color="000000"/>
+                <w:bottom w:val="none" w:sz="0" w:space="0" w:color="000000"/>
+                <w:right w:val="none" w:sz="0" w:space="0" w:color="000000"/>
+              </w:pBdr>
+              <w:spacing w:before="100" w:after="100"/>
+              <w:ind w:left="100" w:right="100"/>
+              <w:jc w:val="center"/>
+              <w:rPr>
+                <w:rFonts w:ascii="Times New Roman" w:eastAsia="Times New Roman" w:hAnsi="Times New Roman" w:cs="Times New Roman"/>
+                <w:color w:val="000000"/>
+                <w:sz w:val="22"/>
+                <w:szCs w:val="22"/>
+              </w:rPr>
+            </w:pPr>
+            <w:r>
+              <w:rPr>
+                <w:rFonts w:ascii="Times New Roman" w:eastAsia="Times New Roman" w:hAnsi="Times New Roman" w:cs="Times New Roman"/>
+                <w:color w:val="000000"/>
+                <w:sz w:val="22"/>
+                <w:szCs w:val="22"/>
+              </w:rPr>
+              <w:t>1,358.50</w:t>
+            </w:r>
+          </w:p>
+        </w:tc>
+      </w:tr>
+    </w:tbl>
+    <w:p>
+      <w:pPr>
+        <w:pStyle w:val="BodyText"/>
+      </w:pPr>
+      <w:r>
+        <w:t xml:space="preserve">The Bayesian model largely corroborated the descriptive results for reaction time. Figure 7 visualized the posterior distribution of the Bayesian model while Table 3 provides additional details regarding the posterior shape and fit. The intercept term of this model (-0.23) corresponds to the log reaction time of a two-way cognate of average frequency by a participant with average proficiency. This value corresponds to 794.53 milliseconds. The non-cognate model term is 0.08 [0.04, 0.12] and indicates a slow down relative to two-way cognates of about 288.75 </w:t>
+      </w:r>
+      <w:r>
+        <w:lastRenderedPageBreak/>
+        <w:t xml:space="preserve">milliseconds. Three-way cognates were predicted to be processed slightly faster that two-way cognates (-0.02 [-0.07, 0.02]), but had both positive and negative plausible estimates in the posterior distribution, as well as a relatively low pd (0.83) and % in the ROPE. Lexical frequency was a strong predictor of reaction time. Like with accuracy, the model term represents the change in reaction time for a one standard deviation increase in frequency and in this case predicts faster reactions (-0.07 [-0.08, -0.05]) in more frequent words corresponding to </w:t>
+      </w:r>
+      <w:r>
+        <w:rPr>
+          <w:rStyle w:val="VerbatimChar"/>
+        </w:rPr>
+        <w:t>round2(abs(exp(rt_table$Median[1])*1000 - exp(rt_table$Median[4])*1000))</w:t>
+      </w:r>
+      <w:r>
+        <w:t xml:space="preserve"> milliseconds. Finally, the adapted LexTALE score (proficiency) was associated with a slight speedup in processing, but this difference did not fall completely outside the ROPE (-0.03 [-0.09, 0.02]), rendering the effect inconclusive. Taken together, the results of the model point to a general cognate effect that is not explained by proficiency and with lexical frequency held constant. Importantly, the model does not support a cumulative effect in lexical decisions.</w:t>
+      </w:r>
+    </w:p>
+    <w:p>
+      <w:pPr>
         <w:pStyle w:val="Heading1"/>
       </w:pPr>
-      <w:bookmarkStart w:id="27" w:name="discussion"/>
+      <w:bookmarkStart w:id="28" w:name="discussion"/>
       <w:bookmarkEnd w:id="16"/>
       <w:bookmarkEnd w:id="23"/>
       <w:r>
@@ -5181,7 +7532,7 @@
       <w:pPr>
         <w:pStyle w:val="Heading2"/>
       </w:pPr>
-      <w:bookmarkStart w:id="28" w:name="cognate-effects-in-l3-lexical-processing"/>
+      <w:bookmarkStart w:id="29" w:name="cognate-effects-in-l3-lexical-processing"/>
       <w:r>
         <w:t>Cognate Effects in L3 Lexical Processing</w:t>
       </w:r>
@@ -5242,8 +7593,8 @@
       <w:pPr>
         <w:pStyle w:val="Heading2"/>
       </w:pPr>
-      <w:bookmarkStart w:id="29" w:name="the-role-of-l2-and-l3-proficiency"/>
-      <w:bookmarkEnd w:id="28"/>
+      <w:bookmarkStart w:id="30" w:name="the-role-of-l2-and-l3-proficiency"/>
+      <w:bookmarkEnd w:id="29"/>
       <w:r>
         <w:t>The Role of L2 and L3 Proficiency</w:t>
       </w:r>
@@ -5280,9 +7631,9 @@
       <w:pPr>
         <w:pStyle w:val="Heading1"/>
       </w:pPr>
-      <w:bookmarkStart w:id="30" w:name="conclusion"/>
-      <w:bookmarkEnd w:id="27"/>
-      <w:bookmarkEnd w:id="29"/>
+      <w:bookmarkStart w:id="31" w:name="conclusion"/>
+      <w:bookmarkEnd w:id="28"/>
+      <w:bookmarkEnd w:id="30"/>
       <w:r>
         <w:t>Conclusion</w:t>
       </w:r>
@@ -5304,8 +7655,8 @@
       <w:pPr>
         <w:pStyle w:val="Heading1"/>
       </w:pPr>
-      <w:bookmarkStart w:id="31" w:name="X421aa8c25e75d5bda444d1508fbcc66cb0dedf6"/>
-      <w:bookmarkEnd w:id="30"/>
+      <w:bookmarkStart w:id="32" w:name="X421aa8c25e75d5bda444d1508fbcc66cb0dedf6"/>
+      <w:bookmarkEnd w:id="31"/>
       <w:r>
         <w:lastRenderedPageBreak/>
         <w:t>Appendix A: Stimulus List of the Lexical Decision Task</w:t>
@@ -5315,10 +7666,10 @@
       <w:pPr>
         <w:pStyle w:val="TableCaption"/>
       </w:pPr>
-      <w:bookmarkStart w:id="32" w:name="tab:stim-table-appendix"/>
-      <w:bookmarkEnd w:id="32"/>
-      <w:r>
-        <w:t>Table 3: Stimulus List</w:t>
+      <w:bookmarkStart w:id="33" w:name="tab:stim-table-appendix"/>
+      <w:bookmarkEnd w:id="33"/>
+      <w:r>
+        <w:t>Table 4: Stimulus List</w:t>
       </w:r>
     </w:p>
     <w:tbl>
@@ -5326,7 +7677,7 @@
         <w:tblStyle w:val="Table"/>
         <w:tblW w:w="0" w:type="auto"/>
         <w:tblLook w:val="0020" w:firstRow="1" w:lastRow="0" w:firstColumn="0" w:lastColumn="0" w:noHBand="0" w:noVBand="0"/>
-        <w:tblCaption w:val="Table 3: Stimulus List"/>
+        <w:tblCaption w:val="Table 4: Stimulus List"/>
       </w:tblPr>
       <w:tblGrid>
         <w:gridCol w:w="1176"/>
@@ -10976,8 +13327,8 @@
       <w:pPr>
         <w:pStyle w:val="Heading1"/>
       </w:pPr>
-      <w:bookmarkStart w:id="33" w:name="references"/>
-      <w:bookmarkEnd w:id="31"/>
+      <w:bookmarkStart w:id="34" w:name="references"/>
+      <w:bookmarkEnd w:id="32"/>
       <w:r>
         <w:lastRenderedPageBreak/>
         <w:t>References</w:t>
@@ -10987,8 +13338,8 @@
       <w:pPr>
         <w:pStyle w:val="Bibliography"/>
       </w:pPr>
-      <w:bookmarkStart w:id="34" w:name="ref-aguinaga_echeverria_2017"/>
-      <w:bookmarkStart w:id="35" w:name="refs"/>
+      <w:bookmarkStart w:id="35" w:name="ref-aguinaga_echeverria_2017"/>
+      <w:bookmarkStart w:id="36" w:name="refs"/>
       <w:r>
         <w:t xml:space="preserve">Aguinaga Echeverría, S. (2017). All Cognates are not Created Equal: Variation in Cognate Recognition and Applications for Second Language Acquisition. </w:t>
       </w:r>
@@ -11025,8 +13376,8 @@
       <w:pPr>
         <w:pStyle w:val="Bibliography"/>
       </w:pPr>
-      <w:bookmarkStart w:id="36" w:name="ref-amengual_2012"/>
-      <w:bookmarkEnd w:id="34"/>
+      <w:bookmarkStart w:id="37" w:name="ref-amengual_2012"/>
+      <w:bookmarkEnd w:id="35"/>
       <w:r>
         <w:t xml:space="preserve">Amengual, M. (2012). Interlingual influence in bilingual speech: Cognate status effect in a continuum of bilingualism. </w:t>
       </w:r>
@@ -11063,8 +13414,8 @@
       <w:pPr>
         <w:pStyle w:val="Bibliography"/>
       </w:pPr>
-      <w:bookmarkStart w:id="37" w:name="ref-arana_etal_2022"/>
-      <w:bookmarkEnd w:id="36"/>
+      <w:bookmarkStart w:id="38" w:name="ref-arana_etal_2022"/>
+      <w:bookmarkEnd w:id="37"/>
       <w:r>
         <w:t xml:space="preserve">Arana, S. L., Oliveira, H. M., Fernandes, A. I., Soares, A. P., &amp; Comesaña, M. (2022). The cognate facilitation effect depends on the presence of identical cognates. </w:t>
       </w:r>
@@ -11101,8 +13452,8 @@
       <w:pPr>
         <w:pStyle w:val="Bibliography"/>
       </w:pPr>
-      <w:bookmarkStart w:id="38" w:name="ref-bardel_falk_2007"/>
-      <w:bookmarkEnd w:id="37"/>
+      <w:bookmarkStart w:id="39" w:name="ref-bardel_falk_2007"/>
+      <w:bookmarkEnd w:id="38"/>
       <w:r>
         <w:t xml:space="preserve">Bardel, C., &amp; Falk, Y. (2007). The role of the second language in third language acquisition: The case of Germanic syntax. </w:t>
       </w:r>
@@ -11139,8 +13490,8 @@
       <w:pPr>
         <w:pStyle w:val="Bibliography"/>
       </w:pPr>
-      <w:bookmarkStart w:id="39" w:name="ref-bardel_falk_2012"/>
-      <w:bookmarkEnd w:id="38"/>
+      <w:bookmarkStart w:id="40" w:name="ref-bardel_falk_2012"/>
+      <w:bookmarkEnd w:id="39"/>
       <w:r>
         <w:t>Bardel, C., &amp; Falk, Y. (2012). The L2 status factor and the declarative/procedural distinction. In (pp. 61–78). http://doi.org/</w:t>
       </w:r>
@@ -11157,8 +13508,8 @@
       <w:pPr>
         <w:pStyle w:val="Bibliography"/>
       </w:pPr>
-      <w:bookmarkStart w:id="40" w:name="ref-bartolotti_marian_2017"/>
-      <w:bookmarkEnd w:id="39"/>
+      <w:bookmarkStart w:id="41" w:name="ref-bartolotti_marian_2017"/>
+      <w:bookmarkEnd w:id="40"/>
       <w:r>
         <w:t xml:space="preserve">Bartolotti, J., &amp; Marian, V. (2017). Bilinguals’ Existing Languages Benefit Vocabulary Learning in a Third Language. </w:t>
       </w:r>
@@ -11195,8 +13546,8 @@
       <w:pPr>
         <w:pStyle w:val="Bibliography"/>
       </w:pPr>
-      <w:bookmarkStart w:id="41" w:name="ref-burkner2017brms"/>
-      <w:bookmarkEnd w:id="40"/>
+      <w:bookmarkStart w:id="42" w:name="ref-burkner2017brms"/>
+      <w:bookmarkEnd w:id="41"/>
       <w:r>
         <w:t xml:space="preserve">Bürkner, P.-C. (2017). Brms: An r package for bayesian multilevel models using stan. </w:t>
       </w:r>
@@ -11225,8 +13576,8 @@
       <w:pPr>
         <w:pStyle w:val="Bibliography"/>
       </w:pPr>
-      <w:bookmarkStart w:id="42" w:name="ref-carrasco-ortiz_etal_2021"/>
-      <w:bookmarkEnd w:id="41"/>
+      <w:bookmarkStart w:id="43" w:name="ref-carrasco-ortiz_etal_2021"/>
+      <w:bookmarkEnd w:id="42"/>
       <w:r>
         <w:t xml:space="preserve">Carrasco-Ortiz, H., Amengual, M., &amp; Gries, S. T. (2021). Cross-language effects of phonological and orthographic similarity in cognate word recognition: The role of language dominance. </w:t>
       </w:r>
@@ -11263,8 +13614,8 @@
       <w:pPr>
         <w:pStyle w:val="Bibliography"/>
       </w:pPr>
-      <w:bookmarkStart w:id="43" w:name="ref-comesana_etal_2015"/>
-      <w:bookmarkEnd w:id="42"/>
+      <w:bookmarkStart w:id="44" w:name="ref-comesana_etal_2015"/>
+      <w:bookmarkEnd w:id="43"/>
       <w:r>
         <w:t xml:space="preserve">Comesaña, M., Ferré, P., Romero, J., Guasch, M., Soares, A. P., &amp; García-Chico, T. (2015). Facilitative effect of cognate words vanishes when reducing the orthographic overlap: The role of stimuli list composition. </w:t>
       </w:r>
@@ -11301,8 +13652,8 @@
       <w:pPr>
         <w:pStyle w:val="Bibliography"/>
       </w:pPr>
-      <w:bookmarkStart w:id="44" w:name="ref-cop_etal_2015"/>
-      <w:bookmarkEnd w:id="43"/>
+      <w:bookmarkStart w:id="45" w:name="ref-cop_etal_2015"/>
+      <w:bookmarkEnd w:id="44"/>
       <w:r>
         <w:t xml:space="preserve">Cop, U., Drieghe, D., &amp; Duyck, W. (2015). Eye Movement Patterns in Natural Reading: A Comparison of Monolingual and Bilingual Reading of a Novel. </w:t>
       </w:r>
@@ -11339,8 +13690,8 @@
       <w:pPr>
         <w:pStyle w:val="Bibliography"/>
       </w:pPr>
-      <w:bookmarkStart w:id="45" w:name="ref-cornut_etal_2022"/>
-      <w:bookmarkEnd w:id="44"/>
+      <w:bookmarkStart w:id="46" w:name="ref-cornut_etal_2022"/>
+      <w:bookmarkEnd w:id="45"/>
       <w:r>
         <w:t xml:space="preserve">Cornut, C., Mahé, G., &amp; Casalis, S. (2022). L2 word recognition in French–English late bilinguals: Does modality matter? </w:t>
       </w:r>
@@ -11377,8 +13728,8 @@
       <w:pPr>
         <w:pStyle w:val="Bibliography"/>
       </w:pPr>
-      <w:bookmarkStart w:id="46" w:name="ref-costa_etal_2023"/>
-      <w:bookmarkEnd w:id="45"/>
+      <w:bookmarkStart w:id="47" w:name="ref-costa_etal_2023"/>
+      <w:bookmarkEnd w:id="46"/>
       <w:r>
         <w:t xml:space="preserve">Costa, A. S., Comesaña, M., &amp; Soares, A. P. (2023). PHOR-in-One: A multilingual lexical database with PHonological, ORthographic and PHonographic word similarity estimates in four languages. </w:t>
       </w:r>
@@ -11415,8 +13766,8 @@
       <w:pPr>
         <w:pStyle w:val="Bibliography"/>
       </w:pPr>
-      <w:bookmarkStart w:id="47" w:name="ref-costa_etal_2000"/>
-      <w:bookmarkEnd w:id="46"/>
+      <w:bookmarkStart w:id="48" w:name="ref-costa_etal_2000"/>
+      <w:bookmarkEnd w:id="47"/>
       <w:r>
         <w:lastRenderedPageBreak/>
         <w:t>Costa, A., Caramazza, A., &amp; Sebastian-Galles, N. (2000). The Cognate Facilitation Effect: Implications for Models of Lexical Access.</w:t>
@@ -11426,8 +13777,8 @@
       <w:pPr>
         <w:pStyle w:val="Bibliography"/>
       </w:pPr>
-      <w:bookmarkStart w:id="48" w:name="ref-cuetos_etal_2011"/>
-      <w:bookmarkEnd w:id="47"/>
+      <w:bookmarkStart w:id="49" w:name="ref-cuetos_etal_2011"/>
+      <w:bookmarkEnd w:id="48"/>
       <w:r>
         <w:t xml:space="preserve">Cuetos, F., Glez-Nosti, M., Barbón, A., &amp; Brysbaert, M. (2011). SUBTLEX-ESP: Spanish word frequencies based on film subtitles. </w:t>
       </w:r>
@@ -11456,8 +13807,8 @@
       <w:pPr>
         <w:pStyle w:val="Bibliography"/>
       </w:pPr>
-      <w:bookmarkStart w:id="49" w:name="ref-de_angelis_2007"/>
-      <w:bookmarkEnd w:id="48"/>
+      <w:bookmarkStart w:id="50" w:name="ref-de_angelis_2007"/>
+      <w:bookmarkEnd w:id="49"/>
       <w:r>
         <w:t xml:space="preserve">De Angelis, G. (2007). </w:t>
       </w:r>
@@ -11484,8 +13835,8 @@
       <w:pPr>
         <w:pStyle w:val="Bibliography"/>
       </w:pPr>
-      <w:bookmarkStart w:id="50" w:name="ref-dijkstra_etal_2010"/>
-      <w:bookmarkEnd w:id="49"/>
+      <w:bookmarkStart w:id="51" w:name="ref-dijkstra_etal_2010"/>
+      <w:bookmarkEnd w:id="50"/>
       <w:r>
         <w:t xml:space="preserve">Dijkstra, T., Miwa, K., Brummelhuis, B., Sappelli, M., &amp; Baayen, H. (2010). How cross-language similarity and task demands affect cognate recognition. </w:t>
       </w:r>
@@ -11522,8 +13873,8 @@
       <w:pPr>
         <w:pStyle w:val="Bibliography"/>
       </w:pPr>
-      <w:bookmarkStart w:id="51" w:name="ref-dijkstra_vanheuven_2002"/>
-      <w:bookmarkEnd w:id="50"/>
+      <w:bookmarkStart w:id="52" w:name="ref-dijkstra_vanheuven_2002"/>
+      <w:bookmarkEnd w:id="51"/>
       <w:r>
         <w:t xml:space="preserve">Dijkstra, T., &amp; Van Heuven, W. J. B. (2002). The architecture of the bilingual word recognition system: From identification to decision. </w:t>
       </w:r>
@@ -11560,8 +13911,8 @@
       <w:pPr>
         <w:pStyle w:val="Bibliography"/>
       </w:pPr>
-      <w:bookmarkStart w:id="52" w:name="ref-Dijkstra_etal_2018"/>
-      <w:bookmarkEnd w:id="51"/>
+      <w:bookmarkStart w:id="53" w:name="ref-Dijkstra_etal_2018"/>
+      <w:bookmarkEnd w:id="52"/>
       <w:r>
         <w:t xml:space="preserve">Dijkstra, T., Wahl, A., Buytenhuijs, F., Van Halem, N., Al-Jibouri, Z., De Korte, M., &amp; Rekké, S. (2018). Multilink: A computational model for bilingual word recognition and word translation. </w:t>
       </w:r>
@@ -11590,8 +13941,8 @@
       <w:pPr>
         <w:pStyle w:val="Bibliography"/>
       </w:pPr>
-      <w:bookmarkStart w:id="53" w:name="ref-ecke_2015"/>
-      <w:bookmarkEnd w:id="52"/>
+      <w:bookmarkStart w:id="54" w:name="ref-ecke_2015"/>
+      <w:bookmarkEnd w:id="53"/>
       <w:r>
         <w:t xml:space="preserve">Ecke, P. (2015). Parasitic vocabulary acquisition, cross-linguistic influence, and lexical retrieval in multilinguals. </w:t>
       </w:r>
@@ -11628,8 +13979,8 @@
       <w:pPr>
         <w:pStyle w:val="Bibliography"/>
       </w:pPr>
-      <w:bookmarkStart w:id="54" w:name="ref-ellis_beaton_1993"/>
-      <w:bookmarkEnd w:id="53"/>
+      <w:bookmarkStart w:id="55" w:name="ref-ellis_beaton_1993"/>
+      <w:bookmarkEnd w:id="54"/>
       <w:r>
         <w:t xml:space="preserve">Ellis, N., &amp; Beaton, A. (1993). Factors affecting the learning of foreign language vocabulary: Imagery keyword mediators and phonological short-term memory. </w:t>
       </w:r>
@@ -11666,8 +14017,8 @@
       <w:pPr>
         <w:pStyle w:val="Bibliography"/>
       </w:pPr>
-      <w:bookmarkStart w:id="55" w:name="ref-engemann_rodetzky_2024"/>
-      <w:bookmarkEnd w:id="54"/>
+      <w:bookmarkStart w:id="56" w:name="ref-engemann_rodetzky_2024"/>
+      <w:bookmarkEnd w:id="55"/>
       <w:r>
         <w:t xml:space="preserve">Engemann, H., &amp; Radetzky, S. (2024). Cognate Facilitation in Child Third Language Learners in a Multilingual Setting. </w:t>
       </w:r>
@@ -11704,8 +14055,8 @@
       <w:pPr>
         <w:pStyle w:val="Bibliography"/>
       </w:pPr>
-      <w:bookmarkStart w:id="56" w:name="ref-forys-nogala_etal_2026"/>
-      <w:bookmarkEnd w:id="55"/>
+      <w:bookmarkStart w:id="57" w:name="ref-forys-nogala_etal_2026"/>
+      <w:bookmarkEnd w:id="56"/>
       <w:r>
         <w:t xml:space="preserve">Foryś-Nogala, M., Silva, B., Ambroziak, A., Broniś, O., Janczarska, A., Jastrzębski, B., &amp; Otwinowska, A. (2026). Cumulative L1–L2–L3 lexical similarity versus L2–L3 lexical similarity: What impacts learners’ L3 word knowledge and L3 word processing more? </w:t>
       </w:r>
@@ -11742,8 +14093,8 @@
       <w:pPr>
         <w:pStyle w:val="Bibliography"/>
       </w:pPr>
-      <w:bookmarkStart w:id="57" w:name="ref-frances_etal_2021"/>
-      <w:bookmarkEnd w:id="56"/>
+      <w:bookmarkStart w:id="58" w:name="ref-frances_etal_2021"/>
+      <w:bookmarkEnd w:id="57"/>
       <w:r>
         <w:t xml:space="preserve">Frances, C., Navarra-Barindelli, E., &amp; Martin, C. D. (2021). Inhibitory and facilitatory effects of phonological and orthographic similarity on L2 word recognition across modalities in bilinguals. </w:t>
       </w:r>
@@ -11780,8 +14131,8 @@
       <w:pPr>
         <w:pStyle w:val="Bibliography"/>
       </w:pPr>
-      <w:bookmarkStart w:id="58" w:name="ref-frances_etal_2022"/>
-      <w:bookmarkEnd w:id="57"/>
+      <w:bookmarkStart w:id="59" w:name="ref-frances_etal_2022"/>
+      <w:bookmarkEnd w:id="58"/>
       <w:r>
         <w:t xml:space="preserve">Frances, C., Navarra-Barindelli, E., &amp; Martin, C. D. (2022). Speaker Accent Modulates the Effects of Orthographic and Phonological Similarity on Auditory Processing by Learners of English. </w:t>
       </w:r>
@@ -11818,8 +14169,8 @@
       <w:pPr>
         <w:pStyle w:val="Bibliography"/>
       </w:pPr>
-      <w:bookmarkStart w:id="59" w:name="ref-garrido-pozu_2024"/>
-      <w:bookmarkEnd w:id="58"/>
+      <w:bookmarkStart w:id="60" w:name="ref-garrido-pozu_2024"/>
+      <w:bookmarkEnd w:id="59"/>
       <w:r>
         <w:t xml:space="preserve">Garrido-Pozú, J. J. (2024). Cross-linguistic effects of form overlap in aural recognition of Spanish–English cognates. </w:t>
       </w:r>
@@ -11856,8 +14207,8 @@
       <w:pPr>
         <w:pStyle w:val="Bibliography"/>
       </w:pPr>
-      <w:bookmarkStart w:id="60" w:name="ref-van_hell_degroot_2008"/>
-      <w:bookmarkEnd w:id="59"/>
+      <w:bookmarkStart w:id="61" w:name="ref-van_hell_degroot_2008"/>
+      <w:bookmarkEnd w:id="60"/>
       <w:r>
         <w:lastRenderedPageBreak/>
         <w:t xml:space="preserve">Hell, J. G. van, &amp; Groot, A. M. B. de. (2008). Sentence context modulates visual word recognition and translation in bilinguals. </w:t>
@@ -11895,8 +14246,8 @@
       <w:pPr>
         <w:pStyle w:val="Bibliography"/>
       </w:pPr>
-      <w:bookmarkStart w:id="61" w:name="ref-izura_etal_2014"/>
-      <w:bookmarkEnd w:id="60"/>
+      <w:bookmarkStart w:id="62" w:name="ref-izura_etal_2014"/>
+      <w:bookmarkEnd w:id="61"/>
       <w:r>
         <w:t xml:space="preserve">Izura, C., Cuetos, F., &amp; Brysbaert, M. (2014). Lextale-Esp: A test to rapidly and efficiently assess the Spanish vocabulary size. </w:t>
       </w:r>
@@ -11925,8 +14276,8 @@
       <w:pPr>
         <w:pStyle w:val="Bibliography"/>
       </w:pPr>
-      <w:bookmarkStart w:id="62" w:name="ref-Kellerman_1983"/>
-      <w:bookmarkEnd w:id="61"/>
+      <w:bookmarkStart w:id="63" w:name="ref-Kellerman_1983"/>
+      <w:bookmarkEnd w:id="62"/>
       <w:r>
         <w:t xml:space="preserve">Kellerman, E. (1983). Now you see it, now you don’t. In S. M. Gass &amp; L. Selinker (Eds.), </w:t>
       </w:r>
@@ -11945,8 +14296,8 @@
       <w:pPr>
         <w:pStyle w:val="Bibliography"/>
       </w:pPr>
-      <w:bookmarkStart w:id="63" w:name="ref-kruschke2018rejecting"/>
-      <w:bookmarkEnd w:id="62"/>
+      <w:bookmarkStart w:id="64" w:name="ref-kruschke2018rejecting"/>
+      <w:bookmarkEnd w:id="63"/>
       <w:r>
         <w:t xml:space="preserve">Kruschke, J. K. (2018). Rejecting or accepting parameter values in bayesian estimation. </w:t>
       </w:r>
@@ -11975,8 +14326,8 @@
       <w:pPr>
         <w:pStyle w:val="Bibliography"/>
       </w:pPr>
-      <w:bookmarkStart w:id="64" w:name="ref-lemhofer_broersma_2012"/>
-      <w:bookmarkEnd w:id="63"/>
+      <w:bookmarkStart w:id="65" w:name="ref-lemhofer_broersma_2012"/>
+      <w:bookmarkEnd w:id="64"/>
       <w:r>
         <w:t xml:space="preserve">Lemhöfer, K., &amp; Broersma, M. (2012). Introducing LexTALE: A quick and valid Lexical Test for Advanced Learners of English. </w:t>
       </w:r>
@@ -12013,8 +14364,8 @@
       <w:pPr>
         <w:pStyle w:val="Bibliography"/>
       </w:pPr>
-      <w:bookmarkStart w:id="65" w:name="ref-lemhoefer_etal_2004"/>
-      <w:bookmarkEnd w:id="64"/>
+      <w:bookmarkStart w:id="66" w:name="ref-lemhoefer_etal_2004"/>
+      <w:bookmarkEnd w:id="65"/>
       <w:r>
         <w:t xml:space="preserve">Lemhöfer, K., Dijkstra, T., &amp; Michel, M. (2004). Three languages, one ECHO: Cognate effects in trilingual word recognition. </w:t>
       </w:r>
@@ -12051,8 +14402,8 @@
       <w:pPr>
         <w:pStyle w:val="Bibliography"/>
       </w:pPr>
-      <w:bookmarkStart w:id="66" w:name="ref-lijewska_2023"/>
-      <w:bookmarkEnd w:id="65"/>
+      <w:bookmarkStart w:id="67" w:name="ref-lijewska_2023"/>
+      <w:bookmarkEnd w:id="66"/>
       <w:r>
         <w:t xml:space="preserve">Lijewska, A. (2023). The influence of semantic bias on triple non-identical cognates during reading: Evidence from trilinguals’ eye movements. </w:t>
       </w:r>
@@ -12089,8 +14440,8 @@
       <w:pPr>
         <w:pStyle w:val="Bibliography"/>
       </w:pPr>
-      <w:bookmarkStart w:id="67" w:name="ref-lijewska_delouw_2025"/>
-      <w:bookmarkEnd w:id="66"/>
+      <w:bookmarkStart w:id="68" w:name="ref-lijewska_delouw_2025"/>
+      <w:bookmarkEnd w:id="67"/>
       <w:r>
         <w:t xml:space="preserve">Lijewska, A., &amp; Louw, R. de. (2025). Facilitation for non-identical cognates in L3. </w:t>
       </w:r>
@@ -12127,8 +14478,8 @@
       <w:pPr>
         <w:pStyle w:val="Bibliography"/>
       </w:pPr>
-      <w:bookmarkStart w:id="68" w:name="ref-lotto_degroot_1998"/>
-      <w:bookmarkEnd w:id="67"/>
+      <w:bookmarkStart w:id="69" w:name="ref-lotto_degroot_1998"/>
+      <w:bookmarkEnd w:id="68"/>
       <w:r>
         <w:t xml:space="preserve">Lotto, L., &amp; Groot, A. M. B. de. (1998). Effects of learning method and word type on acquiring vocabulary in an unfamiliar language. </w:t>
       </w:r>
@@ -12165,8 +14516,8 @@
       <w:pPr>
         <w:pStyle w:val="Bibliography"/>
       </w:pPr>
-      <w:bookmarkStart w:id="69" w:name="ref-makowski2019indices"/>
-      <w:bookmarkEnd w:id="68"/>
+      <w:bookmarkStart w:id="70" w:name="ref-makowski2019indices"/>
+      <w:bookmarkEnd w:id="69"/>
       <w:r>
         <w:t xml:space="preserve">Makowski, D., Ben-Shachar, M. S., Chen, S. A., &amp; Lüdecke, D. (2019). Indices of effect existence and significance in the bayesian framework. </w:t>
       </w:r>
@@ -12195,8 +14546,8 @@
       <w:pPr>
         <w:pStyle w:val="Bibliography"/>
       </w:pPr>
-      <w:bookmarkStart w:id="70" w:name="ref-marian2007language"/>
-      <w:bookmarkEnd w:id="69"/>
+      <w:bookmarkStart w:id="71" w:name="ref-marian2007language"/>
+      <w:bookmarkEnd w:id="70"/>
       <w:r>
         <w:t xml:space="preserve">Marian, V., Blumenfeld, H. K., &amp; Kaushanskaya, M. (2007). The language experience and proficiency questionnaire (LEAP-q): Assessing language profiles in bilinguals and multilinguals. </w:t>
       </w:r>
@@ -12215,8 +14566,8 @@
       <w:pPr>
         <w:pStyle w:val="Bibliography"/>
       </w:pPr>
-      <w:bookmarkStart w:id="71" w:name="ref-muntendam_etal_2022"/>
-      <w:bookmarkEnd w:id="70"/>
+      <w:bookmarkStart w:id="72" w:name="ref-muntendam_etal_2022"/>
+      <w:bookmarkEnd w:id="71"/>
       <w:r>
         <w:t xml:space="preserve">Muntendam, A., Rijswijk, R., Severijnen, G., &amp; Dijkstra, T. (2022). The role of stress position in bilingual auditory word recognition: Cognate processing in Turkish and Dutch. </w:t>
       </w:r>
@@ -12253,8 +14604,8 @@
       <w:pPr>
         <w:pStyle w:val="Bibliography"/>
       </w:pPr>
-      <w:bookmarkStart w:id="72" w:name="ref-new_etal_2024"/>
-      <w:bookmarkEnd w:id="71"/>
+      <w:bookmarkStart w:id="73" w:name="ref-new_etal_2024"/>
+      <w:bookmarkEnd w:id="72"/>
       <w:r>
         <w:t xml:space="preserve">New, B., Bourgin, J., Barra, J., &amp; Pallier, C. (2024). UniPseudo: A universal pseudoword generator. </w:t>
       </w:r>
@@ -12291,8 +14642,8 @@
       <w:pPr>
         <w:pStyle w:val="Bibliography"/>
       </w:pPr>
-      <w:bookmarkStart w:id="73" w:name="ref-otwinowska_szewczyk_2019"/>
-      <w:bookmarkEnd w:id="72"/>
+      <w:bookmarkStart w:id="74" w:name="ref-otwinowska_szewczyk_2019"/>
+      <w:bookmarkEnd w:id="73"/>
       <w:r>
         <w:lastRenderedPageBreak/>
         <w:t xml:space="preserve">Otwinowska, A., &amp; Szewczyk, J. M. (2019). The more similar the better? Factors in learning cognates, false cognates and non-cognate words. </w:t>
@@ -12330,8 +14681,8 @@
       <w:pPr>
         <w:pStyle w:val="Bibliography"/>
       </w:pPr>
-      <w:bookmarkStart w:id="74" w:name="ref-peeters_etal_2013"/>
-      <w:bookmarkEnd w:id="73"/>
+      <w:bookmarkStart w:id="75" w:name="ref-peeters_etal_2013"/>
+      <w:bookmarkEnd w:id="74"/>
       <w:r>
         <w:t xml:space="preserve">Peeters, D., Dijkstra, T., &amp; Grainger, J. (2013). The representation and processing of identical cognates by late bilinguals: RT and ERP effects. </w:t>
       </w:r>
@@ -12368,8 +14719,8 @@
       <w:pPr>
         <w:pStyle w:val="Bibliography"/>
       </w:pPr>
-      <w:bookmarkStart w:id="75" w:name="ref-peirce_2019"/>
-      <w:bookmarkEnd w:id="74"/>
+      <w:bookmarkStart w:id="76" w:name="ref-peirce_2019"/>
+      <w:bookmarkEnd w:id="75"/>
       <w:r>
         <w:t xml:space="preserve">Peirce, J., Gray, J. R., Simpson, S., MacAskill, M., Höchenberger, R., Sogo, H., … Lindeløv, J. K. (2019). PsychoPy2: Experiments in behavior made easy. </w:t>
       </w:r>
@@ -12406,8 +14757,8 @@
       <w:pPr>
         <w:pStyle w:val="Bibliography"/>
       </w:pPr>
-      <w:bookmarkStart w:id="76" w:name="ref-plonsky2014big"/>
-      <w:bookmarkEnd w:id="75"/>
+      <w:bookmarkStart w:id="77" w:name="ref-plonsky2014big"/>
+      <w:bookmarkEnd w:id="76"/>
       <w:r>
         <w:t xml:space="preserve">Plonsky, L., &amp; Oswald, F. L. (2014). How big is “big”? Interpreting effect sizes in L2 research. </w:t>
       </w:r>
@@ -12436,8 +14787,8 @@
       <w:pPr>
         <w:pStyle w:val="Bibliography"/>
       </w:pPr>
-      <w:bookmarkStart w:id="77" w:name="ref-poarch_vanhell_2014"/>
-      <w:bookmarkEnd w:id="76"/>
+      <w:bookmarkStart w:id="78" w:name="ref-poarch_vanhell_2014"/>
+      <w:bookmarkEnd w:id="77"/>
       <w:r>
         <w:t xml:space="preserve">Poarch, G. J., &amp; Hell, J. G. van. (2014). Cross-language activation in same-script and different-script trilinguals. </w:t>
       </w:r>
@@ -12474,8 +14825,8 @@
       <w:pPr>
         <w:pStyle w:val="Bibliography"/>
       </w:pPr>
-      <w:bookmarkStart w:id="78" w:name="ref-poort_rodd_2017"/>
-      <w:bookmarkEnd w:id="77"/>
+      <w:bookmarkStart w:id="79" w:name="ref-poort_rodd_2017"/>
+      <w:bookmarkEnd w:id="78"/>
       <w:r>
         <w:t xml:space="preserve">Poort, E. D., &amp; Rodd, J. M. (2017). The cognate facilitation effect in bilingual lexical decision is influenced by stimulus list composition. </w:t>
       </w:r>
@@ -12512,8 +14863,8 @@
       <w:pPr>
         <w:pStyle w:val="Bibliography"/>
       </w:pPr>
-      <w:bookmarkStart w:id="79" w:name="ref-puig-mayenco_etal_2020"/>
-      <w:bookmarkEnd w:id="78"/>
+      <w:bookmarkStart w:id="80" w:name="ref-puig-mayenco_etal_2020"/>
+      <w:bookmarkEnd w:id="79"/>
       <w:r>
         <w:t xml:space="preserve">Puig-Mayenco, E., González Alonso, J., &amp; Rothman, J. (2020). A systematic review of transfer studies in third language acquisition. </w:t>
       </w:r>
@@ -12550,8 +14901,8 @@
       <w:pPr>
         <w:pStyle w:val="Bibliography"/>
       </w:pPr>
-      <w:bookmarkStart w:id="80" w:name="ref-Rothman_2011"/>
-      <w:bookmarkEnd w:id="79"/>
+      <w:bookmarkStart w:id="81" w:name="ref-Rothman_2011"/>
+      <w:bookmarkEnd w:id="80"/>
       <w:r>
         <w:t xml:space="preserve">Rothman, J. (2011). L3 syntactic transfer selectivity and typological determinacy: The typological primacy model. </w:t>
       </w:r>
@@ -12580,8 +14931,8 @@
       <w:pPr>
         <w:pStyle w:val="Bibliography"/>
       </w:pPr>
-      <w:bookmarkStart w:id="81" w:name="ref-Rothman_2013"/>
-      <w:bookmarkEnd w:id="80"/>
+      <w:bookmarkStart w:id="82" w:name="ref-Rothman_2013"/>
+      <w:bookmarkEnd w:id="81"/>
       <w:r>
         <w:t xml:space="preserve">Rothman, J. (2013). Cognitive economy, non-redundancy and typological primacy in L3 acquisition: Evidence from initial stages of L3 romance. In S. Baauw, F. Dirjkoningen, M. Pinto, &amp; L. Meroni (Eds.), </w:t>
       </w:r>
@@ -12600,8 +14951,8 @@
       <w:pPr>
         <w:pStyle w:val="Bibliography"/>
       </w:pPr>
-      <w:bookmarkStart w:id="82" w:name="ref-Rothman_2015"/>
-      <w:bookmarkEnd w:id="81"/>
+      <w:bookmarkStart w:id="83" w:name="ref-Rothman_2015"/>
+      <w:bookmarkEnd w:id="82"/>
       <w:r>
         <w:t xml:space="preserve">Rothman, J. (2015). Linguistic and cognitive motivations for the typological primacy model (TPM) of third language (L3) transfer: Timing of acquisition and proficiency considered. </w:t>
       </w:r>
@@ -12630,8 +14981,8 @@
       <w:pPr>
         <w:pStyle w:val="Bibliography"/>
       </w:pPr>
-      <w:bookmarkStart w:id="83" w:name="ref-szubko-sitarek_2011"/>
-      <w:bookmarkEnd w:id="82"/>
+      <w:bookmarkStart w:id="84" w:name="ref-szubko-sitarek_2011"/>
+      <w:bookmarkEnd w:id="83"/>
       <w:r>
         <w:t xml:space="preserve">Szubko-Sitarek, W. (2011). Cognate facilitation effects in trilingual word recognition. </w:t>
       </w:r>
@@ -12668,8 +15019,8 @@
       <w:pPr>
         <w:pStyle w:val="Bibliography"/>
       </w:pPr>
-      <w:bookmarkStart w:id="84" w:name="ref-tiffin-richards_2024"/>
-      <w:bookmarkEnd w:id="83"/>
+      <w:bookmarkStart w:id="85" w:name="ref-tiffin-richards_2024"/>
+      <w:bookmarkEnd w:id="84"/>
       <w:r>
         <w:t xml:space="preserve">Tiffin-Richards, S. P. (2024). Cognate facilitation in bilingual reading: The influence of orthographic and phonological similarity on lexical decisions and eye-movements. </w:t>
       </w:r>
@@ -12706,8 +15057,8 @@
       <w:pPr>
         <w:pStyle w:val="Bibliography"/>
       </w:pPr>
-      <w:bookmarkStart w:id="85" w:name="ref-tonzar_etal_2009"/>
-      <w:bookmarkEnd w:id="84"/>
+      <w:bookmarkStart w:id="86" w:name="ref-tonzar_etal_2009"/>
+      <w:bookmarkEnd w:id="85"/>
       <w:r>
         <w:lastRenderedPageBreak/>
         <w:t xml:space="preserve">Tonzar, C., Lotto, L., &amp; Job, R. (2009). L2 Vocabulary Acquisition in Children: Effects of Learning Method and Cognate Status. </w:t>
@@ -12745,8 +15096,8 @@
       <w:pPr>
         <w:pStyle w:val="Bibliography"/>
       </w:pPr>
-      <w:bookmarkStart w:id="86" w:name="ref-woumans_etal_2021"/>
-      <w:bookmarkEnd w:id="85"/>
+      <w:bookmarkStart w:id="87" w:name="ref-woumans_etal_2021"/>
+      <w:bookmarkEnd w:id="86"/>
       <w:r>
         <w:t xml:space="preserve">Woumans, E., Clauws, R., &amp; Duyck, W. (2021). Hands Down: Cognate Effects Persist During Written Word Production. </w:t>
       </w:r>
@@ -12778,9 +15129,9 @@
           <w:t>10.3389/fpsyg.2021.647362</w:t>
         </w:r>
       </w:hyperlink>
-      <w:bookmarkEnd w:id="33"/>
-      <w:bookmarkEnd w:id="35"/>
-      <w:bookmarkEnd w:id="86"/>
+      <w:bookmarkEnd w:id="34"/>
+      <w:bookmarkEnd w:id="36"/>
+      <w:bookmarkEnd w:id="87"/>
     </w:p>
     <w:sectPr>
       <w:headerReference w:type="even" r:id="rId53"/>
@@ -13526,7 +15877,7 @@
   <w:num w:numId="13" w16cid:durableId="858474234">
     <w:abstractNumId w:val="9"/>
   </w:num>
-  <w:num w:numId="14" w16cid:durableId="235240089">
+  <w:num w:numId="14" w16cid:durableId="2146846675">
     <w:abstractNumId w:val="10"/>
   </w:num>
 </w:numbering>

</xml_diff>

<commit_message>
moved extra figs to appendix
will need to manually adjust the numbers
</commit_message>
<xml_diff>
--- a/docs/manuscript/main.docx
+++ b/docs/manuscript/main.docx
@@ -7,7 +7,7 @@
         <w:pStyle w:val="Author"/>
       </w:pPr>
     </w:p>
-    <w:bookmarkStart w:id="61" w:name="abstract"/>
+    <w:bookmarkStart w:id="20" w:name="abstract"/>
     <w:p>
       <w:pPr>
         <w:pStyle w:val="Heading1"/>
@@ -21,7 +21,31 @@
         <w:pStyle w:val="FirstParagraph"/>
       </w:pPr>
       <w:r>
-        <w:t xml:space="preserve">Abstract goes here. Length depends on journal.</w:t>
+        <w:t xml:space="preserve">There is ample evidence that bilinguals benefit from cognates in word recognition, but less is known about whether this advantage increases when words are shared across three languages. The present study examined cognate facilitation in advanced L3 Spanish speakers (L1 German–L2 English) using a lexical decision task.</w:t>
+      </w:r>
+      <w:r>
+        <w:t xml:space="preserve"> </w:t>
+      </w:r>
+      <w:r>
+        <w:t xml:space="preserve">Accuracy and reaction times were compared across non-cognates, double cognates (English–Spanish), and triple cognates (German–English–Spanish).</w:t>
+      </w:r>
+      <w:r>
+        <w:t xml:space="preserve"> </w:t>
+      </w:r>
+      <w:r>
+        <w:t xml:space="preserve">Accuracy revealed a cumulative cognate effect: triple cognates were recognized more accurately than double cognates, which were in turn recognized more accurately than non-cognates.</w:t>
+      </w:r>
+      <w:r>
+        <w:t xml:space="preserve"> </w:t>
+      </w:r>
+      <w:r>
+        <w:t xml:space="preserve">Reaction times, however, showed a general cognate effect: both double and triple cognates were recognized faster than non-cognates, with no evidence of a difference between the two cognate types.</w:t>
+      </w:r>
+      <w:r>
+        <w:t xml:space="preserve"> </w:t>
+      </w:r>
+      <w:r>
+        <w:t xml:space="preserve">These findings suggest that lexical overlap across three languages provides an additional accuracy advantage, while processing speed benefits from cognate status more generally, with implications for models of multilingual lexical representation and L3 acquisition.</w:t>
       </w:r>
     </w:p>
     <w:p>
@@ -29,8 +53,8 @@
         <w:br w:type="page"/>
       </w:r>
     </w:p>
-    <w:bookmarkEnd w:id="61"/>
-    <w:bookmarkStart w:id="66" w:name="cool-title"/>
+    <w:bookmarkEnd w:id="20"/>
+    <w:bookmarkStart w:id="25" w:name="cool-title"/>
     <w:p>
       <w:pPr>
         <w:pStyle w:val="Heading1"/>
@@ -39,7 +63,7 @@
         <w:t xml:space="preserve">Cool Title</w:t>
       </w:r>
     </w:p>
-    <w:bookmarkStart w:id="62" w:name="introduction"/>
+    <w:bookmarkStart w:id="21" w:name="introduction"/>
     <w:p>
       <w:pPr>
         <w:pStyle w:val="Heading2"/>
@@ -334,8 +358,8 @@
         <w:t xml:space="preserve">Finally, if non-cognates and double cognates are processed at similar speed, but triple cognates are processed faster, this would suggest that L2 knowledge is inhibited (supporting similar lexical processing in general in L2 and L3 learners).</w:t>
       </w:r>
     </w:p>
-    <w:bookmarkEnd w:id="62"/>
-    <w:bookmarkStart w:id="63" w:name="Xa0ef4976aa743d69b4075c856f1c3e29387e3e9"/>
+    <w:bookmarkEnd w:id="21"/>
+    <w:bookmarkStart w:id="22" w:name="Xa0ef4976aa743d69b4075c856f1c3e29387e3e9"/>
     <w:p>
       <w:pPr>
         <w:pStyle w:val="Heading2"/>
@@ -670,8 +694,8 @@
         <w:t xml:space="preserve"> </w:t>
       </w:r>
     </w:p>
-    <w:bookmarkEnd w:id="63"/>
-    <w:bookmarkStart w:id="64" w:name="X1b13b08d22823258dbc3e067a58ea940446a5d8"/>
+    <w:bookmarkEnd w:id="22"/>
+    <w:bookmarkStart w:id="23" w:name="X1b13b08d22823258dbc3e067a58ea940446a5d8"/>
     <w:p>
       <w:pPr>
         <w:pStyle w:val="Heading2"/>
@@ -1229,7 +1253,19 @@
         <w:t xml:space="preserve"> </w:t>
       </w:r>
       <w:r>
-        <w:t xml:space="preserve">Some studies suggest that “sufficient” proficiency is needed for cumulative cognate effects to emerge</w:t>
+        <w:t xml:space="preserve">Some studies suggest that</w:t>
+      </w:r>
+      <w:r>
+        <w:t xml:space="preserve"> </w:t>
+      </w:r>
+      <w:r>
+        <w:t xml:space="preserve">“sufficient”</w:t>
+      </w:r>
+      <w:r>
+        <w:t xml:space="preserve"> </w:t>
+      </w:r>
+      <w:r>
+        <w:t xml:space="preserve">proficiency is needed for cumulative cognate effects to emerge</w:t>
       </w:r>
       <w:r>
         <w:t xml:space="preserve"> </w:t>
@@ -1253,8 +1289,8 @@
         <w:t xml:space="preserve">In doing so, we aim to advance our understanding of the interactions and contributions of previously acquired languages in L3 processing.</w:t>
       </w:r>
     </w:p>
-    <w:bookmarkEnd w:id="64"/>
-    <w:bookmarkStart w:id="65" w:name="the-present-study"/>
+    <w:bookmarkEnd w:id="23"/>
+    <w:bookmarkStart w:id="24" w:name="the-present-study"/>
     <w:p>
       <w:pPr>
         <w:pStyle w:val="Heading2"/>
@@ -1470,9 +1506,9 @@
         <w:t xml:space="preserve">Following this evidence, in the present study, higher L3 proficiency may be associated with stronger co-activation of cognates, resulting in stronger cognate effects.</w:t>
       </w:r>
     </w:p>
-    <w:bookmarkEnd w:id="65"/>
-    <w:bookmarkEnd w:id="66"/>
-    <w:bookmarkStart w:id="79" w:name="methodology"/>
+    <w:bookmarkEnd w:id="24"/>
+    <w:bookmarkEnd w:id="25"/>
+    <w:bookmarkStart w:id="34" w:name="methodology"/>
     <w:p>
       <w:pPr>
         <w:pStyle w:val="Heading1"/>
@@ -1481,7 +1517,7 @@
         <w:t xml:space="preserve">Methodology</w:t>
       </w:r>
     </w:p>
-    <w:bookmarkStart w:id="67" w:name="participants"/>
+    <w:bookmarkStart w:id="26" w:name="participants"/>
     <w:p>
       <w:pPr>
         <w:pStyle w:val="Heading2"/>
@@ -1621,8 +1657,8 @@
         <w:t xml:space="preserve">Specifically, the mean rating for spoken proficiency was 3.6 (sd = 1.83), while perceptual proficiency was 4 (sd = 1.98).</w:t>
       </w:r>
     </w:p>
-    <w:bookmarkEnd w:id="67"/>
-    <w:bookmarkStart w:id="75" w:name="materials-and-procedure"/>
+    <w:bookmarkEnd w:id="26"/>
+    <w:bookmarkStart w:id="30" w:name="materials-and-procedure"/>
     <w:p>
       <w:pPr>
         <w:pStyle w:val="Heading2"/>
@@ -1631,7 +1667,7 @@
         <w:t xml:space="preserve">Materials and Procedure</w:t>
       </w:r>
     </w:p>
-    <w:bookmarkStart w:id="69" w:name="lexical-decision-task"/>
+    <w:bookmarkStart w:id="28" w:name="lexical-decision-task"/>
     <w:p>
       <w:pPr>
         <w:pStyle w:val="Heading3"/>
@@ -1828,8 +1864,8 @@
       <w:pPr>
         <w:pStyle w:val="TableCaption"/>
       </w:pPr>
-      <w:bookmarkStart w:id="68" w:name="tab:stim-properties"/>
-      <w:bookmarkEnd w:id="68"/>
+      <w:bookmarkStart w:id="27" w:name="tab:stim-properties"/>
+      <w:bookmarkEnd w:id="27"/>
       <w:r>
         <w:t xml:space="preserve">Table 1:</w:t>
       </w:r>
@@ -3994,8 +4030,8 @@
         </w:tc>
       </w:tr>
     </w:tbl>
-    <w:bookmarkEnd w:id="69"/>
-    <w:bookmarkStart w:id="74" w:name="proficiency-measure-adapted-lextale"/>
+    <w:bookmarkEnd w:id="28"/>
+    <w:bookmarkStart w:id="29" w:name="proficiency-measure-adapted-lextale"/>
     <w:p>
       <w:pPr>
         <w:pStyle w:val="Heading3"/>
@@ -4096,19 +4132,273 @@
         <w:t xml:space="preserve"> </w:t>
       </w:r>
       <w:r>
-        <w:t xml:space="preserve">1</w:t>
-      </w:r>
-      <w:r>
-        <w:t xml:space="preserve"> </w:t>
-      </w:r>
-      <w:r>
-        <w:t xml:space="preserve">shows the distribution of adapted LexTALE scores.</w:t>
+        <w:t xml:space="preserve">6</w:t>
+      </w:r>
+      <w:r>
+        <w:t xml:space="preserve"> </w:t>
+      </w:r>
+      <w:r>
+        <w:t xml:space="preserve">in the appendix shows the distribution of adapted LexTALE scores.</w:t>
       </w:r>
       <w:r>
         <w:t xml:space="preserve"> </w:t>
       </w:r>
       <w:r>
         <w:t xml:space="preserve">The scores ranged from 55.2 to 97.9 with a mean of 73 (sd = 10).</w:t>
+      </w:r>
+    </w:p>
+    <w:bookmarkEnd w:id="29"/>
+    <w:bookmarkEnd w:id="30"/>
+    <w:bookmarkStart w:id="33" w:name="data-analysis"/>
+    <w:p>
+      <w:pPr>
+        <w:pStyle w:val="Heading2"/>
+      </w:pPr>
+      <w:r>
+        <w:t xml:space="preserve">Data Analysis</w:t>
+      </w:r>
+    </w:p>
+    <w:bookmarkStart w:id="31" w:name="analysis-justification"/>
+    <w:p>
+      <w:pPr>
+        <w:pStyle w:val="Heading3"/>
+      </w:pPr>
+      <w:r>
+        <w:t xml:space="preserve">Analysis justification</w:t>
+      </w:r>
+    </w:p>
+    <w:p>
+      <w:pPr>
+        <w:pStyle w:val="FirstParagraph"/>
+      </w:pPr>
+      <w:r>
+        <w:t xml:space="preserve">A Bayesian approach was chosen for two primary reasons.</w:t>
+      </w:r>
+      <w:r>
+        <w:t xml:space="preserve"> </w:t>
+      </w:r>
+      <w:r>
+        <w:t xml:space="preserve">First, Bayesian models allow for a more gradient analysis than the often used frequentist p-value, in which is is more typical to take a binary, all-or-nothing approach (e.g. there either is or is not evidence for a difference between conditions).</w:t>
+      </w:r>
+      <w:r>
+        <w:t xml:space="preserve"> </w:t>
+      </w:r>
+      <w:r>
+        <w:t xml:space="preserve">Additionally, frequentist models test against the null hypothesis, but are unable to provide direct evidence that the null hypothesis is true.</w:t>
+      </w:r>
+      <w:r>
+        <w:t xml:space="preserve"> </w:t>
+      </w:r>
+      <w:r>
+        <w:t xml:space="preserve">Taken together, the Bayesian Framework offers both flexibility and for more gradient interpretations of both the null and alternative hypotheses.</w:t>
+      </w:r>
+    </w:p>
+    <w:p>
+      <w:pPr>
+        <w:pStyle w:val="BodyText"/>
+      </w:pPr>
+      <w:r>
+        <w:t xml:space="preserve">In the Bayesian framework, several metrics are reported.</w:t>
+      </w:r>
+      <w:r>
+        <w:t xml:space="preserve"> </w:t>
+      </w:r>
+      <w:r>
+        <w:t xml:space="preserve">First, the 95% Highest Density Interval (95% HDI) refers to the range of the most credible 95% of the posterior distribution as determined by a probability density function.</w:t>
+      </w:r>
+      <w:r>
+        <w:t xml:space="preserve"> </w:t>
+      </w:r>
+      <w:r>
+        <w:t xml:space="preserve">Next, the probability of direction (pd) refers to the probability that a parameter is positive or negative and ranges from 50% to 100%.</w:t>
+      </w:r>
+      <w:r>
+        <w:t xml:space="preserve"> </w:t>
+      </w:r>
+      <w:r>
+        <w:t xml:space="preserve">It is mathematically defined as the proportion of the posterior distribution that is the same sign its median estimate</w:t>
+      </w:r>
+      <w:r>
+        <w:t xml:space="preserve"> </w:t>
+      </w:r>
+      <w:r>
+        <w:t xml:space="preserve">(Makowski, Ben-Shachar, Chen, &amp; Lüdecke, 2019)</w:t>
+      </w:r>
+      <w:r>
+        <w:t xml:space="preserve">.</w:t>
+      </w:r>
+      <w:r>
+        <w:t xml:space="preserve"> </w:t>
+      </w:r>
+      <w:r>
+        <w:t xml:space="preserve">Finally, the Region of Practical Equivalence (ROPE) is used to determine what proportion of the entire posterior distribution falls within researcher-specified upper and lower bounds and can be used to provide evidence for the null hypothesis.</w:t>
+      </w:r>
+    </w:p>
+    <w:p>
+      <w:pPr>
+        <w:pStyle w:val="BodyText"/>
+      </w:pPr>
+      <w:r>
+        <w:t xml:space="preserve">Although the HDI and ROPE can be combined to create decision rules (e.g., concluding that a difference is credible when the entire 95% HDI falls outside the ROPE</w:t>
+      </w:r>
+      <w:r>
+        <w:t xml:space="preserve"> </w:t>
+      </w:r>
+      <w:r>
+        <w:t xml:space="preserve">(Kruschke, 2018)</w:t>
+      </w:r>
+      <w:r>
+        <w:t xml:space="preserve">), such binary decisions are not required in Bayesian inference.</w:t>
+      </w:r>
+      <w:r>
+        <w:t xml:space="preserve"> </w:t>
+      </w:r>
+      <w:r>
+        <w:t xml:space="preserve">Rather, Bayesian analyses permit a more graded evaluation of evidence by examining the location and spread of the posterior distribution, the probability of direction, and the proportion of the posterior falling within the ROPE.</w:t>
+      </w:r>
+      <w:r>
+        <w:t xml:space="preserve"> </w:t>
+      </w:r>
+      <w:r>
+        <w:t xml:space="preserve">Consequently, evidence can be interpreted as varying continuously in strength rather than being reduced to a dichotomous significant/non-significant outcome.</w:t>
+      </w:r>
+    </w:p>
+    <w:bookmarkEnd w:id="31"/>
+    <w:bookmarkStart w:id="32" w:name="model-speficications"/>
+    <w:p>
+      <w:pPr>
+        <w:pStyle w:val="Heading3"/>
+      </w:pPr>
+      <w:r>
+        <w:t xml:space="preserve">Model speficications</w:t>
+      </w:r>
+    </w:p>
+    <w:p>
+      <w:pPr>
+        <w:pStyle w:val="FirstParagraph"/>
+      </w:pPr>
+      <w:r>
+        <w:t xml:space="preserve">The data were analyzed using two Bayesian multilevel regression models for accuracy and reaction time.</w:t>
+      </w:r>
+      <w:r>
+        <w:t xml:space="preserve"> </w:t>
+      </w:r>
+      <w:r>
+        <w:t xml:space="preserve">Both models were fit to the data using the brms</w:t>
+      </w:r>
+      <w:r>
+        <w:t xml:space="preserve"> </w:t>
+      </w:r>
+      <w:r>
+        <w:t xml:space="preserve">(Bürkner, 2017)</w:t>
+      </w:r>
+      <w:r>
+        <w:t xml:space="preserve"> </w:t>
+      </w:r>
+      <w:r>
+        <w:t xml:space="preserve">package in R and were estimated with Markov chain Monte Carlo sampling using 4 chains, each with 4000 iterations, including 2000 warm-up.</w:t>
+      </w:r>
+      <w:r>
+        <w:t xml:space="preserve"> </w:t>
+      </w:r>
+      <w:r>
+        <w:t xml:space="preserve">Model convergence was evaluated using effective sample sizes and R-hat values.</w:t>
+      </w:r>
+      <w:r>
+        <w:t xml:space="preserve"> </w:t>
+      </w:r>
+      <w:r>
+        <w:t xml:space="preserve">All regression coefficients were assigned Student’s t(3, 0, 2.5) priors, while the residual standard deviation was assigned a half-Student’s t(3, 0, 2.5) prior.</w:t>
+      </w:r>
+      <w:r>
+        <w:t xml:space="preserve"> </w:t>
+      </w:r>
+      <w:r>
+        <w:t xml:space="preserve">The accuracy model was a multilevel Bayesian logistic regression model that predicted the log-odds of a correct trial (coded as 1 or 0) as a function of the fixed effect predictors word type (3 levels: non-cognate, two-way cognate, three-way cognate; reference level two-way cognates), lexical frequency (z-scored log frequency), and proficiency (z-scored adapted LexTALE score).</w:t>
+      </w:r>
+      <w:r>
+        <w:t xml:space="preserve"> </w:t>
+      </w:r>
+      <w:r>
+        <w:t xml:space="preserve">The random effects structure include a random slope for each participant and a random intercept for word (stimulus).</w:t>
+      </w:r>
+      <w:r>
+        <w:t xml:space="preserve"> </w:t>
+      </w:r>
+      <w:r>
+        <w:t xml:space="preserve">The ROPE was set to +/-0.18 in log-odds, proportional to a negligible effect size of Cohen’s d = .1</w:t>
+      </w:r>
+      <w:r>
+        <w:t xml:space="preserve"> </w:t>
+      </w:r>
+      <w:r>
+        <w:t xml:space="preserve">(Plonsky &amp; Oswald, 2014)</w:t>
+      </w:r>
+      <w:r>
+        <w:t xml:space="preserve">.</w:t>
+      </w:r>
+      <w:r>
+        <w:t xml:space="preserve"> </w:t>
+      </w:r>
+      <w:r>
+        <w:t xml:space="preserve">The reaction time model predicted the log reaction time of correct responses as a function of the same predictors and random effect structure.</w:t>
+      </w:r>
+      <w:r>
+        <w:t xml:space="preserve"> </w:t>
+      </w:r>
+      <w:r>
+        <w:t xml:space="preserve">In this case, the ROPE was set to +/-0.0065 log reaction time, or +/- approximately 5ms.</w:t>
+      </w:r>
+    </w:p>
+    <w:bookmarkEnd w:id="32"/>
+    <w:bookmarkEnd w:id="33"/>
+    <w:bookmarkEnd w:id="34"/>
+    <w:bookmarkStart w:id="60" w:name="results"/>
+    <w:p>
+      <w:pPr>
+        <w:pStyle w:val="Heading1"/>
+      </w:pPr>
+      <w:r>
+        <w:t xml:space="preserve">Results</w:t>
+      </w:r>
+    </w:p>
+    <w:bookmarkStart w:id="35" w:name="data-trimming"/>
+    <w:p>
+      <w:pPr>
+        <w:pStyle w:val="Heading2"/>
+      </w:pPr>
+      <w:r>
+        <w:t xml:space="preserve">Data trimming</w:t>
+      </w:r>
+    </w:p>
+    <w:p>
+      <w:pPr>
+        <w:pStyle w:val="FirstParagraph"/>
+      </w:pPr>
+      <w:r>
+        <w:t xml:space="preserve">The data set for accuracy included 35 participants contained a total of 6720 data points (192 trials x 35 participants) and maintained all correct and incorrect trials.</w:t>
+      </w:r>
+      <w:r>
+        <w:t xml:space="preserve"> </w:t>
+      </w:r>
+      <w:r>
+        <w:t xml:space="preserve">Due to an error, three stimulus items were duplicated in the data (two non-cognates and one double cognate) and were subsequently omitted from further analysis, resulting in a total of 6510 data points (186 per participant).</w:t>
+      </w:r>
+      <w:r>
+        <w:t xml:space="preserve"> </w:t>
+      </w:r>
+      <w:r>
+        <w:t xml:space="preserve">For reaction time the analyzed data frame contained 2180 data points after removing pseudoword trials (n = 3360), incorrect trials (n = 1473), trials that were too fast (n = 195) or too slow (n = 417). Some trials fit multiple criteria for removal, and a trial was considered too fast or too slow when the reaction time was under 500ms or over 2 seconds.</w:t>
+      </w:r>
+    </w:p>
+    <w:bookmarkEnd w:id="35"/>
+    <w:bookmarkStart w:id="49" w:name="accuracy"/>
+    <w:p>
+      <w:pPr>
+        <w:pStyle w:val="Heading2"/>
+      </w:pPr>
+      <w:r>
+        <w:t xml:space="preserve">Accuracy</w:t>
       </w:r>
     </w:p>
     <w:p>
@@ -4118,20 +4408,20 @@
       <w:r>
         <w:drawing>
           <wp:inline>
-            <wp:extent cx="4579632" cy="3662179"/>
+            <wp:extent cx="4579632" cy="3663706"/>
             <wp:effectExtent b="0" l="0" r="0" t="0"/>
-            <wp:docPr descr="Figure 1: Histogram of the adapted LexTALE scores" title="" id="71" name="Picture"/>
+            <wp:docPr descr="Figure 1: Percentage of correct responses by word type" title="" id="37" name="Picture"/>
             <a:graphic>
               <a:graphicData uri="http://schemas.openxmlformats.org/drawingml/2006/picture">
                 <pic:pic>
                   <pic:nvPicPr>
-                    <pic:cNvPr descr="../plots/apapted_lextale_hist.png" id="72" name="Picture"/>
+                    <pic:cNvPr descr="main_files/a354b48f7ca136872546c802465ea0ba69be1903.png" id="38" name="Picture"/>
                     <pic:cNvPicPr>
                       <a:picLocks noChangeArrowheads="1" noChangeAspect="1"/>
                     </pic:cNvPicPr>
                   </pic:nvPicPr>
                   <pic:blipFill>
-                    <a:blip r:embed="rId70"/>
+                    <a:blip r:embed="rId36"/>
                     <a:stretch>
                       <a:fillRect/>
                     </a:stretch>
@@ -4139,7 +4429,7 @@
                   <pic:spPr bwMode="auto">
                     <a:xfrm>
                       <a:off x="0" y="0"/>
-                      <a:ext cx="4579632" cy="3662179"/>
+                      <a:ext cx="4579632" cy="3663706"/>
                     </a:xfrm>
                     <a:prstGeom prst="rect">
                       <a:avLst/>
@@ -4162,56 +4452,10 @@
       <w:pPr>
         <w:pStyle w:val="ImageCaption"/>
       </w:pPr>
-      <w:bookmarkStart w:id="73" w:name="fig:profplot"/>
-      <w:bookmarkEnd w:id="73"/>
-      <w:r>
-        <w:t xml:space="preserve">Figure 1: Histogram of the adapted LexTALE scores</w:t>
-      </w:r>
-    </w:p>
-    <w:bookmarkEnd w:id="74"/>
-    <w:bookmarkEnd w:id="75"/>
-    <w:bookmarkStart w:id="78" w:name="data-analysis"/>
-    <w:p>
-      <w:pPr>
-        <w:pStyle w:val="Heading2"/>
-      </w:pPr>
-      <w:r>
-        <w:t xml:space="preserve">Data Analysis</w:t>
-      </w:r>
-    </w:p>
-    <w:bookmarkStart w:id="76" w:name="analysis-justification"/>
-    <w:p>
-      <w:pPr>
-        <w:pStyle w:val="Heading3"/>
-      </w:pPr>
-      <w:r>
-        <w:t xml:space="preserve">Analysis justification</w:t>
-      </w:r>
-    </w:p>
-    <w:p>
-      <w:pPr>
-        <w:pStyle w:val="FirstParagraph"/>
-      </w:pPr>
-      <w:r>
-        <w:t xml:space="preserve">A Bayesian approach was chosen for two primary reasons.</w:t>
-      </w:r>
-      <w:r>
-        <w:t xml:space="preserve"> </w:t>
-      </w:r>
-      <w:r>
-        <w:t xml:space="preserve">First, Bayesian models allow for a more gradient analysis than the often used frequentist p-value, in which is is more typical to take a binary, all-or-nothing approach (e.g. there either is or is not evidence for a difference between conditions).</w:t>
-      </w:r>
-      <w:r>
-        <w:t xml:space="preserve"> </w:t>
-      </w:r>
-      <w:r>
-        <w:t xml:space="preserve">Additionally, frequentist models test against the null hypothesis, but are unable to provide direct evidence that the null hypothesis is true.</w:t>
-      </w:r>
-      <w:r>
-        <w:t xml:space="preserve"> </w:t>
-      </w:r>
-      <w:r>
-        <w:t xml:space="preserve">Taken together, the Bayesian Framework offers both flexibility and for more gradient interpretations of both the null and alternative hypotheses.</w:t>
+      <w:bookmarkStart w:id="39" w:name="fig:accuracy"/>
+      <w:bookmarkEnd w:id="39"/>
+      <w:r>
+        <w:t xml:space="preserve">Figure 1: Percentage of correct responses by word type</w:t>
       </w:r>
     </w:p>
     <w:p>
@@ -4219,40 +4463,31 @@
         <w:pStyle w:val="BodyText"/>
       </w:pPr>
       <w:r>
-        <w:t xml:space="preserve">In the Bayesian framework, several metrics are reported.</w:t>
-      </w:r>
-      <w:r>
-        <w:t xml:space="preserve"> </w:t>
-      </w:r>
-      <w:r>
-        <w:t xml:space="preserve">First, the 95% Highest Density Interval (95% HDI) refers to the range of the most credible 95% of the posterior distribution as determined by a probability density function.</w:t>
-      </w:r>
-      <w:r>
-        <w:t xml:space="preserve"> </w:t>
-      </w:r>
-      <w:r>
-        <w:t xml:space="preserve">Next, the probability of direction (pd) refers to the probability that a parameter is positive or negative and ranges from 50% to 100%.</w:t>
-      </w:r>
-      <w:r>
-        <w:t xml:space="preserve"> </w:t>
-      </w:r>
-      <w:r>
-        <w:t xml:space="preserve">It is mathematically defined as the proportion of the posterior distribution that is the same sign its median estimate</w:t>
-      </w:r>
-      <w:r>
-        <w:t xml:space="preserve"> </w:t>
-      </w:r>
-      <w:r>
-        <w:t xml:space="preserve">(Makowski, Ben-Shachar, Chen, &amp; Lüdecke, 2019)</w:t>
-      </w:r>
-      <w:r>
-        <w:t xml:space="preserve">.</w:t>
-      </w:r>
-      <w:r>
-        <w:t xml:space="preserve"> </w:t>
-      </w:r>
-      <w:r>
-        <w:t xml:space="preserve">Finally, the Region of Practical Equivalence (ROPE) is used to determine what proportion of the entire posterior distribution falls within researcher-specified upper and lower bounds and can be used to provide evidence for the null hypothesis.</w:t>
+        <w:t xml:space="preserve">Overall, there was evidence of a cumulative effect of cognate facilitation in accuracy.</w:t>
+      </w:r>
+      <w:r>
+        <w:t xml:space="preserve"> </w:t>
+      </w:r>
+      <w:r>
+        <w:t xml:space="preserve">Figure</w:t>
+      </w:r>
+      <w:r>
+        <w:t xml:space="preserve"> </w:t>
+      </w:r>
+      <w:r>
+        <w:t xml:space="preserve">1</w:t>
+      </w:r>
+      <w:r>
+        <w:t xml:space="preserve"> </w:t>
+      </w:r>
+      <w:r>
+        <w:t xml:space="preserve">shows the overall accuracy within the entire data set (6510 trials) excluding pseudowords (in which 79.85% of trials were correct)</w:t>
+      </w:r>
+      <w:r>
+        <w:t xml:space="preserve"> </w:t>
+      </w:r>
+      <w:r>
+        <w:t xml:space="preserve">Participants were most accurate for triple cognates (88.81%), followed by double cognates (81.69%) and non-cognates were the least accurate (63.57%).</w:t>
       </w:r>
     </w:p>
     <w:p>
@@ -4260,166 +4495,49 @@
         <w:pStyle w:val="BodyText"/>
       </w:pPr>
       <w:r>
-        <w:t xml:space="preserve">Although the HDI and ROPE can be combined to create decision rules (e.g., concluding that a difference is credible when the entire 95% HDI falls outside the ROPE</w:t>
-      </w:r>
-      <w:r>
-        <w:t xml:space="preserve"> </w:t>
-      </w:r>
-      <w:r>
-        <w:t xml:space="preserve">(Kruschke, 2018)</w:t>
-      </w:r>
-      <w:r>
-        <w:t xml:space="preserve">), such binary decisions are not required in Bayesian inference.</w:t>
-      </w:r>
-      <w:r>
-        <w:t xml:space="preserve"> </w:t>
-      </w:r>
-      <w:r>
-        <w:t xml:space="preserve">Rather, Bayesian analyses permit a more graded evaluation of evidence by examining the location and spread of the posterior distribution, the probability of direction, and the proportion of the posterior falling within the ROPE.</w:t>
-      </w:r>
-      <w:r>
-        <w:t xml:space="preserve"> </w:t>
-      </w:r>
-      <w:r>
-        <w:t xml:space="preserve">Consequently, evidence can be interpreted as varying continuously in strength rather than being reduced to a dichotomous significant/non-significant outcome.</w:t>
-      </w:r>
-    </w:p>
-    <w:bookmarkEnd w:id="76"/>
-    <w:bookmarkStart w:id="77" w:name="model-speficications"/>
-    <w:p>
-      <w:pPr>
-        <w:pStyle w:val="Heading3"/>
-      </w:pPr>
-      <w:r>
-        <w:t xml:space="preserve">Model speficications</w:t>
-      </w:r>
-    </w:p>
-    <w:p>
-      <w:pPr>
-        <w:pStyle w:val="FirstParagraph"/>
-      </w:pPr>
-      <w:r>
-        <w:t xml:space="preserve">The data were analyzed using two Bayesian multilevel regression models for accuracy and reaction time.</w:t>
-      </w:r>
-      <w:r>
-        <w:t xml:space="preserve"> </w:t>
-      </w:r>
-      <w:r>
-        <w:t xml:space="preserve">Both models were fit to the data using the brms</w:t>
-      </w:r>
-      <w:r>
-        <w:t xml:space="preserve"> </w:t>
-      </w:r>
-      <w:r>
-        <w:t xml:space="preserve">(Bürkner, 2017)</w:t>
-      </w:r>
-      <w:r>
-        <w:t xml:space="preserve"> </w:t>
-      </w:r>
-      <w:r>
-        <w:t xml:space="preserve">package in R and were estimated with Markov chain Monte Carlo sampling using 4 chains, each with 4000 iterations, including 2000 warm-up.</w:t>
-      </w:r>
-      <w:r>
-        <w:t xml:space="preserve"> </w:t>
-      </w:r>
-      <w:r>
-        <w:t xml:space="preserve">Model convergence was evaluated using effective sample sizes and R-hat values.</w:t>
-      </w:r>
-      <w:r>
-        <w:t xml:space="preserve"> </w:t>
-      </w:r>
-      <w:r>
-        <w:t xml:space="preserve">All regression coefficients were assigned Student’s t(3, 0, 2.5) priors, while the residual standard deviation was assigned a half-Student’s t(3, 0, 2.5) prior.</w:t>
-      </w:r>
-      <w:r>
-        <w:t xml:space="preserve"> </w:t>
-      </w:r>
-      <w:r>
-        <w:t xml:space="preserve">The accuracy model was a multilevel Bayesian logistic regression model that predicted the log-odds of a correct trial (coded as 1 or 0) as a function of the fixed effect predictors word type (3 levels: non-cognate, two-way cognate, three-way cognate; reference level two-way cognates), lexical frequency (z-scored log frequency), and proficiency (z-scored adapted LexTALE score).</w:t>
-      </w:r>
-      <w:r>
-        <w:t xml:space="preserve"> </w:t>
-      </w:r>
-      <w:r>
-        <w:t xml:space="preserve">The random effects structure include a random slope for each participant and a random intercept for word (stimulus).</w:t>
-      </w:r>
-      <w:r>
-        <w:t xml:space="preserve"> </w:t>
-      </w:r>
-      <w:r>
-        <w:t xml:space="preserve">The ROPE was set to +/-0.18 in log-odds, proportional to a negligible effect size of Cohen’s d = .1</w:t>
-      </w:r>
-      <w:r>
-        <w:t xml:space="preserve"> </w:t>
-      </w:r>
-      <w:r>
-        <w:t xml:space="preserve">(Plonsky &amp; Oswald, 2014)</w:t>
-      </w:r>
-      <w:r>
-        <w:t xml:space="preserve">.</w:t>
-      </w:r>
-      <w:r>
-        <w:t xml:space="preserve"> </w:t>
-      </w:r>
-      <w:r>
-        <w:t xml:space="preserve">The reaction time model predicted the log reaction time of correct responses as a function of the same predictors and random effect structure.</w:t>
-      </w:r>
-      <w:r>
-        <w:t xml:space="preserve"> </w:t>
-      </w:r>
-      <w:r>
-        <w:t xml:space="preserve">In this case, the ROPE was set to +/-0.0065 log reaction time, or +/- approximately 5ms.</w:t>
-      </w:r>
-    </w:p>
-    <w:bookmarkEnd w:id="77"/>
-    <w:bookmarkEnd w:id="78"/>
-    <w:bookmarkEnd w:id="79"/>
-    <w:bookmarkStart w:id="117" w:name="results"/>
-    <w:p>
-      <w:pPr>
-        <w:pStyle w:val="Heading1"/>
-      </w:pPr>
-      <w:r>
-        <w:t xml:space="preserve">Results</w:t>
-      </w:r>
-    </w:p>
-    <w:bookmarkStart w:id="80" w:name="data-trimming"/>
-    <w:p>
-      <w:pPr>
-        <w:pStyle w:val="Heading2"/>
-      </w:pPr>
-      <w:r>
-        <w:t xml:space="preserve">Data trimming</w:t>
-      </w:r>
-    </w:p>
-    <w:p>
-      <w:pPr>
-        <w:pStyle w:val="FirstParagraph"/>
-      </w:pPr>
-      <w:r>
-        <w:t xml:space="preserve">The data set for accuracy included 35 participants contained a total of 6720 data points (192 trials x 35 participants) and maintained all correct and incorrect trials.</w:t>
-      </w:r>
-      <w:r>
-        <w:t xml:space="preserve"> </w:t>
-      </w:r>
-      <w:r>
-        <w:t xml:space="preserve">Due to an error, three stimulus items were duplicated in the data (two non-cognates and one double cognate) and were subsequently omitted from further analysis, resulting in a total of 6510 data points (186 per participant).</w:t>
-      </w:r>
-      <w:r>
-        <w:t xml:space="preserve"> </w:t>
-      </w:r>
-      <w:r>
-        <w:t xml:space="preserve">For reaction time the analyzed data frame contained 2180 data points after removing pseudoword trials (n = 3360), incorrect trials (n = 1473), trials that were too fast (n = 195) or too slow (n = 417). Some trials fit multiple criteria for removal, and a trial was considered too fast or too slow when the reaction time was under 500ms or over 2 seconds.</w:t>
-      </w:r>
-    </w:p>
-    <w:bookmarkEnd w:id="80"/>
-    <w:bookmarkStart w:id="98" w:name="accuracy"/>
-    <w:p>
-      <w:pPr>
-        <w:pStyle w:val="Heading2"/>
-      </w:pPr>
-      <w:r>
-        <w:t xml:space="preserve">Accuracy</w:t>
+        <w:t xml:space="preserve">For most individual participants, cognates were helpful in correctly answered a trial, but there were a few exceptions.</w:t>
+      </w:r>
+      <w:r>
+        <w:t xml:space="preserve"> </w:t>
+      </w:r>
+      <w:r>
+        <w:t xml:space="preserve">Figure</w:t>
+      </w:r>
+      <w:r>
+        <w:t xml:space="preserve"> </w:t>
+      </w:r>
+      <w:r>
+        <w:t xml:space="preserve">2</w:t>
+      </w:r>
+      <w:r>
+        <w:t xml:space="preserve"> </w:t>
+      </w:r>
+      <w:r>
+        <w:t xml:space="preserve">shows histograms of individuals’ percentage of correct trials in each word-type.</w:t>
+      </w:r>
+      <w:r>
+        <w:t xml:space="preserve"> </w:t>
+      </w:r>
+      <w:r>
+        <w:t xml:space="preserve">Individual accuracy in non-cognates ranged from 27.27 % of trials correct to 97.73% (median 63.64%).</w:t>
+      </w:r>
+      <w:r>
+        <w:t xml:space="preserve"> </w:t>
+      </w:r>
+      <w:r>
+        <w:t xml:space="preserve">Like the data set as a whole, the median of individual percentages correct for the triple cognates was the highest: 91.67% (range 58.33% - 100.00%), followed by double cognates (median percentage correct = 81.82%; range = 50.00% - 100.00).</w:t>
+      </w:r>
+      <w:r>
+        <w:t xml:space="preserve"> </w:t>
+      </w:r>
+      <w:r>
+        <w:t xml:space="preserve">Taken together, these descriptive results suggest that, while most participants benefit from cognates in accuracy, a minority also experience steep drops in accuracy.</w:t>
+      </w:r>
+      <w:r>
+        <w:t xml:space="preserve"> </w:t>
+      </w:r>
+      <w:r>
+        <w:t xml:space="preserve">Indeed, two participants showed the opposite of expected and were most accurate in non-cognates (60.4% and 68.7%) and much less accurate in two-way (25% and 16.7%) and triple cognates (20.8% and 8.3%).</w:t>
       </w:r>
     </w:p>
     <w:p>
@@ -4429,20 +4547,20 @@
       <w:r>
         <w:drawing>
           <wp:inline>
-            <wp:extent cx="4579632" cy="3662179"/>
+            <wp:extent cx="4579632" cy="3663706"/>
             <wp:effectExtent b="0" l="0" r="0" t="0"/>
-            <wp:docPr descr="Figure 2: Percentage of correct responses by word type" title="" id="82" name="Picture"/>
+            <wp:docPr descr="Figure 2: Histograms of individual percentages corrects by word type" title="" id="41" name="Picture"/>
             <a:graphic>
               <a:graphicData uri="http://schemas.openxmlformats.org/drawingml/2006/picture">
                 <pic:pic>
                   <pic:nvPicPr>
-                    <pic:cNvPr descr="../plots/overall_acc.png" id="83" name="Picture"/>
+                    <pic:cNvPr descr="main_files/d9674eaf13c03b4af440db2d7919de643149fee0.png" id="42" name="Picture"/>
                     <pic:cNvPicPr>
                       <a:picLocks noChangeArrowheads="1" noChangeAspect="1"/>
                     </pic:cNvPicPr>
                   </pic:nvPicPr>
                   <pic:blipFill>
-                    <a:blip r:embed="rId81"/>
+                    <a:blip r:embed="rId40"/>
                     <a:stretch>
                       <a:fillRect/>
                     </a:stretch>
@@ -4450,7 +4568,7 @@
                   <pic:spPr bwMode="auto">
                     <a:xfrm>
                       <a:off x="0" y="0"/>
-                      <a:ext cx="4579632" cy="3662179"/>
+                      <a:ext cx="4579632" cy="3663706"/>
                     </a:xfrm>
                     <a:prstGeom prst="rect">
                       <a:avLst/>
@@ -4473,10 +4591,10 @@
       <w:pPr>
         <w:pStyle w:val="ImageCaption"/>
       </w:pPr>
-      <w:bookmarkStart w:id="84" w:name="fig:accuracy"/>
-      <w:bookmarkEnd w:id="84"/>
-      <w:r>
-        <w:t xml:space="preserve">Figure 2: Percentage of correct responses by word type</w:t>
+      <w:bookmarkStart w:id="43" w:name="fig:accuracyind"/>
+      <w:bookmarkEnd w:id="43"/>
+      <w:r>
+        <w:t xml:space="preserve">Figure 2: Histograms of individual percentages corrects by word type</w:t>
       </w:r>
     </w:p>
     <w:p>
@@ -4484,7 +4602,7 @@
         <w:pStyle w:val="BodyText"/>
       </w:pPr>
       <w:r>
-        <w:t xml:space="preserve">Overall, there was evidence of a cumulative effect of cognate facilitation in accuracy.</w:t>
+        <w:t xml:space="preserve">L3 proficiency, as measured by the adapted LexTALE was more beneficial for accuracy at lower levels of proficiency.</w:t>
       </w:r>
       <w:r>
         <w:t xml:space="preserve"> </w:t>
@@ -4496,69 +4614,43 @@
         <w:t xml:space="preserve"> </w:t>
       </w:r>
       <w:r>
-        <w:t xml:space="preserve">2</w:t>
-      </w:r>
-      <w:r>
-        <w:t xml:space="preserve"> </w:t>
-      </w:r>
-      <w:r>
-        <w:t xml:space="preserve">shows the overall accuracy within the entire data set (6510 trials) excluding pseudowords (in which 79.85% of trials were correct)</w:t>
-      </w:r>
-      <w:r>
-        <w:t xml:space="preserve"> </w:t>
-      </w:r>
-      <w:r>
-        <w:t xml:space="preserve">Participants were most accurate for triple cognates (88.81%), followed by double cognates (81.69%) and non-cognates were the least accurate (63.57%).</w:t>
-      </w:r>
-    </w:p>
-    <w:p>
-      <w:pPr>
-        <w:pStyle w:val="BodyText"/>
-      </w:pPr>
-      <w:r>
-        <w:t xml:space="preserve">For most individual participants, cognates were helpful in correctly answered a trial, but there were a few exceptions.</w:t>
-      </w:r>
-      <w:r>
-        <w:t xml:space="preserve"> </w:t>
-      </w:r>
-      <w:r>
-        <w:t xml:space="preserve">Figure</w:t>
-      </w:r>
-      <w:r>
-        <w:t xml:space="preserve"> </w:t>
-      </w:r>
-      <w:r>
         <w:t xml:space="preserve">3</w:t>
       </w:r>
       <w:r>
         <w:t xml:space="preserve"> </w:t>
       </w:r>
       <w:r>
-        <w:t xml:space="preserve">shows histograms of individuals’ percentage of correct trials in each word-type.</w:t>
-      </w:r>
-      <w:r>
-        <w:t xml:space="preserve"> </w:t>
-      </w:r>
-      <w:r>
-        <w:t xml:space="preserve">Individual accuracy in non-cognates ranged from 27.27 % of trials correct to 97.73% (median 63.64%).</w:t>
-      </w:r>
-      <w:r>
-        <w:t xml:space="preserve"> </w:t>
-      </w:r>
-      <w:r>
-        <w:t xml:space="preserve">Like the data set as a whole, the median of individual percentages correct for the triple cognates was the highest: 91.67% (range 58.33% - 100.00%), followed by double cognates (median percentage correct = 81.82%; range = 50.00% - 100.00).</w:t>
-      </w:r>
-      <w:r>
-        <w:t xml:space="preserve"> </w:t>
-      </w:r>
-      <w:r>
-        <w:t xml:space="preserve">Taken together, these descriptive results suggest that, while most participants benefit from cognates in accuracy, a minority also experience steep drops in accuracy.</w:t>
-      </w:r>
-      <w:r>
-        <w:t xml:space="preserve"> </w:t>
-      </w:r>
-      <w:r>
-        <w:t xml:space="preserve">Indeed, two participants showed the opposite of expected and were most accurate in non-cognates (60.4% and 68.7%) and much less accurate in two-way (25% and 16.7%) and triple cognates (20.8% and 8.3%).</w:t>
+        <w:t xml:space="preserve">shows the change in accuracy for non-cogates relative to both double and triple cognates.</w:t>
+      </w:r>
+      <w:r>
+        <w:t xml:space="preserve"> </w:t>
+      </w:r>
+      <w:r>
+        <w:t xml:space="preserve">A positive value on the plot refers to an advantage for that cognate types of the value on the y-axis.</w:t>
+      </w:r>
+      <w:r>
+        <w:t xml:space="preserve"> </w:t>
+      </w:r>
+      <w:r>
+        <w:t xml:space="preserve">For example, a value of 40 on the y-axis means that a specific participant was 40% more accurate in a cognate condition than non-cognates.</w:t>
+      </w:r>
+      <w:r>
+        <w:t xml:space="preserve"> </w:t>
+      </w:r>
+      <w:r>
+        <w:t xml:space="preserve">On the other hand, negative values suggest they were less accurate.</w:t>
+      </w:r>
+      <w:r>
+        <w:t xml:space="preserve"> </w:t>
+      </w:r>
+      <w:r>
+        <w:t xml:space="preserve">The fitted lines represent the predicted increase in accuracy as proficiency increases.</w:t>
+      </w:r>
+      <w:r>
+        <w:t xml:space="preserve"> </w:t>
+      </w:r>
+      <w:r>
+        <w:t xml:space="preserve">The negative slope suggests that as proficiency increases, the relative benefit of cognate status for accuracy diminishes.</w:t>
       </w:r>
     </w:p>
     <w:p>
@@ -4568,20 +4660,20 @@
       <w:r>
         <w:drawing>
           <wp:inline>
-            <wp:extent cx="4579632" cy="3662179"/>
+            <wp:extent cx="4579632" cy="3663706"/>
             <wp:effectExtent b="0" l="0" r="0" t="0"/>
-            <wp:docPr descr="Figure 3: Histograms of individual percentages corrects by word type" title="" id="86" name="Picture"/>
+            <wp:docPr descr="Figure 3: Increase in accuracy as a function of proficiency and word type" title="" id="45" name="Picture"/>
             <a:graphic>
               <a:graphicData uri="http://schemas.openxmlformats.org/drawingml/2006/picture">
                 <pic:pic>
                   <pic:nvPicPr>
-                    <pic:cNvPr descr="../plots/ind_acc.png" id="87" name="Picture"/>
+                    <pic:cNvPr descr="main_files/a0acd71f9cde22dfb5da8847a8379a0a1a0b14d5.png" id="46" name="Picture"/>
                     <pic:cNvPicPr>
                       <a:picLocks noChangeArrowheads="1" noChangeAspect="1"/>
                     </pic:cNvPicPr>
                   </pic:nvPicPr>
                   <pic:blipFill>
-                    <a:blip r:embed="rId85"/>
+                    <a:blip r:embed="rId44"/>
                     <a:stretch>
                       <a:fillRect/>
                     </a:stretch>
@@ -4589,7 +4681,7 @@
                   <pic:spPr bwMode="auto">
                     <a:xfrm>
                       <a:off x="0" y="0"/>
-                      <a:ext cx="4579632" cy="3662179"/>
+                      <a:ext cx="4579632" cy="3663706"/>
                     </a:xfrm>
                     <a:prstGeom prst="rect">
                       <a:avLst/>
@@ -4612,131 +4704,18 @@
       <w:pPr>
         <w:pStyle w:val="ImageCaption"/>
       </w:pPr>
-      <w:bookmarkStart w:id="88" w:name="fig:accuracyind"/>
-      <w:bookmarkEnd w:id="88"/>
-      <w:r>
-        <w:t xml:space="preserve">Figure 3: Histograms of individual percentages corrects by word type</w:t>
-      </w:r>
-    </w:p>
-    <w:p>
-      <w:pPr>
-        <w:pStyle w:val="BodyText"/>
-      </w:pPr>
-      <w:r>
-        <w:t xml:space="preserve">L3 proficiency, as measured by the adapted LexTALE was more beneficial for accuracy at lower levels of proficiency.</w:t>
-      </w:r>
-      <w:r>
-        <w:t xml:space="preserve"> </w:t>
-      </w:r>
-      <w:r>
-        <w:t xml:space="preserve">Figure</w:t>
-      </w:r>
-      <w:r>
-        <w:t xml:space="preserve"> </w:t>
-      </w:r>
-      <w:r>
-        <w:t xml:space="preserve">4</w:t>
-      </w:r>
-      <w:r>
-        <w:t xml:space="preserve"> </w:t>
-      </w:r>
-      <w:r>
-        <w:t xml:space="preserve">shows the change in accuracy for non-cogates relative to both double and triple cognates.</w:t>
-      </w:r>
-      <w:r>
-        <w:t xml:space="preserve"> </w:t>
-      </w:r>
-      <w:r>
-        <w:t xml:space="preserve">A positive value on the plot refers to an advantage for that cognate types of the value on the y-axis.</w:t>
-      </w:r>
-      <w:r>
-        <w:t xml:space="preserve"> </w:t>
-      </w:r>
-      <w:r>
-        <w:t xml:space="preserve">For example, a value of 40 on the y-axis means that a specific participant was 40% more accurate in a cognate condition than non-cognates.</w:t>
-      </w:r>
-      <w:r>
-        <w:t xml:space="preserve"> </w:t>
-      </w:r>
-      <w:r>
-        <w:t xml:space="preserve">On the other hand, negative values suggest they were less accurate.</w:t>
-      </w:r>
-      <w:r>
-        <w:t xml:space="preserve"> </w:t>
-      </w:r>
-      <w:r>
-        <w:t xml:space="preserve">The fitted lines represent the predicted increase in accuracy as proficiency increases.</w:t>
-      </w:r>
-      <w:r>
-        <w:t xml:space="preserve"> </w:t>
-      </w:r>
-      <w:r>
-        <w:t xml:space="preserve">The negative slope suggests that as proficiency increases, the relative benefit of cognate status for accuracy diminishes.</w:t>
-      </w:r>
-    </w:p>
-    <w:p>
-      <w:pPr>
-        <w:pStyle w:val="CaptionedFigure"/>
-      </w:pPr>
-      <w:r>
-        <w:drawing>
-          <wp:inline>
-            <wp:extent cx="4579632" cy="3662179"/>
-            <wp:effectExtent b="0" l="0" r="0" t="0"/>
-            <wp:docPr descr="Figure 4: Increase in accuracy as a function of proficiency and word type" title="" id="90" name="Picture"/>
-            <a:graphic>
-              <a:graphicData uri="http://schemas.openxmlformats.org/drawingml/2006/picture">
-                <pic:pic>
-                  <pic:nvPicPr>
-                    <pic:cNvPr descr="../plots/ind_acc_prof.png" id="91" name="Picture"/>
-                    <pic:cNvPicPr>
-                      <a:picLocks noChangeArrowheads="1" noChangeAspect="1"/>
-                    </pic:cNvPicPr>
-                  </pic:nvPicPr>
-                  <pic:blipFill>
-                    <a:blip r:embed="rId89"/>
-                    <a:stretch>
-                      <a:fillRect/>
-                    </a:stretch>
-                  </pic:blipFill>
-                  <pic:spPr bwMode="auto">
-                    <a:xfrm>
-                      <a:off x="0" y="0"/>
-                      <a:ext cx="4579632" cy="3662179"/>
-                    </a:xfrm>
-                    <a:prstGeom prst="rect">
-                      <a:avLst/>
-                    </a:prstGeom>
-                    <a:noFill/>
-                    <a:ln w="9525">
-                      <a:noFill/>
-                      <a:headEnd/>
-                      <a:tailEnd/>
-                    </a:ln>
-                  </pic:spPr>
-                </pic:pic>
-              </a:graphicData>
-            </a:graphic>
-          </wp:inline>
-        </w:drawing>
-      </w:r>
-    </w:p>
-    <w:p>
-      <w:pPr>
-        <w:pStyle w:val="ImageCaption"/>
-      </w:pPr>
-      <w:bookmarkStart w:id="92" w:name="fig:accuracyindpro"/>
-      <w:bookmarkEnd w:id="92"/>
-      <w:r>
-        <w:t xml:space="preserve">Figure 4: Increase in accuracy as a function of proficiency and word type</w:t>
+      <w:bookmarkStart w:id="47" w:name="fig:accuracyindpro"/>
+      <w:bookmarkEnd w:id="47"/>
+      <w:r>
+        <w:t xml:space="preserve">Figure 3: Increase in accuracy as a function of proficiency and word type</w:t>
       </w:r>
     </w:p>
     <w:p>
       <w:pPr>
         <w:pStyle w:val="TableCaption"/>
       </w:pPr>
-      <w:bookmarkStart w:id="93" w:name="tab:unnamed-chunk-17"/>
-      <w:bookmarkEnd w:id="93"/>
+      <w:bookmarkStart w:id="48" w:name="tab:unnamed-chunk-16"/>
+      <w:bookmarkEnd w:id="48"/>
       <w:r>
         <w:t xml:space="preserve">Table 2:</w:t>
       </w:r>
@@ -7410,7 +7389,7 @@
         <w:t xml:space="preserve"> </w:t>
       </w:r>
       <w:r>
-        <w:t xml:space="preserve">5</w:t>
+        <w:t xml:space="preserve">7</w:t>
       </w:r>
       <w:r>
         <w:t xml:space="preserve"> </w:t>
@@ -7517,6 +7496,154 @@
         <w:t xml:space="preserve">Like frequency, the pd (1) and ROPE percentage (0) provide compelling evidence of that the effect is positive and not negligible.</w:t>
       </w:r>
     </w:p>
+    <w:bookmarkEnd w:id="49"/>
+    <w:bookmarkStart w:id="59" w:name="reaction-time"/>
+    <w:p>
+      <w:pPr>
+        <w:pStyle w:val="Heading2"/>
+      </w:pPr>
+      <w:r>
+        <w:t xml:space="preserve">Reaction time</w:t>
+      </w:r>
+    </w:p>
+    <w:p>
+      <w:pPr>
+        <w:pStyle w:val="FirstParagraph"/>
+      </w:pPr>
+      <w:r>
+        <w:t xml:space="preserve">Like accuracy, the analysis of the reaction time data showed evidence of a general cognate facilitation effect.</w:t>
+      </w:r>
+      <w:r>
+        <w:t xml:space="preserve"> </w:t>
+      </w:r>
+      <w:r>
+        <w:t xml:space="preserve">Figure</w:t>
+      </w:r>
+      <w:r>
+        <w:t xml:space="preserve"> </w:t>
+      </w:r>
+      <w:r>
+        <w:t xml:space="preserve">4</w:t>
+      </w:r>
+      <w:r>
+        <w:t xml:space="preserve"> </w:t>
+      </w:r>
+      <w:r>
+        <w:t xml:space="preserve">shows the overall mean reaction times in milliseconds in for each word type.</w:t>
+      </w:r>
+      <w:r>
+        <w:t xml:space="preserve"> </w:t>
+      </w:r>
+      <w:r>
+        <w:t xml:space="preserve">Non-cognate words were recognized as real words slowest (mean reaction time 881.67ms, sd = 304.77), while both two-way (827.33ms, sd = 296.70) and triple cognates were recognized faster 817.38ms, sd = 263.04.</w:t>
+      </w:r>
+      <w:r>
+        <w:t xml:space="preserve"> </w:t>
+      </w:r>
+      <w:r>
+        <w:t xml:space="preserve">The difference in reaction time between two-way and triple cognates was quite small (d = .03).</w:t>
+      </w:r>
+    </w:p>
+    <w:p>
+      <w:pPr>
+        <w:pStyle w:val="BodyText"/>
+      </w:pPr>
+      <w:r>
+        <w:t xml:space="preserve">In the case of reaction time, there were even more pronounced differences regarding individual differences.</w:t>
+      </w:r>
+      <w:r>
+        <w:t xml:space="preserve"> </w:t>
+      </w:r>
+      <w:r>
+        <w:t xml:space="preserve">Figure</w:t>
+      </w:r>
+      <w:r>
+        <w:t xml:space="preserve"> </w:t>
+      </w:r>
+      <w:r>
+        <w:t xml:space="preserve">5</w:t>
+      </w:r>
+      <w:r>
+        <w:t xml:space="preserve"> </w:t>
+      </w:r>
+      <w:r>
+        <w:t xml:space="preserve">shows individual effect sizes in three situations: going from double to triple cognates, non-cognates to double cognates, and non-cognates to triple cognates.</w:t>
+      </w:r>
+      <w:r>
+        <w:t xml:space="preserve"> </w:t>
+      </w:r>
+      <w:r>
+        <w:t xml:space="preserve">It was predicted that if there was a cumulative effect of cognate facilitation, that double to triple cognates would yield negative effects.</w:t>
+      </w:r>
+      <w:r>
+        <w:t xml:space="preserve"> </w:t>
+      </w:r>
+      <w:r>
+        <w:t xml:space="preserve">However, many participants were faster (14 of 35) in double cognates than triple cognates, while the remaining 21 participants showed the opposite pattern and processed triple cognates fastest.</w:t>
+      </w:r>
+      <w:r>
+        <w:br/>
+      </w:r>
+      <w:r>
+        <w:t xml:space="preserve">The second facet shows the individual effects for non-cognates relative to double cognates.</w:t>
+      </w:r>
+      <w:r>
+        <w:br/>
+      </w:r>
+      <w:r>
+        <w:t xml:space="preserve">In this instance, as expected, most participants (26) were faster for double cognates than non-cognates, although 26 individuals were not.</w:t>
+      </w:r>
+      <w:r>
+        <w:t xml:space="preserve"> </w:t>
+      </w:r>
+      <w:r>
+        <w:t xml:space="preserve">Similar proportions of participants were also faster at deciding that triple cognates were real words (27).</w:t>
+      </w:r>
+      <w:r>
+        <w:t xml:space="preserve"> </w:t>
+      </w:r>
+      <w:r>
+        <w:t xml:space="preserve">Taken together, these results suggest that while most individuals showed descriptive evidence general cognate effects in reaction time, there was not strong evidence for a cumulative effect in which triple cognates were processed faster than double cognates.</w:t>
+      </w:r>
+    </w:p>
+    <w:p>
+      <w:pPr>
+        <w:pStyle w:val="BodyText"/>
+      </w:pPr>
+      <w:r>
+        <w:t xml:space="preserve">Unlike accuracy, there was no descriptive evidence regarding a relationship between differences in reaction time and L3 proficiency.</w:t>
+      </w:r>
+      <w:r>
+        <w:t xml:space="preserve"> </w:t>
+      </w:r>
+      <w:r>
+        <w:t xml:space="preserve">Figure</w:t>
+      </w:r>
+      <w:r>
+        <w:t xml:space="preserve"> </w:t>
+      </w:r>
+      <w:r>
+        <w:t xml:space="preserve">9</w:t>
+      </w:r>
+      <w:r>
+        <w:t xml:space="preserve"> </w:t>
+      </w:r>
+      <w:r>
+        <w:t xml:space="preserve">shows the individual effect sizes for non-cognates to double cognates, non-cognates to triple cognates, and cumulative (double cognate to triple cognates).</w:t>
+      </w:r>
+      <w:r>
+        <w:t xml:space="preserve"> </w:t>
+      </w:r>
+      <w:r>
+        <w:t xml:space="preserve">A negative value in this case indicates that a specific participant was faster in the latter conditon (e.g. a negative value for non-cognates to double cognates would show that the participant reacted faster on average to double cognates).</w:t>
+      </w:r>
+      <w:r>
+        <w:t xml:space="preserve"> </w:t>
+      </w:r>
+      <w:r>
+        <w:t xml:space="preserve">The relatively flat slopes on the fitted lines in each case suggests that the mangnitude of effects does not vary by proficiency level.</w:t>
+      </w:r>
+    </w:p>
     <w:p>
       <w:pPr>
         <w:pStyle w:val="CaptionedFigure"/>
@@ -7524,20 +7651,20 @@
       <w:r>
         <w:drawing>
           <wp:inline>
-            <wp:extent cx="4579632" cy="3662179"/>
+            <wp:extent cx="4579632" cy="3663706"/>
             <wp:effectExtent b="0" l="0" r="0" t="0"/>
-            <wp:docPr descr="Figure 5: Posterior Distributions of the accuracy model" title="" id="95" name="Picture"/>
+            <wp:docPr descr="Figure 4: Mean reaction time of each word type" title="" id="51" name="Picture"/>
             <a:graphic>
               <a:graphicData uri="http://schemas.openxmlformats.org/drawingml/2006/picture">
                 <pic:pic>
                   <pic:nvPicPr>
-                    <pic:cNvPr descr="../plots/acc_mod.png" id="96" name="Picture"/>
+                    <pic:cNvPr descr="main_files/75cd5a3b998aaffe6c07506be692e9ce5118dc84.png" id="52" name="Picture"/>
                     <pic:cNvPicPr>
                       <a:picLocks noChangeArrowheads="1" noChangeAspect="1"/>
                     </pic:cNvPicPr>
                   </pic:nvPicPr>
                   <pic:blipFill>
-                    <a:blip r:embed="rId94"/>
+                    <a:blip r:embed="rId50"/>
                     <a:stretch>
                       <a:fillRect/>
                     </a:stretch>
@@ -7545,7 +7672,7 @@
                   <pic:spPr bwMode="auto">
                     <a:xfrm>
                       <a:off x="0" y="0"/>
-                      <a:ext cx="4579632" cy="3662179"/>
+                      <a:ext cx="4579632" cy="3663706"/>
                     </a:xfrm>
                     <a:prstGeom prst="rect">
                       <a:avLst/>
@@ -7568,158 +7695,10 @@
       <w:pPr>
         <w:pStyle w:val="ImageCaption"/>
       </w:pPr>
-      <w:bookmarkStart w:id="97" w:name="fig:accmod"/>
-      <w:bookmarkEnd w:id="97"/>
-      <w:r>
-        <w:t xml:space="preserve">Figure 5: Posterior Distributions of the accuracy model</w:t>
-      </w:r>
-    </w:p>
-    <w:bookmarkEnd w:id="98"/>
-    <w:bookmarkStart w:id="116" w:name="reaction-time"/>
-    <w:p>
-      <w:pPr>
-        <w:pStyle w:val="Heading2"/>
-      </w:pPr>
-      <w:r>
-        <w:t xml:space="preserve">Reaction time</w:t>
-      </w:r>
-    </w:p>
-    <w:p>
-      <w:pPr>
-        <w:pStyle w:val="FirstParagraph"/>
-      </w:pPr>
-      <w:r>
-        <w:t xml:space="preserve">Like accuracy, the analysis of the reaction time data showed evidence of a general cognate facilitation effect.</w:t>
-      </w:r>
-      <w:r>
-        <w:t xml:space="preserve"> </w:t>
-      </w:r>
-      <w:r>
-        <w:t xml:space="preserve">Figure</w:t>
-      </w:r>
-      <w:r>
-        <w:t xml:space="preserve"> </w:t>
-      </w:r>
-      <w:r>
-        <w:t xml:space="preserve">6</w:t>
-      </w:r>
-      <w:r>
-        <w:t xml:space="preserve"> </w:t>
-      </w:r>
-      <w:r>
-        <w:t xml:space="preserve">shows the overall mean reaction times in milliseconds in for each word type.</w:t>
-      </w:r>
-      <w:r>
-        <w:t xml:space="preserve"> </w:t>
-      </w:r>
-      <w:r>
-        <w:t xml:space="preserve">Non-cognate words were recognized as real words slowest (mean reaction time 881.67ms, sd = 304.77), while both two-way (827.33ms, sd = 296.70) and triple cognates were recognized faster 817.38ms, sd = 263.04.</w:t>
-      </w:r>
-      <w:r>
-        <w:t xml:space="preserve"> </w:t>
-      </w:r>
-      <w:r>
-        <w:t xml:space="preserve">The difference in reaction time between two-way and triple cognates was quite small (d = .03).</w:t>
-      </w:r>
-    </w:p>
-    <w:p>
-      <w:pPr>
-        <w:pStyle w:val="BodyText"/>
-      </w:pPr>
-      <w:r>
-        <w:t xml:space="preserve">In the case of reaction time, there were even more pronounced differences regarding individual differences.</w:t>
-      </w:r>
-      <w:r>
-        <w:t xml:space="preserve"> </w:t>
-      </w:r>
-      <w:r>
-        <w:t xml:space="preserve">Figure</w:t>
-      </w:r>
-      <w:r>
-        <w:t xml:space="preserve"> </w:t>
-      </w:r>
-      <w:r>
-        <w:t xml:space="preserve">7</w:t>
-      </w:r>
-      <w:r>
-        <w:t xml:space="preserve"> </w:t>
-      </w:r>
-      <w:r>
-        <w:t xml:space="preserve">shows individual effect sizes in three situations: going from double to triple cognates, non-cognates to double cognates, and non-cognates to triple cognates.</w:t>
-      </w:r>
-      <w:r>
-        <w:t xml:space="preserve"> </w:t>
-      </w:r>
-      <w:r>
-        <w:t xml:space="preserve">It was predicted that if there was a cumulative effect of cognate facilitation, that double to triple cognates would yield negative effects.</w:t>
-      </w:r>
-      <w:r>
-        <w:t xml:space="preserve"> </w:t>
-      </w:r>
-      <w:r>
-        <w:t xml:space="preserve">However, many participants were faster (14 of 35) in double cognates than triple cognates, while the remaining 21 participants showed the opposite pattern and processed triple cognates fastest.</w:t>
-      </w:r>
-      <w:r>
-        <w:br/>
-      </w:r>
-      <w:r>
-        <w:t xml:space="preserve">The second facet shows the individual effects for non-cognates relative to double cognates.</w:t>
-      </w:r>
-      <w:r>
-        <w:br/>
-      </w:r>
-      <w:r>
-        <w:t xml:space="preserve">In this instance, as expected, most participants (26) were faster for double cognates than non-cognates, although 26 individuals were not.</w:t>
-      </w:r>
-      <w:r>
-        <w:t xml:space="preserve"> </w:t>
-      </w:r>
-      <w:r>
-        <w:t xml:space="preserve">Similar proportions of participants were also faster at deciding that triple cognates were real words (27).</w:t>
-      </w:r>
-      <w:r>
-        <w:t xml:space="preserve"> </w:t>
-      </w:r>
-      <w:r>
-        <w:t xml:space="preserve">Taken together, these results suggest that while most individuals showed descriptive evidence general cognate effects in reaction time, there was not strong evidence for a cumulative effect in which triple cognates were processed faster than double cognates.</w:t>
-      </w:r>
-    </w:p>
-    <w:p>
-      <w:pPr>
-        <w:pStyle w:val="BodyText"/>
-      </w:pPr>
-      <w:r>
-        <w:t xml:space="preserve">Unlike accuracy, there was no descriptive evidence regarding a relationship between differences in reaction time and L3 proficiency.</w:t>
-      </w:r>
-      <w:r>
-        <w:t xml:space="preserve"> </w:t>
-      </w:r>
-      <w:r>
-        <w:t xml:space="preserve">Figure</w:t>
-      </w:r>
-      <w:r>
-        <w:t xml:space="preserve"> </w:t>
-      </w:r>
-      <w:r>
-        <w:t xml:space="preserve">8</w:t>
-      </w:r>
-      <w:r>
-        <w:t xml:space="preserve"> </w:t>
-      </w:r>
-      <w:r>
-        <w:t xml:space="preserve">shows the individual effect sizes for non-cognates to double cognates, non-cognates to triple cognates, and cumulative (double cognate to triple cognates).</w:t>
-      </w:r>
-      <w:r>
-        <w:t xml:space="preserve"> </w:t>
-      </w:r>
-      <w:r>
-        <w:t xml:space="preserve">A negative value in this case indicates that a specific participant was faster in the latter conditon (e.g. a negative value for non-cognates to double cognates would show that the participant reacted faster on average to double cognates).</w:t>
-      </w:r>
-      <w:r>
-        <w:t xml:space="preserve"> </w:t>
-      </w:r>
-      <w:r>
-        <w:t xml:space="preserve">The relatively flat slopes on the fitted lines in each case suggests that the mangnitude of effects does not vary by proficiency level.</w:t>
+      <w:bookmarkStart w:id="53" w:name="fig:overt"/>
+      <w:bookmarkEnd w:id="53"/>
+      <w:r>
+        <w:t xml:space="preserve">Figure 4: Mean reaction time of each word type</w:t>
       </w:r>
     </w:p>
     <w:p>
@@ -7729,20 +7708,20 @@
       <w:r>
         <w:drawing>
           <wp:inline>
-            <wp:extent cx="4579632" cy="3662179"/>
+            <wp:extent cx="4579632" cy="3663706"/>
             <wp:effectExtent b="0" l="0" r="0" t="0"/>
-            <wp:docPr descr="Figure 6: Mean reaction time of each word type" title="" id="100" name="Picture"/>
+            <wp:docPr descr="Figure 5: Individual effects in reaction times" title="" id="55" name="Picture"/>
             <a:graphic>
               <a:graphicData uri="http://schemas.openxmlformats.org/drawingml/2006/picture">
                 <pic:pic>
                   <pic:nvPicPr>
-                    <pic:cNvPr descr="../plots/over_rt.png" id="101" name="Picture"/>
+                    <pic:cNvPr descr="main_files/34346b50033ae99cea065f06bdc56e5ec35cc7c3.png" id="56" name="Picture"/>
                     <pic:cNvPicPr>
                       <a:picLocks noChangeArrowheads="1" noChangeAspect="1"/>
                     </pic:cNvPicPr>
                   </pic:nvPicPr>
                   <pic:blipFill>
-                    <a:blip r:embed="rId99"/>
+                    <a:blip r:embed="rId54"/>
                     <a:stretch>
                       <a:fillRect/>
                     </a:stretch>
@@ -7750,7 +7729,7 @@
                   <pic:spPr bwMode="auto">
                     <a:xfrm>
                       <a:off x="0" y="0"/>
-                      <a:ext cx="4579632" cy="3662179"/>
+                      <a:ext cx="4579632" cy="3663706"/>
                     </a:xfrm>
                     <a:prstGeom prst="rect">
                       <a:avLst/>
@@ -7773,189 +7752,18 @@
       <w:pPr>
         <w:pStyle w:val="ImageCaption"/>
       </w:pPr>
-      <w:bookmarkStart w:id="102" w:name="fig:overt"/>
-      <w:bookmarkEnd w:id="102"/>
-      <w:r>
-        <w:t xml:space="preserve">Figure 6: Mean reaction time of each word type</w:t>
-      </w:r>
-    </w:p>
-    <w:p>
-      <w:pPr>
-        <w:pStyle w:val="CaptionedFigure"/>
-      </w:pPr>
-      <w:r>
-        <w:drawing>
-          <wp:inline>
-            <wp:extent cx="4579632" cy="3662179"/>
-            <wp:effectExtent b="0" l="0" r="0" t="0"/>
-            <wp:docPr descr="Figure 7: Individual effects in reaction times" title="" id="104" name="Picture"/>
-            <a:graphic>
-              <a:graphicData uri="http://schemas.openxmlformats.org/drawingml/2006/picture">
-                <pic:pic>
-                  <pic:nvPicPr>
-                    <pic:cNvPr descr="../plots/ind_rt.png" id="105" name="Picture"/>
-                    <pic:cNvPicPr>
-                      <a:picLocks noChangeArrowheads="1" noChangeAspect="1"/>
-                    </pic:cNvPicPr>
-                  </pic:nvPicPr>
-                  <pic:blipFill>
-                    <a:blip r:embed="rId103"/>
-                    <a:stretch>
-                      <a:fillRect/>
-                    </a:stretch>
-                  </pic:blipFill>
-                  <pic:spPr bwMode="auto">
-                    <a:xfrm>
-                      <a:off x="0" y="0"/>
-                      <a:ext cx="4579632" cy="3662179"/>
-                    </a:xfrm>
-                    <a:prstGeom prst="rect">
-                      <a:avLst/>
-                    </a:prstGeom>
-                    <a:noFill/>
-                    <a:ln w="9525">
-                      <a:noFill/>
-                      <a:headEnd/>
-                      <a:tailEnd/>
-                    </a:ln>
-                  </pic:spPr>
-                </pic:pic>
-              </a:graphicData>
-            </a:graphic>
-          </wp:inline>
-        </w:drawing>
-      </w:r>
-    </w:p>
-    <w:p>
-      <w:pPr>
-        <w:pStyle w:val="ImageCaption"/>
-      </w:pPr>
-      <w:bookmarkStart w:id="106" w:name="fig:indrt"/>
-      <w:bookmarkEnd w:id="106"/>
-      <w:r>
-        <w:t xml:space="preserve">Figure 7: Individual effects in reaction times</w:t>
-      </w:r>
-    </w:p>
-    <w:p>
-      <w:pPr>
-        <w:pStyle w:val="CaptionedFigure"/>
-      </w:pPr>
-      <w:r>
-        <w:drawing>
-          <wp:inline>
-            <wp:extent cx="4579632" cy="3662179"/>
-            <wp:effectExtent b="0" l="0" r="0" t="0"/>
-            <wp:docPr descr="Figure 8: Individual effects in reaction times as a function of L3 proficiency" title="" id="108" name="Picture"/>
-            <a:graphic>
-              <a:graphicData uri="http://schemas.openxmlformats.org/drawingml/2006/picture">
-                <pic:pic>
-                  <pic:nvPicPr>
-                    <pic:cNvPr descr="../plots/rt_prof.png" id="109" name="Picture"/>
-                    <pic:cNvPicPr>
-                      <a:picLocks noChangeArrowheads="1" noChangeAspect="1"/>
-                    </pic:cNvPicPr>
-                  </pic:nvPicPr>
-                  <pic:blipFill>
-                    <a:blip r:embed="rId107"/>
-                    <a:stretch>
-                      <a:fillRect/>
-                    </a:stretch>
-                  </pic:blipFill>
-                  <pic:spPr bwMode="auto">
-                    <a:xfrm>
-                      <a:off x="0" y="0"/>
-                      <a:ext cx="4579632" cy="3662179"/>
-                    </a:xfrm>
-                    <a:prstGeom prst="rect">
-                      <a:avLst/>
-                    </a:prstGeom>
-                    <a:noFill/>
-                    <a:ln w="9525">
-                      <a:noFill/>
-                      <a:headEnd/>
-                      <a:tailEnd/>
-                    </a:ln>
-                  </pic:spPr>
-                </pic:pic>
-              </a:graphicData>
-            </a:graphic>
-          </wp:inline>
-        </w:drawing>
-      </w:r>
-    </w:p>
-    <w:p>
-      <w:pPr>
-        <w:pStyle w:val="ImageCaption"/>
-      </w:pPr>
-      <w:bookmarkStart w:id="110" w:name="fig:indrtprof"/>
-      <w:bookmarkEnd w:id="110"/>
-      <w:r>
-        <w:t xml:space="preserve">Figure 8: Individual effects in reaction times as a function of L3 proficiency</w:t>
-      </w:r>
-    </w:p>
-    <w:p>
-      <w:pPr>
-        <w:pStyle w:val="CaptionedFigure"/>
-      </w:pPr>
-      <w:r>
-        <w:drawing>
-          <wp:inline>
-            <wp:extent cx="4579632" cy="3662179"/>
-            <wp:effectExtent b="0" l="0" r="0" t="0"/>
-            <wp:docPr descr="Figure 9: Posterior Distributions of the reaction time model" title="" id="112" name="Picture"/>
-            <a:graphic>
-              <a:graphicData uri="http://schemas.openxmlformats.org/drawingml/2006/picture">
-                <pic:pic>
-                  <pic:nvPicPr>
-                    <pic:cNvPr descr="../plots/rt_mod.png" id="113" name="Picture"/>
-                    <pic:cNvPicPr>
-                      <a:picLocks noChangeArrowheads="1" noChangeAspect="1"/>
-                    </pic:cNvPicPr>
-                  </pic:nvPicPr>
-                  <pic:blipFill>
-                    <a:blip r:embed="rId111"/>
-                    <a:stretch>
-                      <a:fillRect/>
-                    </a:stretch>
-                  </pic:blipFill>
-                  <pic:spPr bwMode="auto">
-                    <a:xfrm>
-                      <a:off x="0" y="0"/>
-                      <a:ext cx="4579632" cy="3662179"/>
-                    </a:xfrm>
-                    <a:prstGeom prst="rect">
-                      <a:avLst/>
-                    </a:prstGeom>
-                    <a:noFill/>
-                    <a:ln w="9525">
-                      <a:noFill/>
-                      <a:headEnd/>
-                      <a:tailEnd/>
-                    </a:ln>
-                  </pic:spPr>
-                </pic:pic>
-              </a:graphicData>
-            </a:graphic>
-          </wp:inline>
-        </w:drawing>
-      </w:r>
-    </w:p>
-    <w:p>
-      <w:pPr>
-        <w:pStyle w:val="ImageCaption"/>
-      </w:pPr>
-      <w:bookmarkStart w:id="114" w:name="fig:retmod"/>
-      <w:bookmarkEnd w:id="114"/>
-      <w:r>
-        <w:t xml:space="preserve">Figure 9: Posterior Distributions of the reaction time model</w:t>
+      <w:bookmarkStart w:id="57" w:name="fig:indrt"/>
+      <w:bookmarkEnd w:id="57"/>
+      <w:r>
+        <w:t xml:space="preserve">Figure 5: Individual effects in reaction times</w:t>
       </w:r>
     </w:p>
     <w:p>
       <w:pPr>
         <w:pStyle w:val="TableCaption"/>
       </w:pPr>
-      <w:bookmarkStart w:id="115" w:name="tab:unnamed-chunk-18"/>
-      <w:bookmarkEnd w:id="115"/>
+      <w:bookmarkStart w:id="58" w:name="tab:unnamed-chunk-17"/>
+      <w:bookmarkEnd w:id="58"/>
       <w:r>
         <w:t xml:space="preserve">Table 3:</w:t>
       </w:r>
@@ -10623,7 +10431,7 @@
         <w:t xml:space="preserve"> </w:t>
       </w:r>
       <w:r>
-        <w:t xml:space="preserve">9</w:t>
+        <w:t xml:space="preserve">8</w:t>
       </w:r>
       <w:r>
         <w:t xml:space="preserve"> </w:t>
@@ -10701,9 +10509,9 @@
         <w:t xml:space="preserve">Importantly, the model does not support a cumulative effect in lexical decisions.</w:t>
       </w:r>
     </w:p>
-    <w:bookmarkEnd w:id="116"/>
-    <w:bookmarkEnd w:id="117"/>
-    <w:bookmarkStart w:id="121" w:name="discussion"/>
+    <w:bookmarkEnd w:id="59"/>
+    <w:bookmarkEnd w:id="60"/>
+    <w:bookmarkStart w:id="64" w:name="discussion"/>
     <w:p>
       <w:pPr>
         <w:pStyle w:val="Heading1"/>
@@ -10750,7 +10558,7 @@
         <w:t xml:space="preserve">Thus, the results reveal an asymmetry between accuracy and speed of lexical processing for a cumulative facilitation effect.</w:t>
       </w:r>
     </w:p>
-    <w:bookmarkStart w:id="118" w:name="cognate-effects-in-l3-lexical-processing"/>
+    <w:bookmarkStart w:id="61" w:name="cognate-effects-in-l3-lexical-processing"/>
     <w:p>
       <w:pPr>
         <w:pStyle w:val="Heading2"/>
@@ -11124,8 +10932,8 @@
         <w:t xml:space="preserve">This measure-dependent pattern may help explain some of the mixed findings in previous trilingual cognate research, where cumulative effects have varied across tasks, participant populations, and dependent measures.</w:t>
       </w:r>
     </w:p>
-    <w:bookmarkEnd w:id="118"/>
-    <w:bookmarkStart w:id="119" w:name="the-role-l3-proficiency"/>
+    <w:bookmarkEnd w:id="61"/>
+    <w:bookmarkStart w:id="62" w:name="the-role-l3-proficiency"/>
     <w:p>
       <w:pPr>
         <w:pStyle w:val="Heading2"/>
@@ -11222,8 +11030,8 @@
         <w:t xml:space="preserve">Notably, whereas the results provided evidence of an overall proficiency effect, with more proficient participants performing more accurately overall, the findings did not support proficiency-related modulation of cognate facilitation.</w:t>
       </w:r>
     </w:p>
-    <w:bookmarkEnd w:id="119"/>
-    <w:bookmarkStart w:id="120" w:name="X34cb8421ee2df0f1a7181de3f744d8d9e3235c6"/>
+    <w:bookmarkEnd w:id="62"/>
+    <w:bookmarkStart w:id="63" w:name="X34cb8421ee2df0f1a7181de3f744d8d9e3235c6"/>
     <w:p>
       <w:pPr>
         <w:pStyle w:val="Heading2"/>
@@ -11343,9 +11151,9 @@
         <w:t xml:space="preserve">Studies reporting only latency or only accuracy may reach different conclusions about whether triple cognates receive an additional processing benefit.</w:t>
       </w:r>
     </w:p>
-    <w:bookmarkEnd w:id="120"/>
-    <w:bookmarkEnd w:id="121"/>
-    <w:bookmarkStart w:id="122" w:name="conclusion"/>
+    <w:bookmarkEnd w:id="63"/>
+    <w:bookmarkEnd w:id="64"/>
+    <w:bookmarkStart w:id="65" w:name="conclusion"/>
     <w:p>
       <w:pPr>
         <w:pStyle w:val="Heading1"/>
@@ -11415,8 +11223,8 @@
         <w:br w:type="page"/>
       </w:r>
     </w:p>
-    <w:bookmarkEnd w:id="122"/>
-    <w:bookmarkStart w:id="124" w:name="X421aa8c25e75d5bda444d1508fbcc66cb0dedf6"/>
+    <w:bookmarkEnd w:id="65"/>
+    <w:bookmarkStart w:id="83" w:name="X421aa8c25e75d5bda444d1508fbcc66cb0dedf6"/>
     <w:p>
       <w:pPr>
         <w:pStyle w:val="Heading1"/>
@@ -11429,8 +11237,8 @@
       <w:pPr>
         <w:pStyle w:val="TableCaption"/>
       </w:pPr>
-      <w:bookmarkStart w:id="123" w:name="tab:stim-table-appendix"/>
-      <w:bookmarkEnd w:id="123"/>
+      <w:bookmarkStart w:id="66" w:name="tab:stim-table-appendix"/>
+      <w:bookmarkEnd w:id="66"/>
       <w:r>
         <w:t xml:space="preserve">Table 4: Stimulus List</w:t>
       </w:r>
@@ -16303,12 +16111,240 @@
       </w:tr>
     </w:tbl>
     <w:p>
+      <w:pPr>
+        <w:pStyle w:val="CaptionedFigure"/>
+      </w:pPr>
+      <w:r>
+        <w:drawing>
+          <wp:inline>
+            <wp:extent cx="4579632" cy="3663706"/>
+            <wp:effectExtent b="0" l="0" r="0" t="0"/>
+            <wp:docPr descr="Figure 6: Histogram of the adapted LexTALE scores" title="" id="68" name="Picture"/>
+            <a:graphic>
+              <a:graphicData uri="http://schemas.openxmlformats.org/drawingml/2006/picture">
+                <pic:pic>
+                  <pic:nvPicPr>
+                    <pic:cNvPr descr="main_files/589217832034fa56a3cbc71aedc0ba034523d09b.png" id="69" name="Picture"/>
+                    <pic:cNvPicPr>
+                      <a:picLocks noChangeArrowheads="1" noChangeAspect="1"/>
+                    </pic:cNvPicPr>
+                  </pic:nvPicPr>
+                  <pic:blipFill>
+                    <a:blip r:embed="rId67"/>
+                    <a:stretch>
+                      <a:fillRect/>
+                    </a:stretch>
+                  </pic:blipFill>
+                  <pic:spPr bwMode="auto">
+                    <a:xfrm>
+                      <a:off x="0" y="0"/>
+                      <a:ext cx="4579632" cy="3663706"/>
+                    </a:xfrm>
+                    <a:prstGeom prst="rect">
+                      <a:avLst/>
+                    </a:prstGeom>
+                    <a:noFill/>
+                    <a:ln w="9525">
+                      <a:noFill/>
+                      <a:headEnd/>
+                      <a:tailEnd/>
+                    </a:ln>
+                  </pic:spPr>
+                </pic:pic>
+              </a:graphicData>
+            </a:graphic>
+          </wp:inline>
+        </w:drawing>
+      </w:r>
+    </w:p>
+    <w:p>
+      <w:pPr>
+        <w:pStyle w:val="ImageCaption"/>
+      </w:pPr>
+      <w:bookmarkStart w:id="70" w:name="fig:profplot"/>
+      <w:bookmarkEnd w:id="70"/>
+      <w:r>
+        <w:t xml:space="preserve">Figure 6: Histogram of the adapted LexTALE scores</w:t>
+      </w:r>
+    </w:p>
+    <w:p>
+      <w:pPr>
+        <w:pStyle w:val="CaptionedFigure"/>
+      </w:pPr>
+      <w:r>
+        <w:drawing>
+          <wp:inline>
+            <wp:extent cx="4579632" cy="3663706"/>
+            <wp:effectExtent b="0" l="0" r="0" t="0"/>
+            <wp:docPr descr="Figure 7: Posterior Distributions of the accuracy model" title="" id="72" name="Picture"/>
+            <a:graphic>
+              <a:graphicData uri="http://schemas.openxmlformats.org/drawingml/2006/picture">
+                <pic:pic>
+                  <pic:nvPicPr>
+                    <pic:cNvPr descr="main_files/e5718c37282eb0900570041746a9fcfac7891e90.png" id="73" name="Picture"/>
+                    <pic:cNvPicPr>
+                      <a:picLocks noChangeArrowheads="1" noChangeAspect="1"/>
+                    </pic:cNvPicPr>
+                  </pic:nvPicPr>
+                  <pic:blipFill>
+                    <a:blip r:embed="rId71"/>
+                    <a:stretch>
+                      <a:fillRect/>
+                    </a:stretch>
+                  </pic:blipFill>
+                  <pic:spPr bwMode="auto">
+                    <a:xfrm>
+                      <a:off x="0" y="0"/>
+                      <a:ext cx="4579632" cy="3663706"/>
+                    </a:xfrm>
+                    <a:prstGeom prst="rect">
+                      <a:avLst/>
+                    </a:prstGeom>
+                    <a:noFill/>
+                    <a:ln w="9525">
+                      <a:noFill/>
+                      <a:headEnd/>
+                      <a:tailEnd/>
+                    </a:ln>
+                  </pic:spPr>
+                </pic:pic>
+              </a:graphicData>
+            </a:graphic>
+          </wp:inline>
+        </w:drawing>
+      </w:r>
+    </w:p>
+    <w:p>
+      <w:pPr>
+        <w:pStyle w:val="ImageCaption"/>
+      </w:pPr>
+      <w:bookmarkStart w:id="74" w:name="fig:accmod"/>
+      <w:bookmarkEnd w:id="74"/>
+      <w:r>
+        <w:t xml:space="preserve">Figure 7: Posterior Distributions of the accuracy model</w:t>
+      </w:r>
+    </w:p>
+    <w:p>
+      <w:pPr>
+        <w:pStyle w:val="CaptionedFigure"/>
+      </w:pPr>
+      <w:r>
+        <w:drawing>
+          <wp:inline>
+            <wp:extent cx="4579632" cy="3663706"/>
+            <wp:effectExtent b="0" l="0" r="0" t="0"/>
+            <wp:docPr descr="Figure 8: Posterior Distributions of the reaction time model" title="" id="76" name="Picture"/>
+            <a:graphic>
+              <a:graphicData uri="http://schemas.openxmlformats.org/drawingml/2006/picture">
+                <pic:pic>
+                  <pic:nvPicPr>
+                    <pic:cNvPr descr="main_files/d25de41a0e83a31db0a06921246cb1a0e1e3a3a1.png" id="77" name="Picture"/>
+                    <pic:cNvPicPr>
+                      <a:picLocks noChangeArrowheads="1" noChangeAspect="1"/>
+                    </pic:cNvPicPr>
+                  </pic:nvPicPr>
+                  <pic:blipFill>
+                    <a:blip r:embed="rId75"/>
+                    <a:stretch>
+                      <a:fillRect/>
+                    </a:stretch>
+                  </pic:blipFill>
+                  <pic:spPr bwMode="auto">
+                    <a:xfrm>
+                      <a:off x="0" y="0"/>
+                      <a:ext cx="4579632" cy="3663706"/>
+                    </a:xfrm>
+                    <a:prstGeom prst="rect">
+                      <a:avLst/>
+                    </a:prstGeom>
+                    <a:noFill/>
+                    <a:ln w="9525">
+                      <a:noFill/>
+                      <a:headEnd/>
+                      <a:tailEnd/>
+                    </a:ln>
+                  </pic:spPr>
+                </pic:pic>
+              </a:graphicData>
+            </a:graphic>
+          </wp:inline>
+        </w:drawing>
+      </w:r>
+    </w:p>
+    <w:p>
+      <w:pPr>
+        <w:pStyle w:val="ImageCaption"/>
+      </w:pPr>
+      <w:bookmarkStart w:id="78" w:name="fig:retmod"/>
+      <w:bookmarkEnd w:id="78"/>
+      <w:r>
+        <w:t xml:space="preserve">Figure 8: Posterior Distributions of the reaction time model</w:t>
+      </w:r>
+    </w:p>
+    <w:p>
+      <w:pPr>
+        <w:pStyle w:val="CaptionedFigure"/>
+      </w:pPr>
+      <w:r>
+        <w:drawing>
+          <wp:inline>
+            <wp:extent cx="4579632" cy="3663706"/>
+            <wp:effectExtent b="0" l="0" r="0" t="0"/>
+            <wp:docPr descr="Figure 9: Individual effects in reaction times as a function of L3 proficiency" title="" id="80" name="Picture"/>
+            <a:graphic>
+              <a:graphicData uri="http://schemas.openxmlformats.org/drawingml/2006/picture">
+                <pic:pic>
+                  <pic:nvPicPr>
+                    <pic:cNvPr descr="main_files/0822df16491bbbe3cda5e4e40815b76e13c3534e.png" id="81" name="Picture"/>
+                    <pic:cNvPicPr>
+                      <a:picLocks noChangeArrowheads="1" noChangeAspect="1"/>
+                    </pic:cNvPicPr>
+                  </pic:nvPicPr>
+                  <pic:blipFill>
+                    <a:blip r:embed="rId79"/>
+                    <a:stretch>
+                      <a:fillRect/>
+                    </a:stretch>
+                  </pic:blipFill>
+                  <pic:spPr bwMode="auto">
+                    <a:xfrm>
+                      <a:off x="0" y="0"/>
+                      <a:ext cx="4579632" cy="3663706"/>
+                    </a:xfrm>
+                    <a:prstGeom prst="rect">
+                      <a:avLst/>
+                    </a:prstGeom>
+                    <a:noFill/>
+                    <a:ln w="9525">
+                      <a:noFill/>
+                      <a:headEnd/>
+                      <a:tailEnd/>
+                    </a:ln>
+                  </pic:spPr>
+                </pic:pic>
+              </a:graphicData>
+            </a:graphic>
+          </wp:inline>
+        </w:drawing>
+      </w:r>
+    </w:p>
+    <w:p>
+      <w:pPr>
+        <w:pStyle w:val="ImageCaption"/>
+      </w:pPr>
+      <w:bookmarkStart w:id="82" w:name="fig:indrtprof"/>
+      <w:bookmarkEnd w:id="82"/>
+      <w:r>
+        <w:t xml:space="preserve">Figure 9: Individual effects in reaction times as a function of L3 proficiency</w:t>
+      </w:r>
+    </w:p>
+    <w:p>
       <w:r>
         <w:br w:type="page"/>
       </w:r>
     </w:p>
-    <w:bookmarkEnd w:id="124"/>
-    <w:bookmarkStart w:id="241" w:name="references"/>
+    <w:bookmarkEnd w:id="83"/>
+    <w:bookmarkStart w:id="200" w:name="references"/>
     <w:p>
       <w:pPr>
         <w:pStyle w:val="Heading1"/>
@@ -16317,8 +16353,8 @@
         <w:t xml:space="preserve">References</w:t>
       </w:r>
     </w:p>
-    <w:bookmarkStart w:id="240" w:name="refs"/>
-    <w:bookmarkStart w:id="126" w:name="ref-aguinaga_echeverria_2017"/>
+    <w:bookmarkStart w:id="199" w:name="refs"/>
+    <w:bookmarkStart w:id="85" w:name="ref-aguinaga_echeverria_2017"/>
     <w:p>
       <w:pPr>
         <w:pStyle w:val="Bibliography"/>
@@ -16445,7 +16481,7 @@
       <w:r>
         <w:t xml:space="preserve"> </w:t>
       </w:r>
-      <w:hyperlink r:id="rId125">
+      <w:hyperlink r:id="rId84">
         <w:r>
           <w:rPr>
             <w:rStyle w:val="Hyperlink"/>
@@ -16454,8 +16490,8 @@
         </w:r>
       </w:hyperlink>
     </w:p>
-    <w:bookmarkEnd w:id="126"/>
-    <w:bookmarkStart w:id="128" w:name="ref-amengual_2012"/>
+    <w:bookmarkEnd w:id="85"/>
+    <w:bookmarkStart w:id="87" w:name="ref-amengual_2012"/>
     <w:p>
       <w:pPr>
         <w:pStyle w:val="Bibliography"/>
@@ -16501,7 +16537,7 @@
       <w:r>
         <w:t xml:space="preserve">(3), 517–530. http://doi.org/</w:t>
       </w:r>
-      <w:hyperlink r:id="rId127">
+      <w:hyperlink r:id="rId86">
         <w:r>
           <w:rPr>
             <w:rStyle w:val="Hyperlink"/>
@@ -16510,8 +16546,8 @@
         </w:r>
       </w:hyperlink>
     </w:p>
-    <w:bookmarkEnd w:id="128"/>
-    <w:bookmarkStart w:id="130" w:name="ref-arana_etal_2022"/>
+    <w:bookmarkEnd w:id="87"/>
+    <w:bookmarkStart w:id="89" w:name="ref-arana_etal_2022"/>
     <w:p>
       <w:pPr>
         <w:pStyle w:val="Bibliography"/>
@@ -16545,7 +16581,7 @@
       <w:r>
         <w:t xml:space="preserve">(4), 660–678. http://doi.org/</w:t>
       </w:r>
-      <w:hyperlink r:id="rId129">
+      <w:hyperlink r:id="rId88">
         <w:r>
           <w:rPr>
             <w:rStyle w:val="Hyperlink"/>
@@ -16554,8 +16590,8 @@
         </w:r>
       </w:hyperlink>
     </w:p>
-    <w:bookmarkEnd w:id="130"/>
-    <w:bookmarkStart w:id="132" w:name="ref-bardel_falk_2007"/>
+    <w:bookmarkEnd w:id="89"/>
+    <w:bookmarkStart w:id="91" w:name="ref-bardel_falk_2007"/>
     <w:p>
       <w:pPr>
         <w:pStyle w:val="Bibliography"/>
@@ -16613,7 +16649,7 @@
       <w:r>
         <w:t xml:space="preserve">, 459–484. http://doi.org/</w:t>
       </w:r>
-      <w:hyperlink r:id="rId131">
+      <w:hyperlink r:id="rId90">
         <w:r>
           <w:rPr>
             <w:rStyle w:val="Hyperlink"/>
@@ -16622,8 +16658,8 @@
         </w:r>
       </w:hyperlink>
     </w:p>
-    <w:bookmarkEnd w:id="132"/>
-    <w:bookmarkStart w:id="134" w:name="ref-bardel_falk_2012"/>
+    <w:bookmarkEnd w:id="91"/>
+    <w:bookmarkStart w:id="93" w:name="ref-bardel_falk_2012"/>
     <w:p>
       <w:pPr>
         <w:pStyle w:val="Bibliography"/>
@@ -16643,7 +16679,7 @@
       <w:r>
         <w:t xml:space="preserve">status factor and the declarative/procedural distinction. In (pp. 61–78). http://doi.org/</w:t>
       </w:r>
-      <w:hyperlink r:id="rId133">
+      <w:hyperlink r:id="rId92">
         <w:r>
           <w:rPr>
             <w:rStyle w:val="Hyperlink"/>
@@ -16652,8 +16688,8 @@
         </w:r>
       </w:hyperlink>
     </w:p>
-    <w:bookmarkEnd w:id="134"/>
-    <w:bookmarkStart w:id="136" w:name="ref-bartolotti_marian_2017"/>
+    <w:bookmarkEnd w:id="93"/>
+    <w:bookmarkStart w:id="95" w:name="ref-bartolotti_marian_2017"/>
     <w:p>
       <w:pPr>
         <w:pStyle w:val="Bibliography"/>
@@ -16738,7 +16774,7 @@
       <w:r>
         <w:t xml:space="preserve">(1), 110–140. http://doi.org/</w:t>
       </w:r>
-      <w:hyperlink r:id="rId135">
+      <w:hyperlink r:id="rId94">
         <w:r>
           <w:rPr>
             <w:rStyle w:val="Hyperlink"/>
@@ -16747,8 +16783,8 @@
         </w:r>
       </w:hyperlink>
     </w:p>
-    <w:bookmarkEnd w:id="136"/>
-    <w:bookmarkStart w:id="137" w:name="ref-borg2013acquisition"/>
+    <w:bookmarkEnd w:id="95"/>
+    <w:bookmarkStart w:id="96" w:name="ref-borg2013acquisition"/>
     <w:p>
       <w:pPr>
         <w:pStyle w:val="Bibliography"/>
@@ -16773,8 +16809,8 @@
         <w:t xml:space="preserve">(pp. 11–21). Cascadilla Proceedings Project Somerville, MA.</w:t>
       </w:r>
     </w:p>
-    <w:bookmarkEnd w:id="137"/>
-    <w:bookmarkStart w:id="138" w:name="ref-burkner2017brms"/>
+    <w:bookmarkEnd w:id="96"/>
+    <w:bookmarkStart w:id="97" w:name="ref-burkner2017brms"/>
     <w:p>
       <w:pPr>
         <w:pStyle w:val="Bibliography"/>
@@ -16809,8 +16845,8 @@
         <w:t xml:space="preserve">, 1–28.</w:t>
       </w:r>
     </w:p>
-    <w:bookmarkEnd w:id="138"/>
-    <w:bookmarkStart w:id="139" w:name="ref-cabrelli2015relationship"/>
+    <w:bookmarkEnd w:id="97"/>
+    <w:bookmarkStart w:id="98" w:name="ref-cabrelli2015relationship"/>
     <w:p>
       <w:pPr>
         <w:pStyle w:val="Bibliography"/>
@@ -16835,8 +16871,8 @@
         <w:t xml:space="preserve">(pp. 21–52). John Benjamins.</w:t>
       </w:r>
     </w:p>
-    <w:bookmarkEnd w:id="139"/>
-    <w:bookmarkStart w:id="141" w:name="ref-carrasco-ortiz_etal_2021"/>
+    <w:bookmarkEnd w:id="98"/>
+    <w:bookmarkStart w:id="100" w:name="ref-carrasco-ortiz_etal_2021"/>
     <w:p>
       <w:pPr>
         <w:pStyle w:val="Bibliography"/>
@@ -16882,7 +16918,7 @@
       <w:r>
         <w:t xml:space="preserve">(3), 389–417. http://doi.org/</w:t>
       </w:r>
-      <w:hyperlink r:id="rId140">
+      <w:hyperlink r:id="rId99">
         <w:r>
           <w:rPr>
             <w:rStyle w:val="Hyperlink"/>
@@ -16891,8 +16927,8 @@
         </w:r>
       </w:hyperlink>
     </w:p>
-    <w:bookmarkEnd w:id="141"/>
-    <w:bookmarkStart w:id="143" w:name="ref-comesana_etal_2015"/>
+    <w:bookmarkEnd w:id="100"/>
+    <w:bookmarkStart w:id="102" w:name="ref-comesana_etal_2015"/>
     <w:p>
       <w:pPr>
         <w:pStyle w:val="Bibliography"/>
@@ -16938,7 +16974,7 @@
       <w:r>
         <w:t xml:space="preserve">(3), 614–635. http://doi.org/</w:t>
       </w:r>
-      <w:hyperlink r:id="rId142">
+      <w:hyperlink r:id="rId101">
         <w:r>
           <w:rPr>
             <w:rStyle w:val="Hyperlink"/>
@@ -16947,8 +16983,8 @@
         </w:r>
       </w:hyperlink>
     </w:p>
-    <w:bookmarkEnd w:id="143"/>
-    <w:bookmarkStart w:id="145" w:name="ref-cop_etal_2015"/>
+    <w:bookmarkEnd w:id="102"/>
+    <w:bookmarkStart w:id="104" w:name="ref-cop_etal_2015"/>
     <w:p>
       <w:pPr>
         <w:pStyle w:val="Bibliography"/>
@@ -17072,7 +17108,7 @@
       <w:r>
         <w:t xml:space="preserve">(8), e0134008. http://doi.org/</w:t>
       </w:r>
-      <w:hyperlink r:id="rId144">
+      <w:hyperlink r:id="rId103">
         <w:r>
           <w:rPr>
             <w:rStyle w:val="Hyperlink"/>
@@ -17081,8 +17117,8 @@
         </w:r>
       </w:hyperlink>
     </w:p>
-    <w:bookmarkEnd w:id="145"/>
-    <w:bookmarkStart w:id="147" w:name="ref-cornut_etal_2022"/>
+    <w:bookmarkEnd w:id="104"/>
+    <w:bookmarkStart w:id="106" w:name="ref-cornut_etal_2022"/>
     <w:p>
       <w:pPr>
         <w:pStyle w:val="Bibliography"/>
@@ -17146,7 +17182,7 @@
       <w:r>
         <w:t xml:space="preserve">(1), 121–136. http://doi.org/</w:t>
       </w:r>
-      <w:hyperlink r:id="rId146">
+      <w:hyperlink r:id="rId105">
         <w:r>
           <w:rPr>
             <w:rStyle w:val="Hyperlink"/>
@@ -17155,8 +17191,8 @@
         </w:r>
       </w:hyperlink>
     </w:p>
-    <w:bookmarkEnd w:id="147"/>
-    <w:bookmarkStart w:id="149" w:name="ref-costa_etal_2023"/>
+    <w:bookmarkEnd w:id="106"/>
+    <w:bookmarkStart w:id="108" w:name="ref-costa_etal_2023"/>
     <w:p>
       <w:pPr>
         <w:pStyle w:val="Bibliography"/>
@@ -17250,7 +17286,7 @@
       <w:r>
         <w:t xml:space="preserve">(7), 3699–3725. http://doi.org/</w:t>
       </w:r>
-      <w:hyperlink r:id="rId148">
+      <w:hyperlink r:id="rId107">
         <w:r>
           <w:rPr>
             <w:rStyle w:val="Hyperlink"/>
@@ -17259,8 +17295,8 @@
         </w:r>
       </w:hyperlink>
     </w:p>
-    <w:bookmarkEnd w:id="149"/>
-    <w:bookmarkStart w:id="150" w:name="ref-costa_etal_2000"/>
+    <w:bookmarkEnd w:id="108"/>
+    <w:bookmarkStart w:id="109" w:name="ref-costa_etal_2000"/>
     <w:p>
       <w:pPr>
         <w:pStyle w:val="Bibliography"/>
@@ -17329,8 +17365,8 @@
         <w:t xml:space="preserve">.</w:t>
       </w:r>
     </w:p>
-    <w:bookmarkEnd w:id="150"/>
-    <w:bookmarkStart w:id="151" w:name="ref-covey_mikheeva_2023"/>
+    <w:bookmarkEnd w:id="109"/>
+    <w:bookmarkStart w:id="110" w:name="ref-covey_mikheeva_2023"/>
     <w:p>
       <w:pPr>
         <w:pStyle w:val="Bibliography"/>
@@ -17355,8 +17391,8 @@
         <w:t xml:space="preserve">(pp. 187–199). Cascadilla Press.</w:t>
       </w:r>
     </w:p>
-    <w:bookmarkEnd w:id="151"/>
-    <w:bookmarkStart w:id="152" w:name="ref-cuetos_etal_2011"/>
+    <w:bookmarkEnd w:id="110"/>
+    <w:bookmarkStart w:id="111" w:name="ref-cuetos_etal_2011"/>
     <w:p>
       <w:pPr>
         <w:pStyle w:val="Bibliography"/>
@@ -17418,8 +17454,8 @@
         <w:t xml:space="preserve">(2), 133–143.</w:t>
       </w:r>
     </w:p>
-    <w:bookmarkEnd w:id="152"/>
-    <w:bookmarkStart w:id="154" w:name="ref-de_angelis_2007"/>
+    <w:bookmarkEnd w:id="111"/>
+    <w:bookmarkStart w:id="113" w:name="ref-de_angelis_2007"/>
     <w:p>
       <w:pPr>
         <w:pStyle w:val="Bibliography"/>
@@ -17482,7 +17518,7 @@
       <w:r>
         <w:t xml:space="preserve">. (D. Singleton, Ed.). Multilingual Matters &amp; Channel View Publications. http://doi.org/</w:t>
       </w:r>
-      <w:hyperlink r:id="rId153">
+      <w:hyperlink r:id="rId112">
         <w:r>
           <w:rPr>
             <w:rStyle w:val="Hyperlink"/>
@@ -17491,8 +17527,8 @@
         </w:r>
       </w:hyperlink>
     </w:p>
-    <w:bookmarkEnd w:id="154"/>
-    <w:bookmarkStart w:id="156" w:name="ref-dijkstra_etal_2010"/>
+    <w:bookmarkEnd w:id="113"/>
+    <w:bookmarkStart w:id="115" w:name="ref-dijkstra_etal_2010"/>
     <w:p>
       <w:pPr>
         <w:pStyle w:val="Bibliography"/>
@@ -17526,7 +17562,7 @@
       <w:r>
         <w:t xml:space="preserve">(3), 284–301. http://doi.org/</w:t>
       </w:r>
-      <w:hyperlink r:id="rId155">
+      <w:hyperlink r:id="rId114">
         <w:r>
           <w:rPr>
             <w:rStyle w:val="Hyperlink"/>
@@ -17535,8 +17571,8 @@
         </w:r>
       </w:hyperlink>
     </w:p>
-    <w:bookmarkEnd w:id="156"/>
-    <w:bookmarkStart w:id="158" w:name="ref-dijkstra_vanheuven_2002"/>
+    <w:bookmarkEnd w:id="115"/>
+    <w:bookmarkStart w:id="117" w:name="ref-dijkstra_vanheuven_2002"/>
     <w:p>
       <w:pPr>
         <w:pStyle w:val="Bibliography"/>
@@ -17582,7 +17618,7 @@
       <w:r>
         <w:t xml:space="preserve">(3), 175–197. http://doi.org/</w:t>
       </w:r>
-      <w:hyperlink r:id="rId157">
+      <w:hyperlink r:id="rId116">
         <w:r>
           <w:rPr>
             <w:rStyle w:val="Hyperlink"/>
@@ -17591,8 +17627,8 @@
         </w:r>
       </w:hyperlink>
     </w:p>
-    <w:bookmarkEnd w:id="158"/>
-    <w:bookmarkStart w:id="159" w:name="ref-Dijkstra_etal_2018"/>
+    <w:bookmarkEnd w:id="117"/>
+    <w:bookmarkStart w:id="118" w:name="ref-Dijkstra_etal_2018"/>
     <w:p>
       <w:pPr>
         <w:pStyle w:val="Bibliography"/>
@@ -17627,8 +17663,8 @@
         <w:t xml:space="preserve">(4), 657–679.</w:t>
       </w:r>
     </w:p>
-    <w:bookmarkEnd w:id="159"/>
-    <w:bookmarkStart w:id="161" w:name="ref-ecke_2015"/>
+    <w:bookmarkEnd w:id="118"/>
+    <w:bookmarkStart w:id="120" w:name="ref-ecke_2015"/>
     <w:p>
       <w:pPr>
         <w:pStyle w:val="Bibliography"/>
@@ -17662,7 +17698,7 @@
       <w:r>
         <w:t xml:space="preserve">(2), 145–162. http://doi.org/</w:t>
       </w:r>
-      <w:hyperlink r:id="rId160">
+      <w:hyperlink r:id="rId119">
         <w:r>
           <w:rPr>
             <w:rStyle w:val="Hyperlink"/>
@@ -17671,8 +17707,8 @@
         </w:r>
       </w:hyperlink>
     </w:p>
-    <w:bookmarkEnd w:id="161"/>
-    <w:bookmarkStart w:id="163" w:name="ref-ellis_beaton_1993"/>
+    <w:bookmarkEnd w:id="120"/>
+    <w:bookmarkStart w:id="122" w:name="ref-ellis_beaton_1993"/>
     <w:p>
       <w:pPr>
         <w:pStyle w:val="Bibliography"/>
@@ -17718,7 +17754,7 @@
       <w:r>
         <w:t xml:space="preserve">(3), 533–558. http://doi.org/</w:t>
       </w:r>
-      <w:hyperlink r:id="rId162">
+      <w:hyperlink r:id="rId121">
         <w:r>
           <w:rPr>
             <w:rStyle w:val="Hyperlink"/>
@@ -17727,8 +17763,8 @@
         </w:r>
       </w:hyperlink>
     </w:p>
-    <w:bookmarkEnd w:id="163"/>
-    <w:bookmarkStart w:id="165" w:name="ref-engemann_rodetzky_2024"/>
+    <w:bookmarkEnd w:id="122"/>
+    <w:bookmarkStart w:id="124" w:name="ref-engemann_rodetzky_2024"/>
     <w:p>
       <w:pPr>
         <w:pStyle w:val="Bibliography"/>
@@ -17819,7 +17855,7 @@
       <w:r>
         <w:t xml:space="preserve">(10). http://doi.org/</w:t>
       </w:r>
-      <w:hyperlink r:id="rId164">
+      <w:hyperlink r:id="rId123">
         <w:r>
           <w:rPr>
             <w:rStyle w:val="Hyperlink"/>
@@ -17828,8 +17864,8 @@
         </w:r>
       </w:hyperlink>
     </w:p>
-    <w:bookmarkEnd w:id="165"/>
-    <w:bookmarkStart w:id="166" w:name="ref-foote2009transfer"/>
+    <w:bookmarkEnd w:id="124"/>
+    <w:bookmarkStart w:id="125" w:name="ref-foote2009transfer"/>
     <w:p>
       <w:pPr>
         <w:pStyle w:val="Bibliography"/>
@@ -17864,8 +17900,8 @@
         <w:t xml:space="preserve">, 89.</w:t>
       </w:r>
     </w:p>
-    <w:bookmarkEnd w:id="166"/>
-    <w:bookmarkStart w:id="168" w:name="ref-forys-nogala_etal_2026"/>
+    <w:bookmarkEnd w:id="125"/>
+    <w:bookmarkStart w:id="127" w:name="ref-forys-nogala_etal_2026"/>
     <w:p>
       <w:pPr>
         <w:pStyle w:val="Bibliography"/>
@@ -17977,7 +18013,7 @@
       <w:r>
         <w:t xml:space="preserve">(2), 367–380. http://doi.org/</w:t>
       </w:r>
-      <w:hyperlink r:id="rId167">
+      <w:hyperlink r:id="rId126">
         <w:r>
           <w:rPr>
             <w:rStyle w:val="Hyperlink"/>
@@ -17986,8 +18022,8 @@
         </w:r>
       </w:hyperlink>
     </w:p>
-    <w:bookmarkEnd w:id="168"/>
-    <w:bookmarkStart w:id="170" w:name="ref-frances_etal_2021"/>
+    <w:bookmarkEnd w:id="127"/>
+    <w:bookmarkStart w:id="129" w:name="ref-frances_etal_2021"/>
     <w:p>
       <w:pPr>
         <w:pStyle w:val="Bibliography"/>
@@ -18033,7 +18069,7 @@
       <w:r>
         <w:t xml:space="preserve">(1), 12812. http://doi.org/</w:t>
       </w:r>
-      <w:hyperlink r:id="rId169">
+      <w:hyperlink r:id="rId128">
         <w:r>
           <w:rPr>
             <w:rStyle w:val="Hyperlink"/>
@@ -18042,8 +18078,8 @@
         </w:r>
       </w:hyperlink>
     </w:p>
-    <w:bookmarkEnd w:id="170"/>
-    <w:bookmarkStart w:id="172" w:name="ref-frances_etal_2022"/>
+    <w:bookmarkEnd w:id="129"/>
+    <w:bookmarkStart w:id="131" w:name="ref-frances_etal_2022"/>
     <w:p>
       <w:pPr>
         <w:pStyle w:val="Bibliography"/>
@@ -18176,7 +18212,7 @@
       <w:r>
         <w:t xml:space="preserve">. http://doi.org/</w:t>
       </w:r>
-      <w:hyperlink r:id="rId171">
+      <w:hyperlink r:id="rId130">
         <w:r>
           <w:rPr>
             <w:rStyle w:val="Hyperlink"/>
@@ -18185,8 +18221,8 @@
         </w:r>
       </w:hyperlink>
     </w:p>
-    <w:bookmarkEnd w:id="172"/>
-    <w:bookmarkStart w:id="173" w:name="ref-de2014subject"/>
+    <w:bookmarkEnd w:id="131"/>
+    <w:bookmarkStart w:id="132" w:name="ref-de2014subject"/>
     <w:p>
       <w:pPr>
         <w:pStyle w:val="Bibliography"/>
@@ -18208,8 +18244,8 @@
         <w:t xml:space="preserve">.</w:t>
       </w:r>
     </w:p>
-    <w:bookmarkEnd w:id="173"/>
-    <w:bookmarkStart w:id="174" w:name="ref-garcia2015object"/>
+    <w:bookmarkEnd w:id="132"/>
+    <w:bookmarkStart w:id="133" w:name="ref-garcia2015object"/>
     <w:p>
       <w:pPr>
         <w:pStyle w:val="Bibliography"/>
@@ -18244,8 +18280,8 @@
         <w:t xml:space="preserve">(5), 483–498.</w:t>
       </w:r>
     </w:p>
-    <w:bookmarkEnd w:id="174"/>
-    <w:bookmarkStart w:id="176" w:name="ref-garrido-pozu_2024"/>
+    <w:bookmarkEnd w:id="133"/>
+    <w:bookmarkStart w:id="135" w:name="ref-garrido-pozu_2024"/>
     <w:p>
       <w:pPr>
         <w:pStyle w:val="Bibliography"/>
@@ -18297,7 +18333,7 @@
       <w:r>
         <w:t xml:space="preserve">(5), 914–926. http://doi.org/</w:t>
       </w:r>
-      <w:hyperlink r:id="rId175">
+      <w:hyperlink r:id="rId134">
         <w:r>
           <w:rPr>
             <w:rStyle w:val="Hyperlink"/>
@@ -18306,8 +18342,8 @@
         </w:r>
       </w:hyperlink>
     </w:p>
-    <w:bookmarkEnd w:id="176"/>
-    <w:bookmarkStart w:id="177" w:name="ref-giancaspro2015transfer"/>
+    <w:bookmarkEnd w:id="135"/>
+    <w:bookmarkStart w:id="136" w:name="ref-giancaspro2015transfer"/>
     <w:p>
       <w:pPr>
         <w:pStyle w:val="Bibliography"/>
@@ -18342,8 +18378,8 @@
         <w:t xml:space="preserve">(2), 191–207.</w:t>
       </w:r>
     </w:p>
-    <w:bookmarkEnd w:id="177"/>
-    <w:bookmarkStart w:id="179" w:name="ref-van_hell_degroot_2008"/>
+    <w:bookmarkEnd w:id="136"/>
+    <w:bookmarkStart w:id="138" w:name="ref-van_hell_degroot_2008"/>
     <w:p>
       <w:pPr>
         <w:pStyle w:val="Bibliography"/>
@@ -18377,7 +18413,7 @@
       <w:r>
         <w:t xml:space="preserve">(3), 431–451. http://doi.org/</w:t>
       </w:r>
-      <w:hyperlink r:id="rId178">
+      <w:hyperlink r:id="rId137">
         <w:r>
           <w:rPr>
             <w:rStyle w:val="Hyperlink"/>
@@ -18386,8 +18422,8 @@
         </w:r>
       </w:hyperlink>
     </w:p>
-    <w:bookmarkEnd w:id="179"/>
-    <w:bookmarkStart w:id="180" w:name="ref-hermas2010language"/>
+    <w:bookmarkEnd w:id="138"/>
+    <w:bookmarkStart w:id="139" w:name="ref-hermas2010language"/>
     <w:p>
       <w:pPr>
         <w:pStyle w:val="Bibliography"/>
@@ -18422,8 +18458,8 @@
         <w:t xml:space="preserve">(4), 343–362.</w:t>
       </w:r>
     </w:p>
-    <w:bookmarkEnd w:id="180"/>
-    <w:bookmarkStart w:id="181" w:name="ref-ionin2015interpretation"/>
+    <w:bookmarkEnd w:id="139"/>
+    <w:bookmarkStart w:id="140" w:name="ref-ionin2015interpretation"/>
     <w:p>
       <w:pPr>
         <w:pStyle w:val="Bibliography"/>
@@ -18458,8 +18494,8 @@
         <w:t xml:space="preserve">(2), 215–251.</w:t>
       </w:r>
     </w:p>
-    <w:bookmarkEnd w:id="181"/>
-    <w:bookmarkStart w:id="182" w:name="ref-izura_etal_2014"/>
+    <w:bookmarkEnd w:id="140"/>
+    <w:bookmarkStart w:id="141" w:name="ref-izura_etal_2014"/>
     <w:p>
       <w:pPr>
         <w:pStyle w:val="Bibliography"/>
@@ -18524,8 +18560,8 @@
         <w:t xml:space="preserve">(1), 49–66.</w:t>
       </w:r>
     </w:p>
-    <w:bookmarkEnd w:id="182"/>
-    <w:bookmarkStart w:id="183" w:name="ref-jensen2023crosslinguistic"/>
+    <w:bookmarkEnd w:id="141"/>
+    <w:bookmarkStart w:id="142" w:name="ref-jensen2023crosslinguistic"/>
     <w:p>
       <w:pPr>
         <w:pStyle w:val="Bibliography"/>
@@ -18560,8 +18596,8 @@
         <w:t xml:space="preserve">(3), 717–734.</w:t>
       </w:r>
     </w:p>
-    <w:bookmarkEnd w:id="183"/>
-    <w:bookmarkStart w:id="185" w:name="ref-koutamanis_etal_2024"/>
+    <w:bookmarkEnd w:id="142"/>
+    <w:bookmarkStart w:id="144" w:name="ref-koutamanis_etal_2024"/>
     <w:p>
       <w:pPr>
         <w:pStyle w:val="Bibliography"/>
@@ -18607,7 +18643,7 @@
       <w:r>
         <w:t xml:space="preserve">(3), 489–515. http://doi.org/</w:t>
       </w:r>
-      <w:hyperlink r:id="rId184">
+      <w:hyperlink r:id="rId143">
         <w:r>
           <w:rPr>
             <w:rStyle w:val="Hyperlink"/>
@@ -18616,8 +18652,8 @@
         </w:r>
       </w:hyperlink>
     </w:p>
-    <w:bookmarkEnd w:id="185"/>
-    <w:bookmarkStart w:id="186" w:name="ref-kruschke2018rejecting"/>
+    <w:bookmarkEnd w:id="144"/>
+    <w:bookmarkStart w:id="145" w:name="ref-kruschke2018rejecting"/>
     <w:p>
       <w:pPr>
         <w:pStyle w:val="Bibliography"/>
@@ -18652,8 +18688,8 @@
         <w:t xml:space="preserve">(2), 270–280.</w:t>
       </w:r>
     </w:p>
-    <w:bookmarkEnd w:id="186"/>
-    <w:bookmarkStart w:id="188" w:name="ref-lemhofer_broersma_2012"/>
+    <w:bookmarkEnd w:id="145"/>
+    <w:bookmarkStart w:id="147" w:name="ref-lemhofer_broersma_2012"/>
     <w:p>
       <w:pPr>
         <w:pStyle w:val="Bibliography"/>
@@ -18753,7 +18789,7 @@
       <w:r>
         <w:t xml:space="preserve">(2), 325–343. http://doi.org/</w:t>
       </w:r>
-      <w:hyperlink r:id="rId187">
+      <w:hyperlink r:id="rId146">
         <w:r>
           <w:rPr>
             <w:rStyle w:val="Hyperlink"/>
@@ -18762,8 +18798,8 @@
         </w:r>
       </w:hyperlink>
     </w:p>
-    <w:bookmarkEnd w:id="188"/>
-    <w:bookmarkStart w:id="190" w:name="ref-lemhoefer_etal_2004"/>
+    <w:bookmarkEnd w:id="147"/>
+    <w:bookmarkStart w:id="149" w:name="ref-lemhoefer_etal_2004"/>
     <w:p>
       <w:pPr>
         <w:pStyle w:val="Bibliography"/>
@@ -18818,7 +18854,7 @@
       <w:r>
         <w:t xml:space="preserve">(5), 585–611. http://doi.org/</w:t>
       </w:r>
-      <w:hyperlink r:id="rId189">
+      <w:hyperlink r:id="rId148">
         <w:r>
           <w:rPr>
             <w:rStyle w:val="Hyperlink"/>
@@ -18827,8 +18863,8 @@
         </w:r>
       </w:hyperlink>
     </w:p>
-    <w:bookmarkEnd w:id="190"/>
-    <w:bookmarkStart w:id="192" w:name="ref-lijewska_2023"/>
+    <w:bookmarkEnd w:id="149"/>
+    <w:bookmarkStart w:id="151" w:name="ref-lijewska_2023"/>
     <w:p>
       <w:pPr>
         <w:pStyle w:val="Bibliography"/>
@@ -18874,7 +18910,7 @@
       <w:r>
         <w:t xml:space="preserve">(4), 1235–1263. http://doi.org/</w:t>
       </w:r>
-      <w:hyperlink r:id="rId191">
+      <w:hyperlink r:id="rId150">
         <w:r>
           <w:rPr>
             <w:rStyle w:val="Hyperlink"/>
@@ -18883,8 +18919,8 @@
         </w:r>
       </w:hyperlink>
     </w:p>
-    <w:bookmarkEnd w:id="192"/>
-    <w:bookmarkStart w:id="194" w:name="ref-lijewska_delouw_2025"/>
+    <w:bookmarkEnd w:id="151"/>
+    <w:bookmarkStart w:id="153" w:name="ref-lijewska_delouw_2025"/>
     <w:p>
       <w:pPr>
         <w:pStyle w:val="Bibliography"/>
@@ -18927,7 +18963,7 @@
       <w:r>
         <w:t xml:space="preserve">(5), 632–661. http://doi.org/</w:t>
       </w:r>
-      <w:hyperlink r:id="rId193">
+      <w:hyperlink r:id="rId152">
         <w:r>
           <w:rPr>
             <w:rStyle w:val="Hyperlink"/>
@@ -18936,8 +18972,8 @@
         </w:r>
       </w:hyperlink>
     </w:p>
-    <w:bookmarkEnd w:id="194"/>
-    <w:bookmarkStart w:id="196" w:name="ref-lotto_degroot_1998"/>
+    <w:bookmarkEnd w:id="153"/>
+    <w:bookmarkStart w:id="155" w:name="ref-lotto_degroot_1998"/>
     <w:p>
       <w:pPr>
         <w:pStyle w:val="Bibliography"/>
@@ -18971,7 +19007,7 @@
       <w:r>
         <w:t xml:space="preserve">(1), 31–69. http://doi.org/</w:t>
       </w:r>
-      <w:hyperlink r:id="rId195">
+      <w:hyperlink r:id="rId154">
         <w:r>
           <w:rPr>
             <w:rStyle w:val="Hyperlink"/>
@@ -18980,8 +19016,8 @@
         </w:r>
       </w:hyperlink>
     </w:p>
-    <w:bookmarkEnd w:id="196"/>
-    <w:bookmarkStart w:id="197" w:name="ref-makowski2019indices"/>
+    <w:bookmarkEnd w:id="155"/>
+    <w:bookmarkStart w:id="156" w:name="ref-makowski2019indices"/>
     <w:p>
       <w:pPr>
         <w:pStyle w:val="Bibliography"/>
@@ -19016,8 +19052,8 @@
         <w:t xml:space="preserve">, 2767.</w:t>
       </w:r>
     </w:p>
-    <w:bookmarkEnd w:id="197"/>
-    <w:bookmarkStart w:id="198" w:name="ref-marian2007language"/>
+    <w:bookmarkEnd w:id="156"/>
+    <w:bookmarkStart w:id="157" w:name="ref-marian2007language"/>
     <w:p>
       <w:pPr>
         <w:pStyle w:val="Bibliography"/>
@@ -19039,8 +19075,8 @@
         <w:t xml:space="preserve">.</w:t>
       </w:r>
     </w:p>
-    <w:bookmarkEnd w:id="198"/>
-    <w:bookmarkStart w:id="199" w:name="ref-mitrofanova2023crosslinguistic"/>
+    <w:bookmarkEnd w:id="157"/>
+    <w:bookmarkStart w:id="158" w:name="ref-mitrofanova2023crosslinguistic"/>
     <w:p>
       <w:pPr>
         <w:pStyle w:val="Bibliography"/>
@@ -19075,8 +19111,8 @@
         <w:t xml:space="preserve">(5), 717–742.</w:t>
       </w:r>
     </w:p>
-    <w:bookmarkEnd w:id="199"/>
-    <w:bookmarkStart w:id="201" w:name="ref-MontrulDiasSantos2011"/>
+    <w:bookmarkEnd w:id="158"/>
+    <w:bookmarkStart w:id="160" w:name="ref-MontrulDiasSantos2011"/>
     <w:p>
       <w:pPr>
         <w:pStyle w:val="Bibliography"/>
@@ -19110,7 +19146,7 @@
       <w:r>
         <w:t xml:space="preserve">(1), 21–58. http://doi.org/</w:t>
       </w:r>
-      <w:hyperlink r:id="rId200">
+      <w:hyperlink r:id="rId159">
         <w:r>
           <w:rPr>
             <w:rStyle w:val="Hyperlink"/>
@@ -19119,8 +19155,8 @@
         </w:r>
       </w:hyperlink>
     </w:p>
-    <w:bookmarkEnd w:id="201"/>
-    <w:bookmarkStart w:id="203" w:name="ref-muntendam_etal_2022"/>
+    <w:bookmarkEnd w:id="160"/>
+    <w:bookmarkStart w:id="162" w:name="ref-muntendam_etal_2022"/>
     <w:p>
       <w:pPr>
         <w:pStyle w:val="Bibliography"/>
@@ -19187,7 +19223,7 @@
       <w:r>
         <w:t xml:space="preserve">, 1–12. http://doi.org/</w:t>
       </w:r>
-      <w:hyperlink r:id="rId202">
+      <w:hyperlink r:id="rId161">
         <w:r>
           <w:rPr>
             <w:rStyle w:val="Hyperlink"/>
@@ -19196,8 +19232,8 @@
         </w:r>
       </w:hyperlink>
     </w:p>
-    <w:bookmarkEnd w:id="203"/>
-    <w:bookmarkStart w:id="205" w:name="ref-new_etal_2024"/>
+    <w:bookmarkEnd w:id="162"/>
+    <w:bookmarkStart w:id="164" w:name="ref-new_etal_2024"/>
     <w:p>
       <w:pPr>
         <w:pStyle w:val="Bibliography"/>
@@ -19252,7 +19288,7 @@
       <w:r>
         <w:t xml:space="preserve">(2), 278–286. http://doi.org/</w:t>
       </w:r>
-      <w:hyperlink r:id="rId204">
+      <w:hyperlink r:id="rId163">
         <w:r>
           <w:rPr>
             <w:rStyle w:val="Hyperlink"/>
@@ -19261,8 +19297,8 @@
         </w:r>
       </w:hyperlink>
     </w:p>
-    <w:bookmarkEnd w:id="205"/>
-    <w:bookmarkStart w:id="207" w:name="ref-otwinowska_szewczyk_2019"/>
+    <w:bookmarkEnd w:id="164"/>
+    <w:bookmarkStart w:id="166" w:name="ref-otwinowska_szewczyk_2019"/>
     <w:p>
       <w:pPr>
         <w:pStyle w:val="Bibliography"/>
@@ -19308,7 +19344,7 @@
       <w:r>
         <w:t xml:space="preserve">(8), 974–991. http://doi.org/</w:t>
       </w:r>
-      <w:hyperlink r:id="rId206">
+      <w:hyperlink r:id="rId165">
         <w:r>
           <w:rPr>
             <w:rStyle w:val="Hyperlink"/>
@@ -19317,8 +19353,8 @@
         </w:r>
       </w:hyperlink>
     </w:p>
-    <w:bookmarkEnd w:id="207"/>
-    <w:bookmarkStart w:id="208" w:name="ref-parma2017cross"/>
+    <w:bookmarkEnd w:id="166"/>
+    <w:bookmarkStart w:id="167" w:name="ref-parma2017cross"/>
     <w:p>
       <w:pPr>
         <w:pStyle w:val="Bibliography"/>
@@ -19353,8 +19389,8 @@
         <w:t xml:space="preserve">(3), 14.</w:t>
       </w:r>
     </w:p>
-    <w:bookmarkEnd w:id="208"/>
-    <w:bookmarkStart w:id="209" w:name="ref-parrish2024statistical"/>
+    <w:bookmarkEnd w:id="167"/>
+    <w:bookmarkStart w:id="168" w:name="ref-parrish2024statistical"/>
     <w:p>
       <w:pPr>
         <w:pStyle w:val="Bibliography"/>
@@ -19389,8 +19425,8 @@
         <w:t xml:space="preserve">(5), 1439–1456.</w:t>
       </w:r>
     </w:p>
-    <w:bookmarkEnd w:id="209"/>
-    <w:bookmarkStart w:id="210" w:name="ref-parrish2024production"/>
+    <w:bookmarkEnd w:id="168"/>
+    <w:bookmarkStart w:id="169" w:name="ref-parrish2024production"/>
     <w:p>
       <w:pPr>
         <w:pStyle w:val="Bibliography"/>
@@ -19425,8 +19461,8 @@
         <w:t xml:space="preserve">(1), 131–148.</w:t>
       </w:r>
     </w:p>
-    <w:bookmarkEnd w:id="210"/>
-    <w:bookmarkStart w:id="212" w:name="ref-peeters_etal_2013"/>
+    <w:bookmarkEnd w:id="169"/>
+    <w:bookmarkStart w:id="171" w:name="ref-peeters_etal_2013"/>
     <w:p>
       <w:pPr>
         <w:pStyle w:val="Bibliography"/>
@@ -19484,7 +19520,7 @@
       <w:r>
         <w:t xml:space="preserve">(4), 315–332. http://doi.org/</w:t>
       </w:r>
-      <w:hyperlink r:id="rId211">
+      <w:hyperlink r:id="rId170">
         <w:r>
           <w:rPr>
             <w:rStyle w:val="Hyperlink"/>
@@ -19493,8 +19529,8 @@
         </w:r>
       </w:hyperlink>
     </w:p>
-    <w:bookmarkEnd w:id="212"/>
-    <w:bookmarkStart w:id="214" w:name="ref-peirce_2019"/>
+    <w:bookmarkEnd w:id="171"/>
+    <w:bookmarkStart w:id="173" w:name="ref-peirce_2019"/>
     <w:p>
       <w:pPr>
         <w:pStyle w:val="Bibliography"/>
@@ -19549,7 +19585,7 @@
       <w:r>
         <w:t xml:space="preserve">(1), 195–203. http://doi.org/</w:t>
       </w:r>
-      <w:hyperlink r:id="rId213">
+      <w:hyperlink r:id="rId172">
         <w:r>
           <w:rPr>
             <w:rStyle w:val="Hyperlink"/>
@@ -19558,8 +19594,8 @@
         </w:r>
       </w:hyperlink>
     </w:p>
-    <w:bookmarkEnd w:id="214"/>
-    <w:bookmarkStart w:id="215" w:name="ref-plonsky2014big"/>
+    <w:bookmarkEnd w:id="173"/>
+    <w:bookmarkStart w:id="174" w:name="ref-plonsky2014big"/>
     <w:p>
       <w:pPr>
         <w:pStyle w:val="Bibliography"/>
@@ -19603,8 +19639,8 @@
         <w:t xml:space="preserve">(4), 878–912.</w:t>
       </w:r>
     </w:p>
-    <w:bookmarkEnd w:id="215"/>
-    <w:bookmarkStart w:id="217" w:name="ref-poarch_vanhell_2014"/>
+    <w:bookmarkEnd w:id="174"/>
+    <w:bookmarkStart w:id="176" w:name="ref-poarch_vanhell_2014"/>
     <w:p>
       <w:pPr>
         <w:pStyle w:val="Bibliography"/>
@@ -19638,7 +19674,7 @@
       <w:r>
         <w:t xml:space="preserve">(6), 693–716. http://doi.org/</w:t>
       </w:r>
-      <w:hyperlink r:id="rId216">
+      <w:hyperlink r:id="rId175">
         <w:r>
           <w:rPr>
             <w:rStyle w:val="Hyperlink"/>
@@ -19647,8 +19683,8 @@
         </w:r>
       </w:hyperlink>
     </w:p>
-    <w:bookmarkEnd w:id="217"/>
-    <w:bookmarkStart w:id="219" w:name="ref-poort_rodd_2017"/>
+    <w:bookmarkEnd w:id="176"/>
+    <w:bookmarkStart w:id="178" w:name="ref-poort_rodd_2017"/>
     <w:p>
       <w:pPr>
         <w:pStyle w:val="Bibliography"/>
@@ -19682,7 +19718,7 @@
       <w:r>
         <w:t xml:space="preserve">, 52–63. http://doi.org/</w:t>
       </w:r>
-      <w:hyperlink r:id="rId218">
+      <w:hyperlink r:id="rId177">
         <w:r>
           <w:rPr>
             <w:rStyle w:val="Hyperlink"/>
@@ -19691,8 +19727,8 @@
         </w:r>
       </w:hyperlink>
     </w:p>
-    <w:bookmarkEnd w:id="219"/>
-    <w:bookmarkStart w:id="221" w:name="ref-puig-mayenco_etal_2020"/>
+    <w:bookmarkEnd w:id="178"/>
+    <w:bookmarkStart w:id="180" w:name="ref-puig-mayenco_etal_2020"/>
     <w:p>
       <w:pPr>
         <w:pStyle w:val="Bibliography"/>
@@ -19726,7 +19762,7 @@
       <w:r>
         <w:t xml:space="preserve">(1), 31–64. http://doi.org/</w:t>
       </w:r>
-      <w:hyperlink r:id="rId220">
+      <w:hyperlink r:id="rId179">
         <w:r>
           <w:rPr>
             <w:rStyle w:val="Hyperlink"/>
@@ -19735,8 +19771,8 @@
         </w:r>
       </w:hyperlink>
     </w:p>
-    <w:bookmarkEnd w:id="221"/>
-    <w:bookmarkStart w:id="222" w:name="ref-puig2020systematic"/>
+    <w:bookmarkEnd w:id="180"/>
+    <w:bookmarkStart w:id="181" w:name="ref-puig2020systematic"/>
     <w:p>
       <w:pPr>
         <w:pStyle w:val="Bibliography"/>
@@ -19771,8 +19807,8 @@
         <w:t xml:space="preserve">(1), 31–64.</w:t>
       </w:r>
     </w:p>
-    <w:bookmarkEnd w:id="222"/>
-    <w:bookmarkStart w:id="223" w:name="ref-puig2018language"/>
+    <w:bookmarkEnd w:id="181"/>
+    <w:bookmarkStart w:id="182" w:name="ref-puig2018language"/>
     <w:p>
       <w:pPr>
         <w:pStyle w:val="Bibliography"/>
@@ -19794,8 +19830,8 @@
         <w:t xml:space="preserve">, 229–260.</w:t>
       </w:r>
     </w:p>
-    <w:bookmarkEnd w:id="223"/>
-    <w:bookmarkStart w:id="224" w:name="ref-Rothman_2011"/>
+    <w:bookmarkEnd w:id="182"/>
+    <w:bookmarkStart w:id="183" w:name="ref-Rothman_2011"/>
     <w:p>
       <w:pPr>
         <w:pStyle w:val="Bibliography"/>
@@ -19830,8 +19866,8 @@
         <w:t xml:space="preserve">(1), 107–127.</w:t>
       </w:r>
     </w:p>
-    <w:bookmarkEnd w:id="224"/>
-    <w:bookmarkStart w:id="225" w:name="ref-Rothman_2015"/>
+    <w:bookmarkEnd w:id="183"/>
+    <w:bookmarkStart w:id="184" w:name="ref-Rothman_2015"/>
     <w:p>
       <w:pPr>
         <w:pStyle w:val="Bibliography"/>
@@ -19866,8 +19902,8 @@
         <w:t xml:space="preserve">(2), 179–190.</w:t>
       </w:r>
     </w:p>
-    <w:bookmarkEnd w:id="225"/>
-    <w:bookmarkStart w:id="226" w:name="ref-rothman2019third"/>
+    <w:bookmarkEnd w:id="184"/>
+    <w:bookmarkStart w:id="185" w:name="ref-rothman2019third"/>
     <w:p>
       <w:pPr>
         <w:pStyle w:val="Bibliography"/>
@@ -19892,8 +19928,8 @@
         <w:t xml:space="preserve">(Vol. 163). Cambridge University Press.</w:t>
       </w:r>
     </w:p>
-    <w:bookmarkEnd w:id="226"/>
-    <w:bookmarkStart w:id="227" w:name="ref-slabakova2017scalpel"/>
+    <w:bookmarkEnd w:id="185"/>
+    <w:bookmarkStart w:id="186" w:name="ref-slabakova2017scalpel"/>
     <w:p>
       <w:pPr>
         <w:pStyle w:val="Bibliography"/>
@@ -19928,8 +19964,8 @@
         <w:t xml:space="preserve">(6), 651–665.</w:t>
       </w:r>
     </w:p>
-    <w:bookmarkEnd w:id="227"/>
-    <w:bookmarkStart w:id="228" w:name="ref-model2023l3"/>
+    <w:bookmarkEnd w:id="186"/>
+    <w:bookmarkStart w:id="187" w:name="ref-model2023l3"/>
     <w:p>
       <w:pPr>
         <w:pStyle w:val="Bibliography"/>
@@ -19951,8 +19987,8 @@
         <w:t xml:space="preserve">, 1.</w:t>
       </w:r>
     </w:p>
-    <w:bookmarkEnd w:id="228"/>
-    <w:bookmarkStart w:id="230" w:name="ref-szubko-sitarek_2011"/>
+    <w:bookmarkEnd w:id="187"/>
+    <w:bookmarkStart w:id="189" w:name="ref-szubko-sitarek_2011"/>
     <w:p>
       <w:pPr>
         <w:pStyle w:val="Bibliography"/>
@@ -19986,7 +20022,7 @@
       <w:r>
         <w:t xml:space="preserve">(2), 189–208. http://doi.org/</w:t>
       </w:r>
-      <w:hyperlink r:id="rId229">
+      <w:hyperlink r:id="rId188">
         <w:r>
           <w:rPr>
             <w:rStyle w:val="Hyperlink"/>
@@ -19995,8 +20031,8 @@
         </w:r>
       </w:hyperlink>
     </w:p>
-    <w:bookmarkEnd w:id="230"/>
-    <w:bookmarkStart w:id="232" w:name="ref-tiffin-richards_2024"/>
+    <w:bookmarkEnd w:id="189"/>
+    <w:bookmarkStart w:id="191" w:name="ref-tiffin-richards_2024"/>
     <w:p>
       <w:pPr>
         <w:pStyle w:val="Bibliography"/>
@@ -20042,7 +20078,7 @@
       <w:r>
         <w:t xml:space="preserve">(5), 964–981. http://doi.org/</w:t>
       </w:r>
-      <w:hyperlink r:id="rId231">
+      <w:hyperlink r:id="rId190">
         <w:r>
           <w:rPr>
             <w:rStyle w:val="Hyperlink"/>
@@ -20051,8 +20087,8 @@
         </w:r>
       </w:hyperlink>
     </w:p>
-    <w:bookmarkEnd w:id="232"/>
-    <w:bookmarkStart w:id="234" w:name="ref-tonzar_etal_2009"/>
+    <w:bookmarkEnd w:id="191"/>
+    <w:bookmarkStart w:id="193" w:name="ref-tonzar_etal_2009"/>
     <w:p>
       <w:pPr>
         <w:pStyle w:val="Bibliography"/>
@@ -20158,7 +20194,7 @@
       <w:r>
         <w:t xml:space="preserve">(3), 623–646. http://doi.org/</w:t>
       </w:r>
-      <w:hyperlink r:id="rId233">
+      <w:hyperlink r:id="rId192">
         <w:r>
           <w:rPr>
             <w:rStyle w:val="Hyperlink"/>
@@ -20167,8 +20203,8 @@
         </w:r>
       </w:hyperlink>
     </w:p>
-    <w:bookmarkEnd w:id="234"/>
-    <w:bookmarkStart w:id="236" w:name="ref-UNESCO2025MultilingualEducation"/>
+    <w:bookmarkEnd w:id="193"/>
+    <w:bookmarkStart w:id="195" w:name="ref-UNESCO2025MultilingualEducation"/>
     <w:p>
       <w:pPr>
         <w:pStyle w:val="Bibliography"/>
@@ -20179,7 +20215,7 @@
       <w:r>
         <w:t xml:space="preserve"> </w:t>
       </w:r>
-      <w:hyperlink r:id="rId235">
+      <w:hyperlink r:id="rId194">
         <w:r>
           <w:rPr>
             <w:rStyle w:val="Hyperlink"/>
@@ -20188,8 +20224,8 @@
         </w:r>
       </w:hyperlink>
     </w:p>
-    <w:bookmarkEnd w:id="236"/>
-    <w:bookmarkStart w:id="237" w:name="ref-westergaard2017crosslinguistic"/>
+    <w:bookmarkEnd w:id="195"/>
+    <w:bookmarkStart w:id="196" w:name="ref-westergaard2017crosslinguistic"/>
     <w:p>
       <w:pPr>
         <w:pStyle w:val="Bibliography"/>
@@ -20224,8 +20260,8 @@
         <w:t xml:space="preserve">(6), 666–682.</w:t>
       </w:r>
     </w:p>
-    <w:bookmarkEnd w:id="237"/>
-    <w:bookmarkStart w:id="239" w:name="ref-woumans_etal_2021"/>
+    <w:bookmarkEnd w:id="196"/>
+    <w:bookmarkStart w:id="198" w:name="ref-woumans_etal_2021"/>
     <w:p>
       <w:pPr>
         <w:pStyle w:val="Bibliography"/>
@@ -20313,7 +20349,7 @@
       <w:r>
         <w:t xml:space="preserve">, 647362. http://doi.org/</w:t>
       </w:r>
-      <w:hyperlink r:id="rId238">
+      <w:hyperlink r:id="rId197">
         <w:r>
           <w:rPr>
             <w:rStyle w:val="Hyperlink"/>
@@ -20322,16 +20358,16 @@
         </w:r>
       </w:hyperlink>
     </w:p>
-    <w:bookmarkEnd w:id="239"/>
-    <w:bookmarkEnd w:id="240"/>
-    <w:bookmarkEnd w:id="241"/>
+    <w:bookmarkEnd w:id="198"/>
+    <w:bookmarkEnd w:id="199"/>
+    <w:bookmarkEnd w:id="200"/>
     <w:sectPr>
-      <w:headerReference r:id="rId47" w:type="even"/>
-      <w:headerReference r:id="rId48" w:type="default"/>
-      <w:footerReference r:id="rId49" w:type="even"/>
-      <w:footerReference r:id="rId50" w:type="default"/>
-      <w:headerReference r:id="rId51" w:type="first"/>
-      <w:footerReference r:id="rId52" w:type="first"/>
+      <w:headerReference r:id="rId9" w:type="even"/>
+      <w:headerReference r:id="rId10" w:type="default"/>
+      <w:footerReference r:id="rId14" w:type="even"/>
+      <w:footerReference r:id="rId12" w:type="default"/>
+      <w:headerReference r:id="rId11" w:type="first"/>
+      <w:footerReference r:id="rId13" w:type="first"/>
       <w:pgSz w:h="15840" w:w="12240"/>
       <w:pgMar w:bottom="1440" w:footer="720" w:gutter="0" w:header="720" w:left="1440" w:right="1440" w:top="1440"/>
       <w:cols w:space="720"/>

</xml_diff>